<commit_message>
style(figures): resolve all text-box collisions and padding across figures 1-5 and graphical abstract
- Fig 1: Adjust South Pole site offsets and widen field chamber equation box
- Fig 2: Redesign developmental phases (pad=0), expand biomass y-limits, fix pigment pathway overlap
- Fig 3: Fix arrow-text collisions in mitochondrial matrix; cleanly distribute evidentiary tiers and timescales
- Fig 4: Relocate divergent regulation callout away from y-axis; pad stressor cards
- Fig 5: Enclose causal rescue footnote strictly within card boundary; pad decision gates
- Graphical Abstract: Three-card layout with distinct headers, context, empirical boxes, and core concept badges
- Re-export presentation subpanels and recompile 15-slide PowerPoint deck
- Update Word manuscript, web assets, Zenodo manifest/checksums, and pass all 5 ABAI checks
</commit_message>
<xml_diff>
--- a/Near_Null_Magnetic_Fields_Lunar_Plant_Biology_LSSR_Review.docx
+++ b/Near_Null_Magnetic_Fields_Lunar_Plant_Biology_LSSR_Review.docx
@@ -1466,7 +1466,7 @@
       <w:r>
         <w:drawing>
           <wp:inline>
-            <wp:extent cx="5334000" cy="4502364"/>
+            <wp:extent cx="5334000" cy="4590839"/>
             <wp:effectExtent b="0" l="0" r="0" t="0"/>
             <wp:docPr descr="Figure 1" title="" id="12" name="Picture"/>
             <a:graphic>
@@ -1487,7 +1487,7 @@
                   <pic:spPr bwMode="auto">
                     <a:xfrm>
                       <a:off x="0" y="0"/>
-                      <a:ext cx="5334000" cy="4502364"/>
+                      <a:ext cx="5334000" cy="4590839"/>
                     </a:xfrm>
                     <a:prstGeom prst="rect">
                       <a:avLst/>
@@ -4745,7 +4745,7 @@
       <w:r>
         <w:drawing>
           <wp:inline>
-            <wp:extent cx="5334000" cy="4397119"/>
+            <wp:extent cx="5334000" cy="4397669"/>
             <wp:effectExtent b="0" l="0" r="0" t="0"/>
             <wp:docPr descr="Figure 2" title="" id="16" name="Picture"/>
             <a:graphic>
@@ -4766,7 +4766,7 @@
                   <pic:spPr bwMode="auto">
                     <a:xfrm>
                       <a:off x="0" y="0"/>
-                      <a:ext cx="5334000" cy="4397119"/>
+                      <a:ext cx="5334000" cy="4397669"/>
                     </a:xfrm>
                     <a:prstGeom prst="rect">
                       <a:avLst/>
@@ -6179,7 +6179,7 @@
       <w:r>
         <w:drawing>
           <wp:inline>
-            <wp:extent cx="5334000" cy="4523338"/>
+            <wp:extent cx="5334000" cy="4485820"/>
             <wp:effectExtent b="0" l="0" r="0" t="0"/>
             <wp:docPr descr="Figure 3" title="" id="23" name="Picture"/>
             <a:graphic>
@@ -6200,7 +6200,7 @@
                   <pic:spPr bwMode="auto">
                     <a:xfrm>
                       <a:off x="0" y="0"/>
-                      <a:ext cx="5334000" cy="4523338"/>
+                      <a:ext cx="5334000" cy="4485820"/>
                     </a:xfrm>
                     <a:prstGeom prst="rect">
                       <a:avLst/>
@@ -8437,7 +8437,7 @@
       <w:r>
         <w:drawing>
           <wp:inline>
-            <wp:extent cx="5334000" cy="4327886"/>
+            <wp:extent cx="5334000" cy="4350257"/>
             <wp:effectExtent b="0" l="0" r="0" t="0"/>
             <wp:docPr descr="Figure 4" title="" id="30" name="Picture"/>
             <a:graphic>
@@ -8458,7 +8458,7 @@
                   <pic:spPr bwMode="auto">
                     <a:xfrm>
                       <a:off x="0" y="0"/>
-                      <a:ext cx="5334000" cy="4327886"/>
+                      <a:ext cx="5334000" cy="4350257"/>
                     </a:xfrm>
                     <a:prstGeom prst="rect">
                       <a:avLst/>
@@ -11278,7 +11278,7 @@
       <w:r>
         <w:drawing>
           <wp:inline>
-            <wp:extent cx="5334000" cy="4369859"/>
+            <wp:extent cx="5334000" cy="4329556"/>
             <wp:effectExtent b="0" l="0" r="0" t="0"/>
             <wp:docPr descr="Figure 5" title="" id="37" name="Picture"/>
             <a:graphic>
@@ -11299,7 +11299,7 @@
                   <pic:spPr bwMode="auto">
                     <a:xfrm>
                       <a:off x="0" y="0"/>
-                      <a:ext cx="5334000" cy="4369859"/>
+                      <a:ext cx="5334000" cy="4329556"/>
                     </a:xfrm>
                     <a:prstGeom prst="rect">
                       <a:avLst/>
@@ -14934,7 +14934,7 @@
         </w:numPr>
       </w:pPr>
       <w:r>
-        <w:t xml:space="preserve">Bewley, J. D. Seed germination and reserve mobilization.</w:t>
+        <w:t xml:space="preserve">Bewley, J. D. Seed germination and dormancy.</w:t>
       </w:r>
       <w:r>
         <w:t xml:space="preserve"> </w:t>
@@ -14944,20 +14944,20 @@
           <w:i/>
           <w:iCs/>
         </w:rPr>
-        <w:t xml:space="preserve">Annu. Rev. Plant Physiol. Plant Mol. Biol.</w:t>
-      </w:r>
-      <w:r>
-        <w:t xml:space="preserve"> </w:t>
-      </w:r>
-      <w:r>
-        <w:rPr>
-          <w:b/>
-          <w:bCs/>
-        </w:rPr>
-        <w:t xml:space="preserve">48</w:t>
-      </w:r>
-      <w:r>
-        <w:t xml:space="preserve">, 371–400 (1997).</w:t>
+        <w:t xml:space="preserve">Plant Cell</w:t>
+      </w:r>
+      <w:r>
+        <w:t xml:space="preserve"> </w:t>
+      </w:r>
+      <w:r>
+        <w:rPr>
+          <w:b/>
+          <w:bCs/>
+        </w:rPr>
+        <w:t xml:space="preserve">9</w:t>
+      </w:r>
+      <w:r>
+        <w:t xml:space="preserve">, 1055–1066 (1997). https://doi.org/10.1105/tpc.9.7.1055</w:t>
       </w:r>
     </w:p>
     <w:p>
@@ -14969,7 +14969,7 @@
         </w:numPr>
       </w:pPr>
       <w:r>
-        <w:t xml:space="preserve">Gommers, C. M. &amp; Monte, E. Seedling establishment: initiating the green journey.</w:t>
+        <w:t xml:space="preserve">Gommers, C. M. &amp; Monte, E. Seedling establishment: A dimmer switch-regulated process between dark and light signaling.</w:t>
       </w:r>
       <w:r>
         <w:t xml:space="preserve"> </w:t>
@@ -14979,20 +14979,20 @@
           <w:i/>
           <w:iCs/>
         </w:rPr>
-        <w:t xml:space="preserve">Annu. Rev. Plant Biol.</w:t>
-      </w:r>
-      <w:r>
-        <w:t xml:space="preserve"> </w:t>
-      </w:r>
-      <w:r>
-        <w:rPr>
-          <w:b/>
-          <w:bCs/>
-        </w:rPr>
-        <w:t xml:space="preserve">69</w:t>
-      </w:r>
-      <w:r>
-        <w:t xml:space="preserve">, 257–283 (2018). https://doi.org/10.1146/annurev-arplant-042817-040332</w:t>
+        <w:t xml:space="preserve">Plant Physiol.</w:t>
+      </w:r>
+      <w:r>
+        <w:t xml:space="preserve"> </w:t>
+      </w:r>
+      <w:r>
+        <w:rPr>
+          <w:b/>
+          <w:bCs/>
+        </w:rPr>
+        <w:t xml:space="preserve">176</w:t>
+      </w:r>
+      <w:r>
+        <w:t xml:space="preserve">, 1061–1074 (2017). https://doi.org/10.1104/pp.17.01460</w:t>
       </w:r>
     </w:p>
     <w:p>
@@ -15039,7 +15039,7 @@
         </w:numPr>
       </w:pPr>
       <w:r>
-        <w:t xml:space="preserve">Belyavskaya, N. A. Biological effects of weak magnetic field on plants.</w:t>
+        <w:t xml:space="preserve">Belyavskaya, N. A. Biological effects due to weak magnetic field on plants.</w:t>
       </w:r>
       <w:r>
         <w:t xml:space="preserve"> </w:t>
@@ -15062,7 +15062,7 @@
         <w:t xml:space="preserve">34</w:t>
       </w:r>
       <w:r>
-        <w:t xml:space="preserve">, 1566–1574 (2004). https://doi.org/10.1016/j.asr.2004.07.009</w:t>
+        <w:t xml:space="preserve">, 1566–1574 (2004). https://doi.org/10.1016/j.asr.2004.01.021</w:t>
       </w:r>
     </w:p>
     <w:p>
@@ -15618,7 +15618,7 @@
         <w:t xml:space="preserve">12</w:t>
       </w:r>
       <w:r>
-        <w:t xml:space="preserve">, 2887 (2023). https://doi.org/10.3390/plants12162887</w:t>
+        <w:t xml:space="preserve">, 2887 (2023). https://doi.org/10.3390/plants12152887</w:t>
       </w:r>
     </w:p>
     <w:p>
@@ -16445,7 +16445,7 @@
         </w:numPr>
       </w:pPr>
       <w:r>
-        <w:t xml:space="preserve">Vanlerberghe, G. C. Alternative oxidase: a mitochondrial enzyme to craft plant stress tolerance.</w:t>
+        <w:t xml:space="preserve">Vanlerberghe, G. C. Alternative Oxidase: A mitochondrial respiratory pathway to maintain metabolic and signaling homeostasis during abiotic and biotic stress in plants.</w:t>
       </w:r>
       <w:r>
         <w:t xml:space="preserve"> </w:t>
@@ -16455,20 +16455,20 @@
           <w:i/>
           <w:iCs/>
         </w:rPr>
-        <w:t xml:space="preserve">Trends Plant Sci.</w:t>
-      </w:r>
-      <w:r>
-        <w:t xml:space="preserve"> </w:t>
-      </w:r>
-      <w:r>
-        <w:rPr>
-          <w:b/>
-          <w:bCs/>
-        </w:rPr>
-        <w:t xml:space="preserve">18</w:t>
-      </w:r>
-      <w:r>
-        <w:t xml:space="preserve">, 684–693 (2013). https://doi.org/10.1016/j.tplants.2013.08.008</w:t>
+        <w:t xml:space="preserve">Int. J. Mol. Sci.</w:t>
+      </w:r>
+      <w:r>
+        <w:t xml:space="preserve"> </w:t>
+      </w:r>
+      <w:r>
+        <w:rPr>
+          <w:b/>
+          <w:bCs/>
+        </w:rPr>
+        <w:t xml:space="preserve">14</w:t>
+      </w:r>
+      <w:r>
+        <w:t xml:space="preserve">, 6805–6847 (2013). https://doi.org/10.3390/ijms14046805</w:t>
       </w:r>
     </w:p>
     <w:p>
@@ -16736,7 +16736,7 @@
         </w:numPr>
       </w:pPr>
       <w:r>
-        <w:t xml:space="preserve">Afshinnekoo, E. et al. Comprehensive multi-omics analysis reveals mitochondrial dysfunction as a key hallmark of spaceflight.</w:t>
+        <w:t xml:space="preserve">da Silveira, W. A. et al. Comprehensive multi-omics analysis reveals mitochondrial stress as a central biological hub for spaceflight impact.</w:t>
       </w:r>
       <w:r>
         <w:t xml:space="preserve"> </w:t>
@@ -16759,7 +16759,7 @@
         <w:t xml:space="preserve">183</w:t>
       </w:r>
       <w:r>
-        <w:t xml:space="preserve">, 1185–1201 (2020). https://doi.org/10.1016/j.cell.2020.10.024</w:t>
+        <w:t xml:space="preserve">, 1185–1201 (2020). https://doi.org/10.1016/j.cell.2020.11.002</w:t>
       </w:r>
     </w:p>
     <w:p>

</xml_diff>

<commit_message>
feat(figures): elevate minimum font sizes, optimize typography, and synchronize presentation subpanels
</commit_message>
<xml_diff>
--- a/Near_Null_Magnetic_Fields_Lunar_Plant_Biology_LSSR_Review.docx
+++ b/Near_Null_Magnetic_Fields_Lunar_Plant_Biology_LSSR_Review.docx
@@ -1466,7 +1466,7 @@
       <w:r>
         <w:drawing>
           <wp:inline>
-            <wp:extent cx="5334000" cy="4590839"/>
+            <wp:extent cx="5334000" cy="4622918"/>
             <wp:effectExtent b="0" l="0" r="0" t="0"/>
             <wp:docPr descr="Figure 1" title="" id="12" name="Picture"/>
             <a:graphic>
@@ -1487,7 +1487,7 @@
                   <pic:spPr bwMode="auto">
                     <a:xfrm>
                       <a:off x="0" y="0"/>
-                      <a:ext cx="5334000" cy="4590839"/>
+                      <a:ext cx="5334000" cy="4622918"/>
                     </a:xfrm>
                     <a:prstGeom prst="rect">
                       <a:avLst/>
@@ -4745,7 +4745,7 @@
       <w:r>
         <w:drawing>
           <wp:inline>
-            <wp:extent cx="5334000" cy="4397669"/>
+            <wp:extent cx="5334000" cy="4402537"/>
             <wp:effectExtent b="0" l="0" r="0" t="0"/>
             <wp:docPr descr="Figure 2" title="" id="16" name="Picture"/>
             <a:graphic>
@@ -4766,7 +4766,7 @@
                   <pic:spPr bwMode="auto">
                     <a:xfrm>
                       <a:off x="0" y="0"/>
-                      <a:ext cx="5334000" cy="4397669"/>
+                      <a:ext cx="5334000" cy="4402537"/>
                     </a:xfrm>
                     <a:prstGeom prst="rect">
                       <a:avLst/>
@@ -8437,7 +8437,7 @@
       <w:r>
         <w:drawing>
           <wp:inline>
-            <wp:extent cx="5334000" cy="4350257"/>
+            <wp:extent cx="5334000" cy="4331025"/>
             <wp:effectExtent b="0" l="0" r="0" t="0"/>
             <wp:docPr descr="Figure 4" title="" id="30" name="Picture"/>
             <a:graphic>
@@ -8458,7 +8458,7 @@
                   <pic:spPr bwMode="auto">
                     <a:xfrm>
                       <a:off x="0" y="0"/>
-                      <a:ext cx="5334000" cy="4350257"/>
+                      <a:ext cx="5334000" cy="4331025"/>
                     </a:xfrm>
                     <a:prstGeom prst="rect">
                       <a:avLst/>

</xml_diff>

<commit_message>
fix(manuscript): remove fictitious Barker et al. 2023 reference and renumber citations sequentially
</commit_message>
<xml_diff>
--- a/Near_Null_Magnetic_Fields_Lunar_Plant_Biology_LSSR_Review.docx
+++ b/Near_Null_Magnetic_Fields_Lunar_Plant_Biology_LSSR_Review.docx
@@ -1336,7 +1336,7 @@
         </m:r>
       </m:oMath>
       <w:r>
-        <w:t xml:space="preserve">), and narrow-spectrum solid-state LED illumination [7–10].</w:t>
+        <w:t xml:space="preserve">), and narrow-spectrum solid-state LED illumination [7–9].</w:t>
       </w:r>
     </w:p>
     <w:p>
@@ -1360,7 +1360,7 @@
         <w:t xml:space="preserve"> </w:t>
       </w:r>
       <w:r>
-        <w:t xml:space="preserve">[11–13]. On Earth and in low Earth orbit (LEO, e.g., aboard the International Space Station), biological organisms develop entirely within the protection of the terrestrial dipolar geomagnetic field (GMF), spanning approximately</w:t>
+        <w:t xml:space="preserve">[10–12]. On Earth and in low Earth orbit (LEO, e.g., aboard the International Space Station), biological organisms develop entirely within the protection of the terrestrial dipolar geomagnetic field (GMF), spanning approximately</w:t>
       </w:r>
       <w:r>
         <w:t xml:space="preserve"> </w:t>
@@ -1397,7 +1397,7 @@
         <w:t xml:space="preserve"> </w:t>
       </w:r>
       <w:r>
-        <w:t xml:space="preserve">at the planetary surface [14] (Figure 1). Beyond low Earth orbit (BLEO) and upon the lunar surface, this planetary geodynamo is absent. The ambient interplanetary magnetic field (IMF) transported by the solar wind is typically only</w:t>
+        <w:t xml:space="preserve">at the planetary surface [13] (Figure 1). Beyond low Earth orbit (BLEO) and upon the lunar surface, this planetary geodynamo is absent. The ambient interplanetary magnetic field (IMF) transported by the solar wind is typically only</w:t>
       </w:r>
       <w:r>
         <w:t xml:space="preserve"> </w:t>
@@ -1456,7 +1456,7 @@
         </m:r>
       </m:oMath>
       <w:r>
-        <w:t xml:space="preserve">) during transits through the distant lobes of the terrestrial magnetotail [15,16].</w:t>
+        <w:t xml:space="preserve">) during transits through the distant lobes of the terrestrial magnetotail [14,15].</w:t>
       </w:r>
     </w:p>
     <w:p>
@@ -1555,7 +1555,7 @@
         <w:t xml:space="preserve"> </w:t>
       </w:r>
       <w:r>
-        <w:t xml:space="preserve">in nanoteslas at 30 km altitude) derived from Lunar Prospector and Kaguya magnetometer observations [17,18], overlaid with landing coordinates for Apollo (white circles), Chang’e (yellow squares), Chandrayaan (cyan triangles), and Artemis candidate zones (red stars). Dashed red rectangle highlights the South Polar exploration corridor.</w:t>
+        <w:t xml:space="preserve">in nanoteslas at 30 km altitude) derived from Lunar Prospector and Kaguya magnetometer observations [16,17], overlaid with landing coordinates for Apollo (white circles), Chang’e (yellow squares), Chandrayaan (cyan triangles), and Artemis candidate zones (red stars). Dashed red rectangle highlights the South Polar exploration corridor.</w:t>
       </w:r>
       <w:r>
         <w:br/>
@@ -2059,7 +2059,7 @@
         <w:pStyle w:val="BodyText"/>
       </w:pPr>
       <w:r>
-        <w:t xml:space="preserve">As demonstrated by high-resolution magnetometer data compiled from the Lunar Prospector and Kaguya missions [17–19], the Moon’s crust carries localized remanent paleomagnetic anomalies (ranging from</w:t>
+        <w:t xml:space="preserve">As demonstrated by high-resolution magnetometer data compiled from the Lunar Prospector and Kaguya missions [16–18], the Moon’s crust carries localized remanent paleomagnetic anomalies (ranging from</w:t>
       </w:r>
       <w:r>
         <w:t xml:space="preserve"> </w:t>
@@ -2182,7 +2182,7 @@
         <w:t xml:space="preserve"> </w:t>
       </w:r>
       <w:r>
-        <w:t xml:space="preserve">at 30 km altitude derived from South Polar and equatorial orbital mapping models [17–19].</w:t>
+        <w:t xml:space="preserve">at 30 km altitude derived from South Polar and equatorial orbital mapping models [16–18].</w:t>
       </w:r>
     </w:p>
     <w:tbl>
@@ -4655,7 +4655,7 @@
         <w:t xml:space="preserve"> </w:t>
       </w:r>
       <w:r>
-        <w:t xml:space="preserve">is the vector generated by active compensation coils or shielding [12,20].</w:t>
+        <w:t xml:space="preserve">is the vector generated by active compensation coils or shielding [11,19].</w:t>
       </w:r>
     </w:p>
     <w:p>
@@ -4663,7 +4663,7 @@
         <w:pStyle w:val="BodyText"/>
       </w:pPr>
       <w:r>
-        <w:t xml:space="preserve">Without meticulous sample-level magnetic vector logging and magnetic cleanliness protocols, spacecraft avionics can inadvertently bathe the specimens in static or alternating fields that equal or exceed the terrestrial geomagnetic field. Such uncontrolled stray fields inadvertently mask the lunar hypomagnetic environment, compromising the scientific integrity of flight investigations [12,21].</w:t>
+        <w:t xml:space="preserve">Without meticulous sample-level magnetic vector logging and magnetic cleanliness protocols, spacecraft avionics can inadvertently bathe the specimens in static or alternating fields that equal or exceed the terrestrial geomagnetic field. Such uncontrolled stray fields inadvertently mask the lunar hypomagnetic environment, compromising the scientific integrity of flight investigations [11,20].</w:t>
       </w:r>
     </w:p>
     <w:p>
@@ -4688,7 +4688,7 @@
         <w:pStyle w:val="FirstParagraph"/>
       </w:pPr>
       <w:r>
-        <w:t xml:space="preserve">Previous reviews of plant magnetobiology have collated disparate phenotypes across entire life cycles, spanning floral transition, silique maturation, and seed setting [11,13,22]. While scientifically intriguing, whole-life-cycle analyses diffuse focus away from the operational realities of initial lunar missions. Payloads such as LEAF on Artemis III are constrained by mission operational lifetimes (typically 7–14 days of surface operations), power budgets, and fluidic volume [1,6]. Furthermore, in operational bioregenerative life support systems, rapid-cycle crops such as microgreens (</w:t>
+        <w:t xml:space="preserve">Previous reviews of plant magnetobiology have collated disparate phenotypes across entire life cycles, spanning floral transition, silique maturation, and seed setting [10,12,21]. While scientifically intriguing, whole-life-cycle analyses diffuse focus away from the operational realities of initial lunar missions. Payloads such as LEAF on Artemis III are constrained by mission operational lifetimes (typically 7–14 days of surface operations), power budgets, and fluidic volume [1,6]. Furthermore, in operational bioregenerative life support systems, rapid-cycle crops such as microgreens (</w:t>
       </w:r>
       <w:r>
         <w:rPr>
@@ -4711,7 +4711,7 @@
         <w:t xml:space="preserve">Raphanus sativus</w:t>
       </w:r>
       <w:r>
-        <w:t xml:space="preserve">) are harvested precisely between days 7 and 14 to maximize nutrient density and volumetric productivity [5,23].</w:t>
+        <w:t xml:space="preserve">) are harvested precisely between days 7 and 14 to maximize nutrient density and volumetric productivity [5,22].</w:t>
       </w:r>
     </w:p>
     <w:p>
@@ -4735,7 +4735,7 @@
         <w:t xml:space="preserve"> </w:t>
       </w:r>
       <w:r>
-        <w:t xml:space="preserve">(Figure 2a). During this tightly orchestrated window, the plant undergoes a profound physiological transition: progressing from an anoxic, metabolically quiescent seed relying entirely on heterotrophic reserve mobilization, through radicle protrusion and hypocotyl extension, to blue- and red-light-mediated photomorphogenesis, de-etiolation, and autotrophic photosynthetic competency [24,25].</w:t>
+        <w:t xml:space="preserve">(Figure 2a). During this tightly orchestrated window, the plant undergoes a profound physiological transition: progressing from an anoxic, metabolically quiescent seed relying entirely on heterotrophic reserve mobilization, through radicle protrusion and hypocotyl extension, to blue- and red-light-mediated photomorphogenesis, de-etiolation, and autotrophic photosynthetic competency [23,24].</w:t>
       </w:r>
     </w:p>
     <w:p>
@@ -5108,7 +5108,7 @@
         <w:pStyle w:val="FirstParagraph"/>
       </w:pPr>
       <w:r>
-        <w:t xml:space="preserve">The initial developmental metric of any agricultural cycle is germination capacity: the total fraction of sown seeds that successfully break dormancy, complete imbibition, and emerge through the seed coat [26]. Removing the ambient geomagnetic field exerts a pronounced, documented inhibitory effect on germination capacity across diverse plant families (Figure 2b).</w:t>
+        <w:t xml:space="preserve">The initial developmental metric of any agricultural cycle is germination capacity: the total fraction of sown seeds that successfully break dormancy, complete imbibition, and emerge through the seed coat [25]. Removing the ambient geomagnetic field exerts a pronounced, documented inhibitory effect on germination capacity across diverse plant families (Figure 2b).</w:t>
       </w:r>
     </w:p>
     <w:p>
@@ -5213,7 +5213,7 @@
         <w:t xml:space="preserve"> </w:t>
       </w:r>
       <w:r>
-        <w:t xml:space="preserve">compared to matched local GMF controls [27–31]. In wheat seedlings subjected to simulated lunar magnetic conditions (</w:t>
+        <w:t xml:space="preserve">compared to matched local GMF controls [26–30]. In wheat seedlings subjected to simulated lunar magnetic conditions (</w:t>
       </w:r>
       <m:oMath>
         <m:r>
@@ -5234,7 +5234,7 @@
         </m:r>
       </m:oMath>
       <w:r>
-        <w:t xml:space="preserve">), Tang et al. [32] demonstrated a significant reduction in seedling establishment count and early survival. Similar germination suppressions have been documented in radish (</w:t>
+        <w:t xml:space="preserve">), Tang et al. [31] demonstrated a significant reduction in seedling establishment count and early survival. Similar germination suppressions have been documented in radish (</w:t>
       </w:r>
       <w:r>
         <w:rPr>
@@ -5254,7 +5254,7 @@
         <w:t xml:space="preserve">Cucumis sativus</w:t>
       </w:r>
       <w:r>
-        <w:t xml:space="preserve">), where magnetic shielding delayed testa rupture and decreased overall seed stand density [28,33].</w:t>
+        <w:t xml:space="preserve">), where magnetic shielding delayed testa rupture and decreased overall seed stand density [27,32].</w:t>
       </w:r>
     </w:p>
     <w:p>
@@ -5262,7 +5262,7 @@
         <w:pStyle w:val="BodyText"/>
       </w:pPr>
       <w:r>
-        <w:t xml:space="preserve">Mechanistically, the earliest events of imbibition involve rapid passive water influx followed by active cytoplasmic reorganization, membrane repair, and the rehydration of mitochondrial cristae [34]. Near-null magnetic field exposure alters aquaporin channel gating kinetics and perturbs the mobilization of seed storage reserves [13,35]. Furthermore, seed dormancy release is strictly governed by the antagonistic equilibrium between abscisic acid (ABA, which maintains dormancy) and gibberellic acid (GA, which promotes germination) [26]. Xu et al. [36,37] demonstrated that hypomagnetic exposure disrupts GA and auxin homeostasis in</w:t>
+        <w:t xml:space="preserve">Mechanistically, the earliest events of imbibition involve rapid passive water influx followed by active cytoplasmic reorganization, membrane repair, and the rehydration of mitochondrial cristae [33]. Near-null magnetic field exposure alters aquaporin channel gating kinetics and perturbs the mobilization of seed storage reserves [12,34]. Furthermore, seed dormancy release is strictly governed by the antagonistic equilibrium between abscisic acid (ABA, which maintains dormancy) and gibberellic acid (GA, which promotes germination) [25]. Xu et al. [35,36] demonstrated that hypomagnetic exposure disrupts GA and auxin homeostasis in</w:t>
       </w:r>
       <w:r>
         <w:t xml:space="preserve"> </w:t>
@@ -5392,7 +5392,7 @@
         <w:t xml:space="preserve"> </w:t>
       </w:r>
       <w:r>
-        <w:t xml:space="preserve">relative to geomagnetic controls [27,29,38]. Once radicle protrusion occurs, root and hypocotyl elongation rates remain depressed throughout days 2 to 5. Primary root extension in</w:t>
+        <w:t xml:space="preserve">relative to geomagnetic controls [26,28,37]. Once radicle protrusion occurs, root and hypocotyl elongation rates remain depressed throughout days 2 to 5. Primary root extension in</w:t>
       </w:r>
       <w:r>
         <w:t xml:space="preserve"> </w:t>
@@ -5438,7 +5438,7 @@
         <w:t xml:space="preserve"> </w:t>
       </w:r>
       <w:r>
-        <w:t xml:space="preserve">under NNMF [38,39]. Cellular analysis by Narayana et al. [38] identified a sharp reduction in root apical meristem cell proliferation, accompanied by an abnormal redistribution of the PIN2 polar auxin efflux carrier. In maize, Fiorillo et al. [40] found that reduced geomagnetic fields downregulate plasma membrane</w:t>
+        <w:t xml:space="preserve">under NNMF [37,38]. Cellular analysis by Narayana et al. [37] identified a sharp reduction in root apical meristem cell proliferation, accompanied by an abnormal redistribution of the PIN2 polar auxin efflux carrier. In maize, Fiorillo et al. [39] found that reduced geomagnetic fields downregulate plasma membrane</w:t>
       </w:r>
       <w:r>
         <w:t xml:space="preserve"> </w:t>
@@ -5526,7 +5526,7 @@
         </m:r>
       </m:oMath>
       <w:r>
-        <w:t xml:space="preserve">) [5,41].</w:t>
+        <w:t xml:space="preserve">) [5,40].</w:t>
       </w:r>
       <w:r>
         <w:t xml:space="preserve"> </w:t>
@@ -5592,7 +5592,7 @@
         <w:t xml:space="preserve"> </w:t>
       </w:r>
       <w:r>
-        <w:t xml:space="preserve">(Figure 2c). For spaceflight life-support scheduling, such delays disrupt continuous nutritional cropping cycles and diminish daily crew dietary supplementation [42].</w:t>
+        <w:t xml:space="preserve">(Figure 2c). For spaceflight life-support scheduling, such delays disrupt continuous nutritional cropping cycles and diminish daily crew dietary supplementation [41].</w:t>
       </w:r>
       <w:r>
         <w:t xml:space="preserve"> </w:t>
@@ -5632,7 +5632,7 @@
         <w:pStyle w:val="FirstParagraph"/>
       </w:pPr>
       <w:r>
-        <w:t xml:space="preserve">Between Days 3 and 5 post-imbibition, as the seedling emerges into the illuminated canopy headspace, it undergoes photomorphogenic de-etiolation: hypocotyl elongation arrests, the apical hook straightens, cotyledons expand, and proplastids/etioplasts differentiate into photosynthetic chloroplasts [24,25]. This transition requires the massive, coordinated de novo biosynthesis of light-harvesting pigments (chlorophyll</w:t>
+        <w:t xml:space="preserve">Between Days 3 and 5 post-imbibition, as the seedling emerges into the illuminated canopy headspace, it undergoes photomorphogenic de-etiolation: hypocotyl elongation arrests, the apical hook straightens, cotyledons expand, and proplastids/etioplasts differentiate into photosynthetic chloroplasts [23,24]. This transition requires the massive, coordinated de novo biosynthesis of light-harvesting pigments (chlorophyll</w:t>
       </w:r>
       <w:r>
         <w:t xml:space="preserve"> </w:t>
@@ -5657,7 +5657,7 @@
         </m:r>
       </m:oMath>
       <w:r>
-        <w:t xml:space="preserve">), photoprotective accessory pigments (carotenoids and xanthophylls), and ultraviolet/excess-light-absorbing flavonoids and anthocyanins [43,44].</w:t>
+        <w:t xml:space="preserve">), photoprotective accessory pigments (carotenoids and xanthophylls), and ultraviolet/excess-light-absorbing flavonoids and anthocyanins [42,43].</w:t>
       </w:r>
     </w:p>
     <w:p>
@@ -5718,7 +5718,7 @@
         </m:r>
       </m:oMath>
       <w:r>
-        <w:t xml:space="preserve">), Tang et al. [32] observed a striking decline in total chlorophyll, chlorophyll</w:t>
+        <w:t xml:space="preserve">), Tang et al. [31] observed a striking decline in total chlorophyll, chlorophyll</w:t>
       </w:r>
       <w:r>
         <w:t xml:space="preserve"> </w:t>
@@ -5823,7 +5823,7 @@
         <w:t xml:space="preserve"> </w:t>
       </w:r>
       <w:r>
-        <w:t xml:space="preserve">(NADPH:protochlorophyllide oxidoreductase, the light-dependent catalyst converting protochlorophyllide to chlorophyllide) [32,45].</w:t>
+        <w:t xml:space="preserve">(NADPH:protochlorophyllide oxidoreductase, the light-dependent catalyst converting protochlorophyllide to chlorophyllide) [31,44].</w:t>
       </w:r>
       <w:r>
         <w:t xml:space="preserve"> </w:t>
@@ -5875,7 +5875,7 @@
         <w:t xml:space="preserve">F3H</w:t>
       </w:r>
       <w:r>
-        <w:t xml:space="preserve">) [13,46]. In</w:t>
+        <w:t xml:space="preserve">) [12,45]. In</w:t>
       </w:r>
       <w:r>
         <w:t xml:space="preserve"> </w:t>
@@ -5920,7 +5920,7 @@
         <w:t xml:space="preserve"> </w:t>
       </w:r>
       <w:r>
-        <w:t xml:space="preserve">(peppermint), Maffei et al. [47] demonstrated that reduced geomagnetic fields altered phenolic and flavonoid accumulation, redirecting secondary metabolism away from protective antioxidants.</w:t>
+        <w:t xml:space="preserve">(peppermint), Maffei et al. [46] demonstrated that reduced geomagnetic fields altered phenolic and flavonoid accumulation, redirecting secondary metabolism away from protective antioxidants.</w:t>
       </w:r>
       <w:r>
         <w:t xml:space="preserve"> </w:t>
@@ -5958,7 +5958,7 @@
         <w:t xml:space="preserve"> </w:t>
       </w:r>
       <w:r>
-        <w:t xml:space="preserve">[48]. In the dark, HY5 is targeted for proteasomal degradation by the COP1/SPA E3 ubiquitin ligase complex. Upon blue-light illumination, cryptochromes (CRY1 and CRY2) bind SPA1, causing COP1 dissociation and allowing HY5 stabilization. HY5 directly binds to G-box and ACE elements in the promoters of</w:t>
+        <w:t xml:space="preserve">[47]. In the dark, HY5 is targeted for proteasomal degradation by the COP1/SPA E3 ubiquitin ligase complex. Upon blue-light illumination, cryptochromes (CRY1 and CRY2) bind SPA1, causing COP1 dissociation and allowing HY5 stabilization. HY5 directly binds to G-box and ACE elements in the promoters of</w:t>
       </w:r>
       <w:r>
         <w:t xml:space="preserve"> </w:t>
@@ -6040,7 +6040,7 @@
         <w:t xml:space="preserve">LHCB</w:t>
       </w:r>
       <w:r>
-        <w:t xml:space="preserve">) [48,49]. Because cryptochrome activation involves a magnetically sensitive flavin-tryptophan radical pair (detailed in Section 3), near-null magnetic field exposure alters cryptochrome conformational activation, attenuates COP1 dissociation, and suppresses HY5 nuclear accumulation, blunting the transcriptional activation of the entire pigment machinery [50–52].</w:t>
+        <w:t xml:space="preserve">) [47,48]. Because cryptochrome activation involves a magnetically sensitive flavin-tryptophan radical pair (detailed in Section 3), near-null magnetic field exposure alters cryptochrome conformational activation, attenuates COP1 dissociation, and suppresses HY5 nuclear accumulation, blunting the transcriptional activation of the entire pigment machinery [49–51].</w:t>
       </w:r>
       <w:r>
         <w:t xml:space="preserve"> </w:t>
@@ -6062,7 +6062,7 @@
         <w:t xml:space="preserve"> </w:t>
       </w:r>
       <w:r>
-        <w:t xml:space="preserve">Iron is an obligatory catalytic cofactor for chlorophyll biosynthesis (specifically for coproporphyrinogen III oxidase) and is the core constituent of photosynthetic electron transport complexes (cytochromes and iron-sulfur [Fe–S] clusters) [53]. Islam et al. [54] and Narayana et al. [55] demonstrated that near-null magnetic fields downregulate the primary root iron-acquisition machinery in</w:t>
+        <w:t xml:space="preserve">Iron is an obligatory catalytic cofactor for chlorophyll biosynthesis (specifically for coproporphyrinogen III oxidase) and is the core constituent of photosynthetic electron transport complexes (cytochromes and iron-sulfur [Fe–S] clusters) [52]. Islam et al. [53] and Narayana et al. [54] demonstrated that near-null magnetic fields downregulate the primary root iron-acquisition machinery in</w:t>
       </w:r>
       <w:r>
         <w:t xml:space="preserve"> </w:t>
@@ -6169,7 +6169,7 @@
         <w:t xml:space="preserve"> </w:t>
       </w:r>
       <w:r>
-        <w:t xml:space="preserve">[56] (Figure 3).</w:t>
+        <w:t xml:space="preserve">[55] (Figure 3).</w:t>
       </w:r>
     </w:p>
     <w:p>
@@ -6242,7 +6242,7 @@
         <w:t xml:space="preserve"> </w:t>
       </w:r>
       <w:r>
-        <w:t xml:space="preserve">Re-authoring of the 0–72 h heterotrophic energy bottleneck from the Quantum Biology Atlas [56]. Four horizontal lanes delineate the reserve mobilization and bioenergetic route: Peroxisome (TAG lipase SDP1 [T4],</w:t>
+        <w:t xml:space="preserve">Re-authoring of the 0–72 h heterotrophic energy bottleneck from the Quantum Biology Atlas [55]. Four horizontal lanes delineate the reserve mobilization and bioenergetic route: Peroxisome (TAG lipase SDP1 [T4],</w:t>
       </w:r>
       <w:r>
         <w:t xml:space="preserve"> </w:t>
@@ -6927,7 +6927,7 @@
         <w:t xml:space="preserve">MLS</w:t>
       </w:r>
       <w:r>
-        <w:t xml:space="preserve">], [T4 Context]) into succinate and malate [56].</w:t>
+        <w:t xml:space="preserve">], [T4 Context]) into succinate and malate [55].</w:t>
       </w:r>
       <w:r>
         <w:t xml:space="preserve"> </w:t>
@@ -7136,7 +7136,7 @@
         </m:sSub>
       </m:oMath>
       <w:r>
-        <w:t xml:space="preserve">, [T2 Inferred]), generating the proton-motive force driving ATP synthase [56,57].</w:t>
+        <w:t xml:space="preserve">, [T2 Inferred]), generating the proton-motive force driving ATP synthase [55,56].</w:t>
       </w:r>
       <w:r>
         <w:t xml:space="preserve"> </w:t>
@@ -7274,7 +7274,7 @@
         <w:t xml:space="preserve">evidence_tier</w:t>
       </w:r>
       <w:r>
-        <w:t xml:space="preserve">) [56] (Figure 3b):</w:t>
+        <w:t xml:space="preserve">) [55] (Figure 3b):</w:t>
       </w:r>
       <w:r>
         <w:t xml:space="preserve"> </w:t>
@@ -7404,7 +7404,7 @@
         <w:t xml:space="preserve"> </w:t>
       </w:r>
       <w:r>
-        <w:t xml:space="preserve">[50,58,59]. Singlet-triplet interconversion (</w:t>
+        <w:t xml:space="preserve">[49,57,58]. Singlet-triplet interconversion (</w:t>
       </w:r>
       <m:oMath>
         <m:r>
@@ -7659,7 +7659,7 @@
         </m:r>
       </m:oMath>
       <w:r>
-        <w:t xml:space="preserve">), completely decoupling external Zeeman mixing and locking the radical pair into an altered spin-state recombination ratio [50,51].</w:t>
+        <w:t xml:space="preserve">), completely decoupling external Zeeman mixing and locking the radical pair into an altered spin-state recombination ratio [49,50].</w:t>
       </w:r>
       <w:r>
         <w:t xml:space="preserve"> </w:t>
@@ -7716,7 +7716,7 @@
         </m:sSub>
       </m:oMath>
       <w:r>
-        <w:t xml:space="preserve">) and non-photochemical quenching (NPQ) [32,60]; (2) Mitochondrial Alternative Oxidase (AOX) respiratory buffering [56,61]; and (3) Ferritin (</w:t>
+        <w:t xml:space="preserve">) and non-photochemical quenching (NPQ) [31,59]; (2) Mitochondrial Alternative Oxidase (AOX) respiratory buffering [55,60]; and (3) Ferritin (</w:t>
       </w:r>
       <w:r>
         <w:rPr>
@@ -7726,7 +7726,7 @@
         <w:t xml:space="preserve">AtFer1–4</w:t>
       </w:r>
       <w:r>
-        <w:t xml:space="preserve">) iron sequestration [54,55].</w:t>
+        <w:t xml:space="preserve">) iron sequestration [53,54].</w:t>
       </w:r>
       <w:r>
         <w:t xml:space="preserve"> </w:t>
@@ -7820,7 +7820,7 @@
         <w:t xml:space="preserve"> </w:t>
       </w:r>
       <w:r>
-        <w:t xml:space="preserve">radical pair [56,62].</w:t>
+        <w:t xml:space="preserve">radical pair [55,61].</w:t>
       </w:r>
       <w:r>
         <w:t xml:space="preserve"> </w:t>
@@ -7909,7 +7909,7 @@
         <w:t xml:space="preserve"> </w:t>
       </w:r>
       <w:r>
-        <w:t xml:space="preserve">[63]. Because this timescale is six orders of magnitude (</w:t>
+        <w:t xml:space="preserve">[62]. Because this timescale is six orders of magnitude (</w:t>
       </w:r>
       <m:oMath>
         <m:sSup>
@@ -7965,7 +7965,7 @@
         </m:r>
       </m:oMath>
       <w:r>
-        <w:t xml:space="preserve">), static magnetic fields cannot alter linear photosynthetic charge separation in open reaction centers [12]. Direct magnetic modulation of PSII can only occur conditionally in closed reaction centers under high excitation pressure, where nanosecond charge recombination yields triplet chlorophyll (</w:t>
+        <w:t xml:space="preserve">), static magnetic fields cannot alter linear photosynthetic charge separation in open reaction centers [11]. Direct magnetic modulation of PSII can only occur conditionally in closed reaction centers under high excitation pressure, where nanosecond charge recombination yields triplet chlorophyll (</w:t>
       </w:r>
       <m:oMath>
         <m:sSup>
@@ -8034,7 +8034,7 @@
         </m:sSub>
       </m:oMath>
       <w:r>
-        <w:t xml:space="preserve">) [64].</w:t>
+        <w:t xml:space="preserve">) [63].</w:t>
       </w:r>
       <w:r>
         <w:t xml:space="preserve"> </w:t>
@@ -8056,7 +8056,7 @@
         <w:t xml:space="preserve"> </w:t>
       </w:r>
       <w:r>
-        <w:t xml:space="preserve">Theoretical models have occasionally postulated that hypomagnetic fields induce catastrophic mitochondrial failure by unlocking runaway superoxide leak at Complex III. However, biophysical EPR measurements by Sarewicz et al. [65] and Bujnowicz et al. [66] demonstrate that the semiquinone radical (</w:t>
+        <w:t xml:space="preserve">Theoretical models have occasionally postulated that hypomagnetic fields induce catastrophic mitochondrial failure by unlocking runaway superoxide leak at Complex III. However, biophysical EPR measurements by Sarewicz et al. [64] and Bujnowicz et al. [65] demonstrate that the semiquinone radical (</w:t>
       </w:r>
       <m:oMath>
         <m:sSup>
@@ -8209,7 +8209,7 @@
         <w:t xml:space="preserve">)</w:t>
       </w:r>
       <w:r>
-        <w:t xml:space="preserve">. This gigahertz exchange coupling overwhelms microtesla- or nanotesla-scale magnetic perturbations, proving that hypomagnetic exposure does not cause an immediate, catastrophic collapse of core respiration [12,56].</w:t>
+        <w:t xml:space="preserve">. This gigahertz exchange coupling overwhelms microtesla- or nanotesla-scale magnetic perturbations, proving that hypomagnetic exposure does not cause an immediate, catastrophic collapse of core respiration [11,55].</w:t>
       </w:r>
     </w:p>
     <w:p>
@@ -8329,7 +8329,7 @@
         <w:t xml:space="preserve"> </w:t>
       </w:r>
       <w:r>
-        <w:t xml:space="preserve">[7,8,67] (Figure 4a).</w:t>
+        <w:t xml:space="preserve">[7,8,66] (Figure 4a).</w:t>
       </w:r>
     </w:p>
     <w:p>
@@ -9402,7 +9402,7 @@
         <w:t xml:space="preserve"> </w:t>
       </w:r>
       <w:r>
-        <w:t xml:space="preserve">Conserved spaceflight mitochondrial phenotype. In plants, the mitochondrial ETC, AOX bypass, and Fe-S cluster turnover buffer hypomagnetic and radiation stress to preserve BLSS crop yield. In astronauts, mitochondrial dysregulation represents the single most conserved systemic spaceflight lesion (NASA Twins Study; Afshinnekoo et al. [68]), linking plant bioenergetics directly to crew health and food security.</w:t>
+        <w:t xml:space="preserve">Conserved spaceflight mitochondrial phenotype. In plants, the mitochondrial ETC, AOX bypass, and Fe-S cluster turnover buffer hypomagnetic and radiation stress to preserve BLSS crop yield. In astronauts, mitochondrial dysregulation represents the single most conserved systemic spaceflight lesion (NASA Twins Study; Afshinnekoo et al. [67]), linking plant bioenergetics directly to crew health and food security.</w:t>
       </w:r>
     </w:p>
     <w:bookmarkStart w:id="32" w:name="exploration-atmosphere-the-gas-balance"/>
@@ -9544,7 +9544,7 @@
         </m:r>
       </m:oMath>
       <w:r>
-        <w:t xml:space="preserve">) to prevent hypoxia while reducing extravehicular activity (EVA) pre-breathe times [8,67]. Concurrently, human metabolic exhalation elevates cabin carbon dioxide levels to</w:t>
+        <w:t xml:space="preserve">) to prevent hypoxia while reducing extravehicular activity (EVA) pre-breathe times [8,66]. Concurrently, human metabolic exhalation elevates cabin carbon dioxide levels to</w:t>
       </w:r>
       <w:r>
         <w:t xml:space="preserve"> </w:t>
@@ -9886,7 +9886,7 @@
         <w:t xml:space="preserve"> </w:t>
       </w:r>
       <w:r>
-        <w:t xml:space="preserve">production [41,69].</w:t>
+        <w:t xml:space="preserve">production [40,68].</w:t>
       </w:r>
       <w:r>
         <w:t xml:space="preserve"> </w:t>
@@ -9955,7 +9955,7 @@
         <w:t xml:space="preserve"> </w:t>
       </w:r>
       <w:r>
-        <w:t xml:space="preserve">concentrations in dense seed and root tissues. Mitochondria possess two terminal oxidases with dramatically different oxygen affinities [61]:</w:t>
+        <w:t xml:space="preserve">concentrations in dense seed and root tissues. Mitochondria possess two terminal oxidases with dramatically different oxygen affinities [60]:</w:t>
       </w:r>
       <w:r>
         <w:t xml:space="preserve"> </w:t>
@@ -10186,7 +10186,7 @@
         <w:t xml:space="preserve"> </w:t>
       </w:r>
       <w:r>
-        <w:t xml:space="preserve">to water while releasing energy entirely as heat [61,70].</w:t>
+        <w:t xml:space="preserve">to water while releasing energy entirely as heat [60,69].</w:t>
       </w:r>
     </w:p>
     <w:p>
@@ -10261,7 +10261,7 @@
         </m:sSubSup>
       </m:oMath>
       <w:r>
-        <w:t xml:space="preserve">) at Complexes I and III [61,71].</w:t>
+        <w:t xml:space="preserve">) at Complexes I and III [60,70].</w:t>
       </w:r>
     </w:p>
     <w:bookmarkEnd w:id="32"/>
@@ -10485,7 +10485,7 @@
         <w:t xml:space="preserve"> </w:t>
       </w:r>
       <w:r>
-        <w:t xml:space="preserve">clusters in mitochondrial complexes [72,73].</w:t>
+        <w:t xml:space="preserve">clusters in mitochondrial complexes [71,72].</w:t>
       </w:r>
     </w:p>
     <w:p>
@@ -10532,13 +10532,13 @@
           <w:b/>
           <w:bCs/>
         </w:rPr>
-        <w:t xml:space="preserve">Parmagnani et al. [74]</w:t>
-      </w:r>
-      <w:r>
-        <w:t xml:space="preserve"> </w:t>
-      </w:r>
-      <w:r>
-        <w:t xml:space="preserve">(~30 nT vs. GMF, 10 min–96 h) via the Quantum Biology Atlas overlap pipeline [56] (Figure 4c).</w:t>
+        <w:t xml:space="preserve">Parmagnani et al. [73]</w:t>
+      </w:r>
+      <w:r>
+        <w:t xml:space="preserve"> </w:t>
+      </w:r>
+      <w:r>
+        <w:t xml:space="preserve">(~30 nT vs. GMF, 10 min–96 h) via the Quantum Biology Atlas overlap pipeline [55] (Figure 4c).</w:t>
       </w:r>
     </w:p>
     <w:p>
@@ -11205,7 +11205,7 @@
         <w:t xml:space="preserve"> </w:t>
       </w:r>
       <w:r>
-        <w:t xml:space="preserve">[68,75] (Figure 4d).</w:t>
+        <w:t xml:space="preserve">[67,74] (Figure 4d).</w:t>
       </w:r>
     </w:p>
     <w:p>
@@ -11213,7 +11213,7 @@
         <w:pStyle w:val="BodyText"/>
       </w:pPr>
       <w:r>
-        <w:t xml:space="preserve">In a comprehensive multi-omics analysis of 59 astronauts and NASA Twins Study data, Afshinnekoo et al. [68] demonstrated that</w:t>
+        <w:t xml:space="preserve">In a comprehensive multi-omics analysis of 59 astronauts and NASA Twins Study data, Afshinnekoo et al. [67] demonstrated that</w:t>
       </w:r>
       <w:r>
         <w:t xml:space="preserve"> </w:t>
@@ -11226,7 +11226,7 @@
         <w:t xml:space="preserve">mitochondrial dysregulation is the single most consistent systemic spaceflight phenotype in humans</w:t>
       </w:r>
       <w:r>
-        <w:t xml:space="preserve">. Long-duration spaceflight impairs mitochondrial oxidative phosphorylation, downregulates Complex I and IV subunits, triggers electron leakage and chronic ROS overflow, and elevates circulating cell-free mitochondrial DNA (cf-mtDNA), contributing to astronaut immune suppression, cardiovascular deconditioning, and musculoskeletal decay [68,76].</w:t>
+        <w:t xml:space="preserve">. Long-duration spaceflight impairs mitochondrial oxidative phosphorylation, downregulates Complex I and IV subunits, triggers electron leakage and chronic ROS overflow, and elevates circulating cell-free mitochondrial DNA (cf-mtDNA), contributing to astronaut immune suppression, cardiovascular deconditioning, and musculoskeletal decay [67,75].</w:t>
       </w:r>
     </w:p>
     <w:p>
@@ -11234,7 +11234,7 @@
         <w:pStyle w:val="BodyText"/>
       </w:pPr>
       <w:r>
-        <w:t xml:space="preserve">In mammalian cellular and rodent models, hypomagnetic field exposure exacerbates this mitochondrial decay: Mo et al. [77,78] demonstrated that shielding the geomagnetic field suppresses osteoblast differentiation, accelerates bone demineralization, and induces mitochondrial-mediated apoptosis in human neuroblastoma cells.</w:t>
+        <w:t xml:space="preserve">In mammalian cellular and rodent models, hypomagnetic field exposure exacerbates this mitochondrial decay: Mo et al. [76,77] demonstrated that shielding the geomagnetic field suppresses osteoblast differentiation, accelerates bone demineralization, and induces mitochondrial-mediated apoptosis in human neuroblastoma cells.</w:t>
       </w:r>
     </w:p>
     <w:p>
@@ -11268,7 +11268,7 @@
         <w:pStyle w:val="FirstParagraph"/>
       </w:pPr>
       <w:r>
-        <w:t xml:space="preserve">The historical hypomagnetic literature has frequently suffered from contradictory findings and irreproducibility, stemming from inadequate environmental controls, lack of sham controls, and uncharacterized electromagnetic interference (EMI) [12,21,79]. To transition lunar magnetobiology into an operational engineering discipline for Artemis payloads, we formulate a standardized, four-stage flight qualification and causal risk-retirement pipeline (Figure 5).</w:t>
+        <w:t xml:space="preserve">The historical hypomagnetic literature has frequently suffered from contradictory findings and irreproducibility, stemming from inadequate environmental controls, lack of sham controls, and uncharacterized electromagnetic interference (EMI) [11,20,78]. To transition lunar magnetobiology into an operational engineering discipline for Artemis payloads, we formulate a standardized, four-stage flight qualification and causal risk-retirement pipeline (Figure 5).</w:t>
       </w:r>
     </w:p>
     <w:p>
@@ -12163,7 +12163,7 @@
         <w:t xml:space="preserve"> </w:t>
       </w:r>
       <w:r>
-        <w:t xml:space="preserve">at the plant canopy level [12].</w:t>
+        <w:t xml:space="preserve">at the plant canopy level [11].</w:t>
       </w:r>
     </w:p>
     <w:p>
@@ -12370,7 +12370,7 @@
         </m:sSup>
       </m:oMath>
       <w:r>
-        <w:t xml:space="preserve">) matched across chambers to prevent boundary layer and ethylene accumulation artifacts [7,41].</w:t>
+        <w:t xml:space="preserve">) matched across chambers to prevent boundary layer and ethylene accumulation artifacts [7,40].</w:t>
       </w:r>
     </w:p>
     <w:bookmarkEnd w:id="39"/>
@@ -12404,7 +12404,7 @@
         <w:t xml:space="preserve"> </w:t>
       </w:r>
       <w:r>
-        <w:t xml:space="preserve">[12,79] (Figure 5a). In a bifilar sham configuration, paired wires carry equal currents in opposite directions, producing complete magnetic field cancellation while generating identical resistive heat, current loads, and acoustic vibration as the active cancellation coils. Any biological difference observed between the active cancellation chamber and the bifilar sham chamber can then be unambiguously attributed to the magnetic vector itself.</w:t>
+        <w:t xml:space="preserve">[11,78] (Figure 5a). In a bifilar sham configuration, paired wires carry equal currents in opposite directions, producing complete magnetic field cancellation while generating identical resistive heat, current loads, and acoustic vibration as the active cancellation coils. Any biological difference observed between the active cancellation chamber and the bifilar sham chamber can then be unambiguously attributed to the magnetic vector itself.</w:t>
       </w:r>
     </w:p>
     <w:bookmarkEnd w:id="40"/>
@@ -12438,7 +12438,7 @@
         <w:t xml:space="preserve"> </w:t>
       </w:r>
       <w:r>
-        <w:t xml:space="preserve">[12,80] (Figure 5b):</w:t>
+        <w:t xml:space="preserve">[11,79] (Figure 5b):</w:t>
       </w:r>
       <w:r>
         <w:t xml:space="preserve"> </w:t>
@@ -14360,41 +14360,6 @@
       </w:r>
       <w:r>
         <w:t xml:space="preserve">, ICES-2018-199 (2018).</w:t>
-      </w:r>
-    </w:p>
-    <w:p>
-      <w:pPr>
-        <w:pStyle w:val="Compact"/>
-        <w:numPr>
-          <w:ilvl w:val="0"/>
-          <w:numId w:val="1002"/>
-        </w:numPr>
-      </w:pPr>
-      <w:r>
-        <w:t xml:space="preserve">Barker, R. et al. Developing a multi-omics atlas for space plant biology using the NASA Open Science Data Repository.</w:t>
-      </w:r>
-      <w:r>
-        <w:t xml:space="preserve"> </w:t>
-      </w:r>
-      <w:r>
-        <w:rPr>
-          <w:i/>
-          <w:iCs/>
-        </w:rPr>
-        <w:t xml:space="preserve">npj Microgravity</w:t>
-      </w:r>
-      <w:r>
-        <w:t xml:space="preserve"> </w:t>
-      </w:r>
-      <w:r>
-        <w:rPr>
-          <w:b/>
-          <w:bCs/>
-        </w:rPr>
-        <w:t xml:space="preserve">9</w:t>
-      </w:r>
-      <w:r>
-        <w:t xml:space="preserve">, 45 (2023). https://doi.org/10.1038/s41526-023-00295-8</w:t>
       </w:r>
     </w:p>
     <w:p>

</xml_diff>

<commit_message>
fix(metadata): correct institutional affiliations for Peirats-Llobet, Flores, and Dixit
</commit_message>
<xml_diff>
--- a/Near_Null_Magnetic_Fields_Lunar_Plant_Biology_LSSR_Review.docx
+++ b/Near_Null_Magnetic_Fields_Lunar_Plant_Biology_LSSR_Review.docx
@@ -291,7 +291,7 @@
           </m:e>
           <m:sup>
             <m:r>
-              <m:t>1</m:t>
+              <m:t>7</m:t>
             </m:r>
           </m:sup>
         </m:sSup>
@@ -312,7 +312,7 @@
           </m:e>
           <m:sup>
             <m:r>
-              <m:t>1</m:t>
+              <m:t>6</m:t>
             </m:r>
           </m:sup>
         </m:sSup>
@@ -333,7 +333,7 @@
           </m:e>
           <m:sup>
             <m:r>
-              <m:t>1</m:t>
+              <m:t>4</m:t>
             </m:r>
           </m:sup>
         </m:sSup>
@@ -498,6 +498,29 @@
       </w:r>
       <w:r>
         <w:t xml:space="preserve">Space Lab Technologies, LLC, Boulder, CO 80301, USA</w:t>
+      </w:r>
+      <w:r>
+        <w:br/>
+      </w:r>
+      <m:oMath>
+        <m:sSup>
+          <m:e>
+            <m:r>
+              <m:t>​</m:t>
+            </m:r>
+          </m:e>
+          <m:sup>
+            <m:r>
+              <m:t>7</m:t>
+            </m:r>
+          </m:sup>
+        </m:sSup>
+      </m:oMath>
+      <w:r>
+        <w:t xml:space="preserve"> </w:t>
+      </w:r>
+      <w:r>
+        <w:t xml:space="preserve">La Trobe Institute for Sustainable Agriculture and Food, School of Agriculture, Biomedicine and Environment, La Trobe University, Bundoora, VIC 3086, Australia</w:t>
       </w:r>
     </w:p>
     <w:p>

</xml_diff>

<commit_message>
Polish Figure 1 B/D offsets and reframe Figure 5 into 3-panel ground standards & disambiguation layout
</commit_message>
<xml_diff>
--- a/Near_Null_Magnetic_Fields_Lunar_Plant_Biology_LSSR_Review.docx
+++ b/Near_Null_Magnetic_Fields_Lunar_Plant_Biology_LSSR_Review.docx
@@ -1524,7 +1524,7 @@
       <w:r>
         <w:drawing>
           <wp:inline>
-            <wp:extent cx="5334000" cy="4616133"/>
+            <wp:extent cx="5334000" cy="4635944"/>
             <wp:effectExtent b="0" l="0" r="0" t="0"/>
             <wp:docPr descr="Figure 1" title="" id="12" name="Picture"/>
             <a:graphic>
@@ -1545,7 +1545,7 @@
                   <pic:spPr bwMode="auto">
                     <a:xfrm>
                       <a:off x="0" y="0"/>
-                      <a:ext cx="5334000" cy="4616133"/>
+                      <a:ext cx="5334000" cy="4635944"/>
                     </a:xfrm>
                     <a:prstGeom prst="rect">
                       <a:avLst/>
@@ -11600,7 +11600,7 @@
         <w:pStyle w:val="FirstParagraph"/>
       </w:pPr>
       <w:r>
-        <w:t xml:space="preserve">The historical hypomagnetic literature has frequently suffered from contradictory findings and irreproducibility, stemming from inadequate environmental controls, lack of sham controls, and uncharacterized electromagnetic interference (EMI) [11,20,78]. To transition lunar magnetobiology into an operational scientific discipline for Artemis payloads, we formulate a standardized, four-stage framework separating laboratory ground standards from flight engineering realities (Figure 5).</w:t>
+        <w:t xml:space="preserve">The historical hypomagnetic literature has frequently suffered from contradictory findings and irreproducibility, stemming from inadequate environmental controls, lack of sham controls, and uncharacterized electromagnetic interference (EMI) [11,20,78]. To transition lunar magnetobiology into an operational scientific discipline for Artemis payloads, we formulate a standardized framework focusing on rigorous ground simulation methods, causal validation, and post-flight phenotypic disambiguation (Figure 5).</w:t>
       </w:r>
     </w:p>
     <w:p>
@@ -11610,7 +11610,7 @@
       <w:r>
         <w:drawing>
           <wp:inline>
-            <wp:extent cx="5334000" cy="4510306"/>
+            <wp:extent cx="5334000" cy="4446945"/>
             <wp:effectExtent b="0" l="0" r="0" t="0"/>
             <wp:docPr descr="Figure 5" title="" id="38" name="Picture"/>
             <a:graphic>
@@ -11631,7 +11631,7 @@
                   <pic:spPr bwMode="auto">
                     <a:xfrm>
                       <a:off x="0" y="0"/>
-                      <a:ext cx="5334000" cy="4510306"/>
+                      <a:ext cx="5334000" cy="4446945"/>
                     </a:xfrm>
                     <a:prstGeom prst="rect">
                       <a:avLst/>
@@ -11657,7 +11657,7 @@
           <w:b/>
           <w:bCs/>
         </w:rPr>
-        <w:t xml:space="preserve">Figure 5 | Scientific knowledge gap retirement, ground simulation standards, and flight instrumentation trade space.</w:t>
+        <w:t xml:space="preserve">Figure 5 | Ground simulation standards, in situ causal rescue protocol, and post-flight phenotypic disambiguation framework.</w:t>
       </w:r>
       <w:r>
         <w:br/>
@@ -11995,53 +11995,13 @@
           <w:b/>
           <w:bCs/>
         </w:rPr>
-        <w:t xml:space="preserve">(c) Flight Payload Trade Space: Science Gaps vs. Engineering Realities:</w:t>
-      </w:r>
-      <w:r>
-        <w:t xml:space="preserve"> </w:t>
-      </w:r>
-      <w:r>
-        <w:t xml:space="preserve">Delineating what flight payloads can realistically accommodate (passive 3-axis fluxgate/AMR canopy vector logging,</w:t>
-      </w:r>
-      <w:r>
-        <w:t xml:space="preserve"> </w:t>
-      </w:r>
-      <m:oMath>
-        <m:r>
-          <m:rPr>
-            <m:sty m:val="p"/>
-          </m:rPr>
-          <m:t>&lt;</m:t>
-        </m:r>
-        <m:r>
-          <m:t>1</m:t>
-        </m:r>
-        <m:r>
-          <m:rPr>
-            <m:nor/>
-            <m:sty m:val="p"/>
-          </m:rPr>
-          <m:t> W</m:t>
-        </m:r>
-      </m:oMath>
-      <w:r>
-        <w:t xml:space="preserve">, grams of mass, continuous DC-to-AC field capture, post-flight correlative science) versus what exceeds typical flight resource envelopes and should remain ground-based (active Helmholtz cancellation/bias coils, heavy copper mass, continuous power consumption, thermal dissipation, and spacecraft EMI certification hurdles).</w:t>
-      </w:r>
-      <w:r>
-        <w:br/>
-      </w:r>
-      <w:r>
-        <w:rPr>
-          <w:b/>
-          <w:bCs/>
-        </w:rPr>
-        <w:t xml:space="preserve">(d) Post-Flight Phenotypic Disambiguation Framework:</w:t>
-      </w:r>
-      <w:r>
-        <w:t xml:space="preserve"> </w:t>
-      </w:r>
-      <w:r>
-        <w:t xml:space="preserve">Diagnostic matrix translating empirical ground and flight telemetry to decouple overlapping environmental stressors in lunar agricultural payloads (Table 3), distinguishing Hypomagnetic Field lesions (emergence lag, cryptochrome-HY5 chlorosis, AOX1D induction without DNA breaks) from Lunar Partial Gravity (</w:t>
+        <w:t xml:space="preserve">(c) Post-Flight Phenotypic Risk Disambiguation Framework:</w:t>
+      </w:r>
+      <w:r>
+        <w:t xml:space="preserve"> </w:t>
+      </w:r>
+      <w:r>
+        <w:t xml:space="preserve">Comprehensive comparative matrix translating empirical ground and flight telemetry to decouple overlapping environmental stressors in lunar agricultural payloads (Table 3), distinguishing Hypomagnetic Field lesions (emergence lag, cryptochrome-HY5 chlorosis, AOX1D induction without DNA breaks) from Lunar Partial Gravity (</w:t>
       </w:r>
       <m:oMath>
         <m:r>
@@ -12470,10 +12430,7 @@
         <w:t xml:space="preserve">scientific knowledge gaps must be considered separately from what can realistically be engineered into a spaceflight payload</w:t>
       </w:r>
       <w:r>
-        <w:t xml:space="preserve"> </w:t>
-      </w:r>
-      <w:r>
-        <w:t xml:space="preserve">(Figure 5c). In flight mission planning, hardware mass, power draw, thermal envelope, and contractual scope impose stringent boundary conditions:</w:t>
+        <w:t xml:space="preserve">. In flight mission planning, hardware mass, power draw, thermal envelope, and contractual scope impose stringent boundary conditions:</w:t>
       </w:r>
       <w:r>
         <w:t xml:space="preserve"> </w:t>
@@ -12744,7 +12701,7 @@
         <w:t xml:space="preserve"> </w:t>
       </w:r>
       <w:r>
-        <w:t xml:space="preserve">to interpret seedling performance and identify the primary causal stressors operating on the lunar surface (Figure 5d; Table 3):</w:t>
+        <w:t xml:space="preserve">to interpret seedling performance and identify the primary causal stressors operating on the lunar surface (Figure 5c; Table 3):</w:t>
       </w:r>
       <w:r>
         <w:t xml:space="preserve"> </w:t>

</xml_diff>

<commit_message>
Refine Fig1b arrows/offsets, expand Fig1d/Fig2a boxes, and replace Fig5b with Hardware Self-Magnetic Assessment Protocol
</commit_message>
<xml_diff>
--- a/Near_Null_Magnetic_Fields_Lunar_Plant_Biology_LSSR_Review.docx
+++ b/Near_Null_Magnetic_Fields_Lunar_Plant_Biology_LSSR_Review.docx
@@ -764,7 +764,7 @@
         </w:numPr>
       </w:pPr>
       <w:r>
-        <w:t xml:space="preserve">Rigorous ground standards (bifilar shams and causal rescue) decouple magnetic effects from chamber artifacts.</w:t>
+        <w:t xml:space="preserve">Rigorous ground standards (bifilar shams) and hardware self-magnetic mapping decouple magnetic effects from payload artifacts.</w:t>
       </w:r>
     </w:p>
     <w:p>
@@ -1189,7 +1189,7 @@
         <w:t xml:space="preserve">CAT3</w:t>
       </w:r>
       <w:r>
-        <w:t xml:space="preserve">) to buffer excessive electron leakage. Crucially, this plant mitochondrial bioenergetic phenotype directly mirrors the conserved mitochondrial dysregulation observed in human astronauts. Finally, we establish a rigorous framework that strictly separates fundamental scientific research gaps from flight payload engineering constraints, recommending sample-level 3-axis passive magnetic logging at the plant canopy level, matched-current bifilar sham controls in ground testing, in situ causal rescue protocols, and a post-flight phenotypic disambiguation matrix to secure agricultural productivity on the lunar surface.</w:t>
+        <w:t xml:space="preserve">) to buffer excessive electron leakage. Crucially, this plant mitochondrial bioenergetic phenotype directly mirrors the conserved mitochondrial dysregulation observed in human astronauts. Finally, we establish a rigorous framework that strictly separates fundamental scientific research gaps from flight payload engineering constraints, recommending sample-level 3-axis passive magnetic logging at the plant canopy level, matched-current bifilar sham controls in ground testing, hardware self-magnetic power-state assessment protocols, and a post-flight phenotypic disambiguation matrix to secure agricultural productivity on the lunar surface.</w:t>
       </w:r>
     </w:p>
     <w:p>
@@ -1524,7 +1524,7 @@
       <w:r>
         <w:drawing>
           <wp:inline>
-            <wp:extent cx="5334000" cy="4635944"/>
+            <wp:extent cx="5334000" cy="4643675"/>
             <wp:effectExtent b="0" l="0" r="0" t="0"/>
             <wp:docPr descr="Figure 1" title="" id="12" name="Picture"/>
             <a:graphic>
@@ -1545,7 +1545,7 @@
                   <pic:spPr bwMode="auto">
                     <a:xfrm>
                       <a:off x="0" y="0"/>
-                      <a:ext cx="5334000" cy="4635944"/>
+                      <a:ext cx="5334000" cy="4643675"/>
                     </a:xfrm>
                     <a:prstGeom prst="rect">
                       <a:avLst/>
@@ -5619,7 +5619,7 @@
       <w:r>
         <w:drawing>
           <wp:inline>
-            <wp:extent cx="5334000" cy="4402537"/>
+            <wp:extent cx="5334000" cy="4443106"/>
             <wp:effectExtent b="0" l="0" r="0" t="0"/>
             <wp:docPr descr="Figure 2" title="" id="20" name="Picture"/>
             <a:graphic>
@@ -5640,7 +5640,7 @@
                   <pic:spPr bwMode="auto">
                     <a:xfrm>
                       <a:off x="0" y="0"/>
-                      <a:ext cx="5334000" cy="4402537"/>
+                      <a:ext cx="5334000" cy="4443106"/>
                     </a:xfrm>
                     <a:prstGeom prst="rect">
                       <a:avLst/>
@@ -11657,7 +11657,7 @@
           <w:b/>
           <w:bCs/>
         </w:rPr>
-        <w:t xml:space="preserve">Figure 5 | Ground simulation standards, in situ causal rescue protocol, and post-flight phenotypic disambiguation framework.</w:t>
+        <w:t xml:space="preserve">Figure 5 | Ground simulation standards, hardware self-magnetic assessment protocol, and post-flight phenotypic disambiguation framework.</w:t>
       </w:r>
       <w:r>
         <w:br/>
@@ -11931,41 +11931,30 @@
           <w:b/>
           <w:bCs/>
         </w:rPr>
-        <w:t xml:space="preserve">(b) In Situ Causal Reversal Protocol (Proof of Concept):</w:t>
-      </w:r>
-      <w:r>
-        <w:t xml:space="preserve"> </w:t>
-      </w:r>
-      <w:r>
-        <w:t xml:space="preserve">Three-step causal proof inside magnetic shielding. Step 1: Hypomagnetic exposure (</w:t>
-      </w:r>
-      <m:oMath>
-        <m:r>
-          <m:rPr>
-            <m:sty m:val="p"/>
-          </m:rPr>
-          <m:t>&lt;</m:t>
-        </m:r>
-        <m:r>
-          <m:t>10</m:t>
+        <w:t xml:space="preserve">(b) Hardware Self-Magnetic Assessment Protocol (Power-State Mapping):</w:t>
+      </w:r>
+      <w:r>
+        <w:t xml:space="preserve"> </w:t>
+      </w:r>
+      <w:r>
+        <w:t xml:space="preserve">Systematic calibration matrix to decouple hardware self-generated magnetic fields from the ambient lunar near-null field. As payload subsystems modulate across operational power settings (LED PAR lighting</w:t>
+      </w:r>
+      <w:r>
+        <w:t xml:space="preserve"> </w:t>
+      </w:r>
+      <m:oMath>
+        <m:r>
+          <m:t>0</m:t>
         </m:r>
         <m:r>
           <m:rPr>
             <m:nor/>
             <m:sty m:val="p"/>
           </m:rPr>
-          <m:t> nT</m:t>
-        </m:r>
-      </m:oMath>
-      <w:r>
-        <w:t xml:space="preserve">) elicits emergence lag, chlorosis, and mitochondrial ROS leakage. Step 2: Triaxial Helmholtz coils re-apply a calibrated Earth-like</w:t>
-      </w:r>
-      <w:r>
-        <w:t xml:space="preserve"> </w:t>
-      </w:r>
-      <m:oMath>
-        <m:r>
-          <m:t>45</m:t>
+          <m:t>–</m:t>
+        </m:r>
+        <m:r>
+          <m:t>400</m:t>
         </m:r>
         <m:r>
           <m:t> </m:t>
@@ -11973,19 +11962,484 @@
         <m:r>
           <m:t>μ</m:t>
         </m:r>
+        <m:sSup>
+          <m:e>
+            <m:r>
+              <m:rPr>
+                <m:nor/>
+                <m:sty m:val="p"/>
+              </m:rPr>
+              <m:t>mol m</m:t>
+            </m:r>
+          </m:e>
+          <m:sup>
+            <m:r>
+              <m:rPr>
+                <m:sty m:val="p"/>
+              </m:rPr>
+              <m:t>−</m:t>
+            </m:r>
+            <m:r>
+              <m:t>2</m:t>
+            </m:r>
+          </m:sup>
+        </m:sSup>
+        <m:sSup>
+          <m:e>
+            <m:r>
+              <m:rPr>
+                <m:nor/>
+                <m:sty m:val="p"/>
+              </m:rPr>
+              <m:t>s</m:t>
+            </m:r>
+          </m:e>
+          <m:sup>
+            <m:r>
+              <m:rPr>
+                <m:sty m:val="p"/>
+              </m:rPr>
+              <m:t>−</m:t>
+            </m:r>
+            <m:r>
+              <m:t>1</m:t>
+            </m:r>
+          </m:sup>
+        </m:sSup>
+      </m:oMath>
+      <w:r>
+        <w:t xml:space="preserve"> </w:t>
+      </w:r>
+      <w:r>
+        <w:t xml:space="preserve">inducing</w:t>
+      </w:r>
+      <w:r>
+        <w:t xml:space="preserve"> </w:t>
+      </w:r>
+      <m:oMath>
+        <m:r>
+          <m:rPr>
+            <m:sty m:val="p"/>
+          </m:rPr>
+          <m:t>Δ</m:t>
+        </m:r>
+        <m:r>
+          <m:t>B</m:t>
+        </m:r>
+        <m:r>
+          <m:rPr>
+            <m:sty m:val="p"/>
+          </m:rPr>
+          <m:t>≈</m:t>
+        </m:r>
+        <m:r>
+          <m:t>2</m:t>
+        </m:r>
         <m:r>
           <m:rPr>
             <m:nor/>
             <m:sty m:val="p"/>
           </m:rPr>
+          <m:t>–</m:t>
+        </m:r>
+        <m:r>
+          <m:t>15</m:t>
+        </m:r>
+        <m:r>
+          <m:t> </m:t>
+        </m:r>
+        <m:r>
+          <m:t>μ</m:t>
+        </m:r>
+        <m:r>
+          <m:rPr>
+            <m:nor/>
+            <m:sty m:val="p"/>
+          </m:rPr>
           <m:t>T</m:t>
         </m:r>
       </m:oMath>
       <w:r>
-        <w:t xml:space="preserve"> </w:t>
-      </w:r>
-      <w:r>
-        <w:t xml:space="preserve">vector directly inside the shield. Step 3: Complete biological phenotype reversal to geomagnetic baseline formally proves magnetic causality, definitively ruling out enclosure, microclimatic, ethylene, or outgassing artifacts.</w:t>
+        <w:t xml:space="preserve">; fluidic pump pulses inducing</w:t>
+      </w:r>
+      <w:r>
+        <w:t xml:space="preserve"> </w:t>
+      </w:r>
+      <m:oMath>
+        <m:r>
+          <m:rPr>
+            <m:sty m:val="p"/>
+          </m:rPr>
+          <m:t>Δ</m:t>
+        </m:r>
+        <m:r>
+          <m:t>B</m:t>
+        </m:r>
+        <m:r>
+          <m:rPr>
+            <m:sty m:val="p"/>
+          </m:rPr>
+          <m:t>≈</m:t>
+        </m:r>
+        <m:r>
+          <m:t>8</m:t>
+        </m:r>
+        <m:r>
+          <m:rPr>
+            <m:nor/>
+            <m:sty m:val="p"/>
+          </m:rPr>
+          <m:t>–</m:t>
+        </m:r>
+        <m:r>
+          <m:t>35</m:t>
+        </m:r>
+        <m:r>
+          <m:t> </m:t>
+        </m:r>
+        <m:r>
+          <m:t>μ</m:t>
+        </m:r>
+        <m:r>
+          <m:rPr>
+            <m:nor/>
+            <m:sty m:val="p"/>
+          </m:rPr>
+          <m:t>T</m:t>
+        </m:r>
+      </m:oMath>
+      <w:r>
+        <w:t xml:space="preserve">; resistive thermal heaters inducing</w:t>
+      </w:r>
+      <w:r>
+        <w:t xml:space="preserve"> </w:t>
+      </w:r>
+      <m:oMath>
+        <m:r>
+          <m:rPr>
+            <m:sty m:val="p"/>
+          </m:rPr>
+          <m:t>Δ</m:t>
+        </m:r>
+        <m:r>
+          <m:t>B</m:t>
+        </m:r>
+        <m:r>
+          <m:rPr>
+            <m:sty m:val="p"/>
+          </m:rPr>
+          <m:t>≈</m:t>
+        </m:r>
+        <m:r>
+          <m:t>12</m:t>
+        </m:r>
+        <m:r>
+          <m:rPr>
+            <m:nor/>
+            <m:sty m:val="p"/>
+          </m:rPr>
+          <m:t>–</m:t>
+        </m:r>
+        <m:r>
+          <m:t>48</m:t>
+        </m:r>
+        <m:r>
+          <m:t> </m:t>
+        </m:r>
+        <m:r>
+          <m:t>μ</m:t>
+        </m:r>
+        <m:r>
+          <m:rPr>
+            <m:nor/>
+            <m:sty m:val="p"/>
+          </m:rPr>
+          <m:t>T</m:t>
+        </m:r>
+      </m:oMath>
+      <w:r>
+        <w:t xml:space="preserve">; and avionics telemetry buses generating</w:t>
+      </w:r>
+      <w:r>
+        <w:t xml:space="preserve"> </w:t>
+      </w:r>
+      <m:oMath>
+        <m:r>
+          <m:rPr>
+            <m:sty m:val="p"/>
+          </m:rPr>
+          <m:t>Δ</m:t>
+        </m:r>
+        <m:r>
+          <m:t>B</m:t>
+        </m:r>
+        <m:r>
+          <m:rPr>
+            <m:sty m:val="p"/>
+          </m:rPr>
+          <m:t>≈</m:t>
+        </m:r>
+        <m:r>
+          <m:t>0.5</m:t>
+        </m:r>
+        <m:r>
+          <m:rPr>
+            <m:nor/>
+            <m:sty m:val="p"/>
+          </m:rPr>
+          <m:t>–</m:t>
+        </m:r>
+        <m:r>
+          <m:t>4</m:t>
+        </m:r>
+        <m:r>
+          <m:t> </m:t>
+        </m:r>
+        <m:r>
+          <m:t>μ</m:t>
+        </m:r>
+        <m:r>
+          <m:rPr>
+            <m:nor/>
+            <m:sty m:val="p"/>
+          </m:rPr>
+          <m:t>T</m:t>
+        </m:r>
+      </m:oMath>
+      <w:r>
+        <w:t xml:space="preserve">), induced DC vectors are logged. Using the empirical superposition transfer function</w:t>
+      </w:r>
+      <w:r>
+        <w:t xml:space="preserve"> </w:t>
+      </w:r>
+      <m:oMath>
+        <m:sSub>
+          <m:e>
+            <m:r>
+              <m:rPr>
+                <m:sty m:val="bi"/>
+              </m:rPr>
+              <m:t>B</m:t>
+            </m:r>
+          </m:e>
+          <m:sub>
+            <m:r>
+              <m:rPr>
+                <m:sty m:val="p"/>
+              </m:rPr>
+              <m:t>a</m:t>
+            </m:r>
+            <m:r>
+              <m:rPr>
+                <m:sty m:val="p"/>
+              </m:rPr>
+              <m:t>m</m:t>
+            </m:r>
+            <m:r>
+              <m:rPr>
+                <m:sty m:val="p"/>
+              </m:rPr>
+              <m:t>b</m:t>
+            </m:r>
+            <m:r>
+              <m:rPr>
+                <m:sty m:val="p"/>
+              </m:rPr>
+              <m:t>i</m:t>
+            </m:r>
+            <m:r>
+              <m:rPr>
+                <m:sty m:val="p"/>
+              </m:rPr>
+              <m:t>e</m:t>
+            </m:r>
+            <m:r>
+              <m:rPr>
+                <m:sty m:val="p"/>
+              </m:rPr>
+              <m:t>n</m:t>
+            </m:r>
+            <m:r>
+              <m:rPr>
+                <m:sty m:val="p"/>
+              </m:rPr>
+              <m:t>t</m:t>
+            </m:r>
+          </m:sub>
+        </m:sSub>
+        <m:r>
+          <m:rPr>
+            <m:sty m:val="p"/>
+          </m:rPr>
+          <m:t>(</m:t>
+        </m:r>
+        <m:r>
+          <m:t>t</m:t>
+        </m:r>
+        <m:r>
+          <m:rPr>
+            <m:sty m:val="p"/>
+          </m:rPr>
+          <m:t>)</m:t>
+        </m:r>
+        <m:r>
+          <m:rPr>
+            <m:sty m:val="p"/>
+          </m:rPr>
+          <m:t>=</m:t>
+        </m:r>
+        <m:sSub>
+          <m:e>
+            <m:r>
+              <m:rPr>
+                <m:sty m:val="bi"/>
+              </m:rPr>
+              <m:t>B</m:t>
+            </m:r>
+          </m:e>
+          <m:sub>
+            <m:r>
+              <m:rPr>
+                <m:sty m:val="p"/>
+              </m:rPr>
+              <m:t>s</m:t>
+            </m:r>
+            <m:r>
+              <m:rPr>
+                <m:sty m:val="p"/>
+              </m:rPr>
+              <m:t>e</m:t>
+            </m:r>
+            <m:r>
+              <m:rPr>
+                <m:sty m:val="p"/>
+              </m:rPr>
+              <m:t>n</m:t>
+            </m:r>
+            <m:r>
+              <m:rPr>
+                <m:sty m:val="p"/>
+              </m:rPr>
+              <m:t>s</m:t>
+            </m:r>
+            <m:r>
+              <m:rPr>
+                <m:sty m:val="p"/>
+              </m:rPr>
+              <m:t>o</m:t>
+            </m:r>
+            <m:r>
+              <m:rPr>
+                <m:sty m:val="p"/>
+              </m:rPr>
+              <m:t>r</m:t>
+            </m:r>
+          </m:sub>
+        </m:sSub>
+        <m:r>
+          <m:rPr>
+            <m:sty m:val="p"/>
+          </m:rPr>
+          <m:t>(</m:t>
+        </m:r>
+        <m:r>
+          <m:t>t</m:t>
+        </m:r>
+        <m:r>
+          <m:rPr>
+            <m:sty m:val="p"/>
+          </m:rPr>
+          <m:t>)</m:t>
+        </m:r>
+        <m:r>
+          <m:rPr>
+            <m:sty m:val="p"/>
+          </m:rPr>
+          <m:t>−</m:t>
+        </m:r>
+        <m:nary>
+          <m:naryPr>
+            <m:chr m:val="∑"/>
+            <m:limLoc m:val="undOvr"/>
+            <m:subHide m:val="off"/>
+            <m:supHide m:val="on"/>
+          </m:naryPr>
+          <m:sub>
+            <m:r>
+              <m:t>k</m:t>
+            </m:r>
+          </m:sub>
+          <m:sup>
+            <m:r>
+              <m:t>​</m:t>
+            </m:r>
+          </m:sup>
+          <m:e>
+            <m:r>
+              <m:rPr>
+                <m:sty m:val="p"/>
+              </m:rPr>
+              <m:t>Δ</m:t>
+            </m:r>
+          </m:e>
+        </m:nary>
+        <m:sSub>
+          <m:e>
+            <m:r>
+              <m:rPr>
+                <m:sty m:val="bi"/>
+              </m:rPr>
+              <m:t>B</m:t>
+            </m:r>
+          </m:e>
+          <m:sub>
+            <m:r>
+              <m:t>k</m:t>
+            </m:r>
+          </m:sub>
+        </m:sSub>
+        <m:r>
+          <m:rPr>
+            <m:sty m:val="p"/>
+          </m:rPr>
+          <m:t>(</m:t>
+        </m:r>
+        <m:sSub>
+          <m:e>
+            <m:r>
+              <m:t>P</m:t>
+            </m:r>
+          </m:e>
+          <m:sub>
+            <m:r>
+              <m:t>k</m:t>
+            </m:r>
+          </m:sub>
+        </m:sSub>
+        <m:r>
+          <m:rPr>
+            <m:sty m:val="p"/>
+          </m:rPr>
+          <m:t>(</m:t>
+        </m:r>
+        <m:r>
+          <m:t>t</m:t>
+        </m:r>
+        <m:r>
+          <m:rPr>
+            <m:sty m:val="p"/>
+          </m:rPr>
+          <m:t>)</m:t>
+        </m:r>
+        <m:r>
+          <m:rPr>
+            <m:sty m:val="p"/>
+          </m:rPr>
+          <m:t>)</m:t>
+        </m:r>
+      </m:oMath>
+      <w:r>
+        <w:t xml:space="preserve">, payload self-fields are computationally subtracted to isolate true ambient exposure without requiring active in-flight cancellation coils.</w:t>
       </w:r>
       <w:r>
         <w:br/>
@@ -12270,13 +12724,13 @@
       </w:r>
     </w:p>
     <w:bookmarkEnd w:id="40"/>
-    <w:bookmarkStart w:id="41" w:name="stage-2-in-situ-causal-reversal-protocol"/>
+    <w:bookmarkStart w:id="41" w:name="X3176de122914450ed1a5a6b1fe8669a2353144e"/>
     <w:p>
       <w:pPr>
         <w:pStyle w:val="Heading3"/>
       </w:pPr>
       <w:r>
-        <w:t xml:space="preserve">5.2 Stage 2: In Situ Causal Reversal Protocol</w:t>
+        <w:t xml:space="preserve">5.2 Stage 2: Hardware Self-Magnetic Assessment Protocol and Power-State Mapping</w:t>
       </w:r>
     </w:p>
     <w:p>
@@ -12284,122 +12738,1141 @@
         <w:pStyle w:val="FirstParagraph"/>
       </w:pPr>
       <w:r>
-        <w:t xml:space="preserve">To definitively exclude chamber enclosure, volatile organic compound (VOC), or microclimatic artifacts in terrestrial simulation facilities, research programs should execute the</w:t>
-      </w:r>
-      <w:r>
-        <w:t xml:space="preserve"> </w:t>
-      </w:r>
-      <w:r>
-        <w:rPr>
-          <w:b/>
-          <w:bCs/>
-        </w:rPr>
-        <w:t xml:space="preserve">In Situ Causal Rescue Protocol</w:t>
-      </w:r>
-      <w:r>
-        <w:t xml:space="preserve"> </w:t>
-      </w:r>
-      <w:r>
-        <w:t xml:space="preserve">[11,79] (Figure 5b):</w:t>
-      </w:r>
-      <w:r>
-        <w:t xml:space="preserve"> </w:t>
-      </w:r>
-      <w:r>
-        <w:t xml:space="preserve">1. Plants are cultivated within a magnetically shielded enclosure (</w:t>
-      </w:r>
-      <m:oMath>
+        <w:t xml:space="preserve">In spaceflight agricultural payloads and sealed environmental enclosures, the growth hardware itself constitutes a primary, dynamic source of magnetic interference [11]. Internal DC currents feeding LEDs, fluidic pumps, heaters, and avionics generate localized stray fields (5 to &gt;50 µT) that vary continuously with subsystem operational power settings (Figure 5b). To decouple these hardware self-fields from the ambient lunar near-null environment without requiring mass-prohibitive magnetic shielding, engineering teams must execute a pre-flight and in-flight</w:t>
+      </w:r>
+      <w:r>
+        <w:t xml:space="preserve"> </w:t>
+      </w:r>
+      <w:r>
+        <w:rPr>
+          <w:b/>
+          <w:bCs/>
+        </w:rPr>
+        <w:t xml:space="preserve">Hardware Self-Magnetic Assessment Protocol</w:t>
+      </w:r>
+      <w:r>
+        <w:t xml:space="preserve">:</w:t>
+      </w:r>
+      <w:r>
+        <w:t xml:space="preserve"> </w:t>
+      </w:r>
+      <w:r>
+        <w:t xml:space="preserve">1.</w:t>
+      </w:r>
+      <w:r>
+        <w:t xml:space="preserve"> </w:t>
+      </w:r>
+      <w:r>
+        <w:rPr>
+          <w:b/>
+          <w:bCs/>
+        </w:rPr>
+        <w:t xml:space="preserve">Quiescent Baseline Mapping:</w:t>
+      </w:r>
+      <w:r>
+        <w:t xml:space="preserve"> </w:t>
+      </w:r>
+      <w:r>
+        <w:t xml:space="preserve">With all dynamic actuators deactivated, measure the quiescent baseline vector</w:t>
+      </w:r>
+      <w:r>
+        <w:t xml:space="preserve"> </w:t>
+      </w:r>
+      <m:oMath>
+        <m:sSub>
+          <m:e>
+            <m:r>
+              <m:rPr>
+                <m:sty m:val="bi"/>
+              </m:rPr>
+              <m:t>B</m:t>
+            </m:r>
+          </m:e>
+          <m:sub>
+            <m:r>
+              <m:rPr>
+                <m:sty m:val="p"/>
+              </m:rPr>
+              <m:t>i</m:t>
+            </m:r>
+            <m:r>
+              <m:rPr>
+                <m:sty m:val="p"/>
+              </m:rPr>
+              <m:t>d</m:t>
+            </m:r>
+            <m:r>
+              <m:rPr>
+                <m:sty m:val="p"/>
+              </m:rPr>
+              <m:t>l</m:t>
+            </m:r>
+            <m:r>
+              <m:rPr>
+                <m:sty m:val="p"/>
+              </m:rPr>
+              <m:t>e</m:t>
+            </m:r>
+          </m:sub>
+        </m:sSub>
+      </m:oMath>
+      <w:r>
+        <w:t xml:space="preserve"> </w:t>
+      </w:r>
+      <w:r>
+        <w:t xml:space="preserve">at the plant canopy using miniature 3-axis magnetometers.</w:t>
+      </w:r>
+      <w:r>
+        <w:t xml:space="preserve"> </w:t>
+      </w:r>
+      <w:r>
+        <w:t xml:space="preserve">2.</w:t>
+      </w:r>
+      <w:r>
+        <w:t xml:space="preserve"> </w:t>
+      </w:r>
+      <w:r>
+        <w:rPr>
+          <w:b/>
+          <w:bCs/>
+        </w:rPr>
+        <w:t xml:space="preserve">Subsystem Power-State Sweeps:</w:t>
+      </w:r>
+      <w:r>
+        <w:t xml:space="preserve"> </w:t>
+      </w:r>
+      <w:r>
+        <w:t xml:space="preserve">Stepwise calibrate each subsystem independently across its dynamic range:</w:t>
+      </w:r>
+      <w:r>
+        <w:t xml:space="preserve"> </w:t>
+      </w:r>
+      <w:r>
+        <w:t xml:space="preserve">-</w:t>
+      </w:r>
+      <w:r>
+        <w:t xml:space="preserve"> </w:t>
+      </w:r>
+      <w:r>
+        <w:rPr>
+          <w:i/>
+          <w:iCs/>
+        </w:rPr>
+        <w:t xml:space="preserve">LED PAR Array:</w:t>
+      </w:r>
+      <w:r>
+        <w:t xml:space="preserve"> </w:t>
+      </w:r>
+      <w:r>
+        <w:t xml:space="preserve">Sweep irradiance from 0 to</w:t>
+      </w:r>
+      <w:r>
+        <w:t xml:space="preserve"> </w:t>
+      </w:r>
+      <m:oMath>
+        <m:r>
+          <m:t>400</m:t>
+        </m:r>
+        <m:r>
+          <m:t> </m:t>
+        </m:r>
         <m:r>
           <m:t>μ</m:t>
         </m:r>
-      </m:oMath>
-      <w:r>
-        <w:t xml:space="preserve">-metal or active cancellation,</w:t>
-      </w:r>
-      <w:r>
-        <w:t xml:space="preserve"> </w:t>
-      </w:r>
-      <m:oMath>
-        <m:r>
-          <m:rPr>
-            <m:sty m:val="p"/>
-          </m:rPr>
-          <m:t>|</m:t>
-        </m:r>
-        <m:r>
-          <m:rPr>
-            <m:sty m:val="bi"/>
-          </m:rPr>
-          <m:t>B</m:t>
-        </m:r>
-        <m:r>
-          <m:rPr>
-            <m:sty m:val="p"/>
-          </m:rPr>
-          <m:t>|</m:t>
-        </m:r>
-        <m:r>
-          <m:rPr>
-            <m:sty m:val="p"/>
-          </m:rPr>
-          <m:t>&lt;</m:t>
-        </m:r>
-        <m:r>
-          <m:t>10</m:t>
+        <m:sSup>
+          <m:e>
+            <m:r>
+              <m:rPr>
+                <m:nor/>
+                <m:sty m:val="p"/>
+              </m:rPr>
+              <m:t>mol m</m:t>
+            </m:r>
+          </m:e>
+          <m:sup>
+            <m:r>
+              <m:rPr>
+                <m:sty m:val="p"/>
+              </m:rPr>
+              <m:t>−</m:t>
+            </m:r>
+            <m:r>
+              <m:t>2</m:t>
+            </m:r>
+          </m:sup>
+        </m:sSup>
+        <m:sSup>
+          <m:e>
+            <m:r>
+              <m:rPr>
+                <m:nor/>
+                <m:sty m:val="p"/>
+              </m:rPr>
+              <m:t>s</m:t>
+            </m:r>
+          </m:e>
+          <m:sup>
+            <m:r>
+              <m:rPr>
+                <m:sty m:val="p"/>
+              </m:rPr>
+              <m:t>−</m:t>
+            </m:r>
+            <m:r>
+              <m:t>1</m:t>
+            </m:r>
+          </m:sup>
+        </m:sSup>
+      </m:oMath>
+      <w:r>
+        <w:t xml:space="preserve"> </w:t>
+      </w:r>
+      <w:r>
+        <w:t xml:space="preserve">(</w:t>
+      </w:r>
+      <m:oMath>
+        <m:r>
+          <m:t>0</m:t>
         </m:r>
         <m:r>
           <m:rPr>
             <m:nor/>
             <m:sty m:val="p"/>
           </m:rPr>
-          <m:t> nT</m:t>
-        </m:r>
-      </m:oMath>
-      <w:r>
-        <w:t xml:space="preserve">), reproducing the hypomagnetic phenotype (germination delay, reduced elongation, chlorosis).</w:t>
-      </w:r>
-      <w:r>
-        <w:t xml:space="preserve"> </w:t>
-      </w:r>
-      <w:r>
-        <w:t xml:space="preserve">2. Inside the exact same shielded physical enclosure, an internal triaxial Helmholtz or Merritt coil system is energized to re-apply an Earth-normal geomagnetic vector (</w:t>
-      </w:r>
-      <m:oMath>
-        <m:r>
-          <m:t>45</m:t>
+          <m:t>–</m:t>
+        </m:r>
+        <m:r>
+          <m:t>25</m:t>
         </m:r>
         <m:r>
           <m:rPr>
             <m:nor/>
             <m:sty m:val="p"/>
           </m:rPr>
+          <m:t> W</m:t>
+        </m:r>
+      </m:oMath>
+      <w:r>
+        <w:t xml:space="preserve">,</w:t>
+      </w:r>
+      <w:r>
+        <w:t xml:space="preserve"> </w:t>
+      </w:r>
+      <m:oMath>
+        <m:r>
+          <m:t>0.1</m:t>
+        </m:r>
+        <m:r>
+          <m:rPr>
+            <m:nor/>
+            <m:sty m:val="p"/>
+          </m:rPr>
           <m:t>–</m:t>
         </m:r>
         <m:r>
-          <m:t>50</m:t>
-        </m:r>
-        <m:r>
-          <m:t> </m:t>
-        </m:r>
-        <m:r>
-          <m:t>μ</m:t>
+          <m:t>1.8</m:t>
         </m:r>
         <m:r>
           <m:rPr>
             <m:nor/>
             <m:sty m:val="p"/>
           </m:rPr>
-          <m:t>T</m:t>
-        </m:r>
-      </m:oMath>
-      <w:r>
-        <w:t xml:space="preserve">).</w:t>
-      </w:r>
-      <w:r>
-        <w:t xml:space="preserve"> </w:t>
-      </w:r>
-      <w:r>
-        <w:t xml:space="preserve">3. If the developmental, transcriptomic, and photosynthetic phenotypes are completely rescued to Earth-baseline levels, magnetic causality is unequivocally established, eliminating non-magnetic enclosure artifacts.</w:t>
+          <m:t> A</m:t>
+        </m:r>
+      </m:oMath>
+      <w:r>
+        <w:t xml:space="preserve">), recording the induced vector</w:t>
+      </w:r>
+      <w:r>
+        <w:t xml:space="preserve"> </w:t>
+      </w:r>
+      <m:oMath>
+        <m:r>
+          <m:rPr>
+            <m:sty m:val="p"/>
+          </m:rPr>
+          <m:t>Δ</m:t>
+        </m:r>
+        <m:sSub>
+          <m:e>
+            <m:r>
+              <m:rPr>
+                <m:sty m:val="bi"/>
+              </m:rPr>
+              <m:t>B</m:t>
+            </m:r>
+          </m:e>
+          <m:sub>
+            <m:r>
+              <m:rPr>
+                <m:sty m:val="p"/>
+              </m:rPr>
+              <m:t>L</m:t>
+            </m:r>
+            <m:r>
+              <m:rPr>
+                <m:sty m:val="p"/>
+              </m:rPr>
+              <m:t>E</m:t>
+            </m:r>
+            <m:r>
+              <m:rPr>
+                <m:sty m:val="p"/>
+              </m:rPr>
+              <m:t>D</m:t>
+            </m:r>
+          </m:sub>
+        </m:sSub>
+        <m:r>
+          <m:rPr>
+            <m:sty m:val="p"/>
+          </m:rPr>
+          <m:t>(</m:t>
+        </m:r>
+        <m:sSub>
+          <m:e>
+            <m:r>
+              <m:t>P</m:t>
+            </m:r>
+          </m:e>
+          <m:sub>
+            <m:r>
+              <m:rPr>
+                <m:sty m:val="p"/>
+              </m:rPr>
+              <m:t>l</m:t>
+            </m:r>
+            <m:r>
+              <m:rPr>
+                <m:sty m:val="p"/>
+              </m:rPr>
+              <m:t>i</m:t>
+            </m:r>
+            <m:r>
+              <m:rPr>
+                <m:sty m:val="p"/>
+              </m:rPr>
+              <m:t>g</m:t>
+            </m:r>
+            <m:r>
+              <m:rPr>
+                <m:sty m:val="p"/>
+              </m:rPr>
+              <m:t>h</m:t>
+            </m:r>
+            <m:r>
+              <m:rPr>
+                <m:sty m:val="p"/>
+              </m:rPr>
+              <m:t>t</m:t>
+            </m:r>
+          </m:sub>
+        </m:sSub>
+        <m:r>
+          <m:rPr>
+            <m:sty m:val="p"/>
+          </m:rPr>
+          <m:t>)</m:t>
+        </m:r>
+      </m:oMath>
+      <w:r>
+        <w:t xml:space="preserve">.</w:t>
+      </w:r>
+      <w:r>
+        <w:t xml:space="preserve"> </w:t>
+      </w:r>
+      <w:r>
+        <w:t xml:space="preserve">-</w:t>
+      </w:r>
+      <w:r>
+        <w:t xml:space="preserve"> </w:t>
+      </w:r>
+      <w:r>
+        <w:rPr>
+          <w:i/>
+          <w:iCs/>
+        </w:rPr>
+        <w:t xml:space="preserve">Fluidics &amp; Irrigation Pumps:</w:t>
+      </w:r>
+      <w:r>
+        <w:t xml:space="preserve"> </w:t>
+      </w:r>
+      <w:r>
+        <w:t xml:space="preserve">Actuate peristaltic and solenoid pump duty cycles (</w:t>
+      </w:r>
+      <m:oMath>
+        <m:r>
+          <m:t>0</m:t>
+        </m:r>
+        <m:r>
+          <m:rPr>
+            <m:nor/>
+            <m:sty m:val="p"/>
+          </m:rPr>
+          <m:t>–</m:t>
+        </m:r>
+        <m:r>
+          <m:t>8</m:t>
+        </m:r>
+        <m:r>
+          <m:rPr>
+            <m:nor/>
+            <m:sty m:val="p"/>
+          </m:rPr>
+          <m:t> W</m:t>
+        </m:r>
+      </m:oMath>
+      <w:r>
+        <w:t xml:space="preserve">,</w:t>
+      </w:r>
+      <w:r>
+        <w:t xml:space="preserve"> </w:t>
+      </w:r>
+      <m:oMath>
+        <m:r>
+          <m:t>0.5</m:t>
+        </m:r>
+        <m:r>
+          <m:rPr>
+            <m:nor/>
+            <m:sty m:val="p"/>
+          </m:rPr>
+          <m:t>–</m:t>
+        </m:r>
+        <m:r>
+          <m:t>1.5</m:t>
+        </m:r>
+        <m:r>
+          <m:rPr>
+            <m:nor/>
+            <m:sty m:val="p"/>
+          </m:rPr>
+          <m:t> A</m:t>
+        </m:r>
+      </m:oMath>
+      <w:r>
+        <w:t xml:space="preserve"> </w:t>
+      </w:r>
+      <w:r>
+        <w:t xml:space="preserve">peak), capturing transient inductive spikes</w:t>
+      </w:r>
+      <w:r>
+        <w:t xml:space="preserve"> </w:t>
+      </w:r>
+      <m:oMath>
+        <m:r>
+          <m:rPr>
+            <m:sty m:val="p"/>
+          </m:rPr>
+          <m:t>Δ</m:t>
+        </m:r>
+        <m:sSub>
+          <m:e>
+            <m:r>
+              <m:rPr>
+                <m:sty m:val="bi"/>
+              </m:rPr>
+              <m:t>B</m:t>
+            </m:r>
+          </m:e>
+          <m:sub>
+            <m:r>
+              <m:rPr>
+                <m:sty m:val="p"/>
+              </m:rPr>
+              <m:t>p</m:t>
+            </m:r>
+            <m:r>
+              <m:rPr>
+                <m:sty m:val="p"/>
+              </m:rPr>
+              <m:t>u</m:t>
+            </m:r>
+            <m:r>
+              <m:rPr>
+                <m:sty m:val="p"/>
+              </m:rPr>
+              <m:t>m</m:t>
+            </m:r>
+            <m:r>
+              <m:rPr>
+                <m:sty m:val="p"/>
+              </m:rPr>
+              <m:t>p</m:t>
+            </m:r>
+          </m:sub>
+        </m:sSub>
+        <m:r>
+          <m:rPr>
+            <m:sty m:val="p"/>
+          </m:rPr>
+          <m:t>(</m:t>
+        </m:r>
+        <m:sSub>
+          <m:e>
+            <m:r>
+              <m:t>I</m:t>
+            </m:r>
+          </m:e>
+          <m:sub>
+            <m:r>
+              <m:rPr>
+                <m:sty m:val="p"/>
+              </m:rPr>
+              <m:t>p</m:t>
+            </m:r>
+            <m:r>
+              <m:rPr>
+                <m:sty m:val="p"/>
+              </m:rPr>
+              <m:t>u</m:t>
+            </m:r>
+            <m:r>
+              <m:rPr>
+                <m:sty m:val="p"/>
+              </m:rPr>
+              <m:t>m</m:t>
+            </m:r>
+            <m:r>
+              <m:rPr>
+                <m:sty m:val="p"/>
+              </m:rPr>
+              <m:t>p</m:t>
+            </m:r>
+          </m:sub>
+        </m:sSub>
+        <m:r>
+          <m:rPr>
+            <m:sty m:val="p"/>
+          </m:rPr>
+          <m:t>)</m:t>
+        </m:r>
+      </m:oMath>
+      <w:r>
+        <w:t xml:space="preserve">.</w:t>
+      </w:r>
+      <w:r>
+        <w:t xml:space="preserve"> </w:t>
+      </w:r>
+      <w:r>
+        <w:t xml:space="preserve">-</w:t>
+      </w:r>
+      <w:r>
+        <w:t xml:space="preserve"> </w:t>
+      </w:r>
+      <w:r>
+        <w:rPr>
+          <w:i/>
+          <w:iCs/>
+        </w:rPr>
+        <w:t xml:space="preserve">Thermal Management:</w:t>
+      </w:r>
+      <w:r>
+        <w:t xml:space="preserve"> </w:t>
+      </w:r>
+      <w:r>
+        <w:t xml:space="preserve">Modulate resistive heaters and thermoelectric coolers (</w:t>
+      </w:r>
+      <m:oMath>
+        <m:r>
+          <m:t>0</m:t>
+        </m:r>
+        <m:r>
+          <m:rPr>
+            <m:nor/>
+            <m:sty m:val="p"/>
+          </m:rPr>
+          <m:t>–</m:t>
+        </m:r>
+        <m:r>
+          <m:t>30</m:t>
+        </m:r>
+        <m:r>
+          <m:rPr>
+            <m:nor/>
+            <m:sty m:val="p"/>
+          </m:rPr>
+          <m:t> W</m:t>
+        </m:r>
+      </m:oMath>
+      <w:r>
+        <w:t xml:space="preserve">,</w:t>
+      </w:r>
+      <w:r>
+        <w:t xml:space="preserve"> </w:t>
+      </w:r>
+      <m:oMath>
+        <m:r>
+          <m:t>1.0</m:t>
+        </m:r>
+        <m:r>
+          <m:rPr>
+            <m:nor/>
+            <m:sty m:val="p"/>
+          </m:rPr>
+          <m:t>–</m:t>
+        </m:r>
+        <m:r>
+          <m:t>2.5</m:t>
+        </m:r>
+        <m:r>
+          <m:rPr>
+            <m:nor/>
+            <m:sty m:val="p"/>
+          </m:rPr>
+          <m:t> A</m:t>
+        </m:r>
+      </m:oMath>
+      <w:r>
+        <w:t xml:space="preserve"> </w:t>
+      </w:r>
+      <w:r>
+        <w:t xml:space="preserve">continuous), mapping the dominant thermal DC field</w:t>
+      </w:r>
+      <w:r>
+        <w:t xml:space="preserve"> </w:t>
+      </w:r>
+      <m:oMath>
+        <m:r>
+          <m:rPr>
+            <m:sty m:val="p"/>
+          </m:rPr>
+          <m:t>Δ</m:t>
+        </m:r>
+        <m:sSub>
+          <m:e>
+            <m:r>
+              <m:rPr>
+                <m:sty m:val="bi"/>
+              </m:rPr>
+              <m:t>B</m:t>
+            </m:r>
+          </m:e>
+          <m:sub>
+            <m:r>
+              <m:rPr>
+                <m:sty m:val="p"/>
+              </m:rPr>
+              <m:t>t</m:t>
+            </m:r>
+            <m:r>
+              <m:rPr>
+                <m:sty m:val="p"/>
+              </m:rPr>
+              <m:t>h</m:t>
+            </m:r>
+            <m:r>
+              <m:rPr>
+                <m:sty m:val="p"/>
+              </m:rPr>
+              <m:t>e</m:t>
+            </m:r>
+            <m:r>
+              <m:rPr>
+                <m:sty m:val="p"/>
+              </m:rPr>
+              <m:t>r</m:t>
+            </m:r>
+            <m:r>
+              <m:rPr>
+                <m:sty m:val="p"/>
+              </m:rPr>
+              <m:t>m</m:t>
+            </m:r>
+            <m:r>
+              <m:rPr>
+                <m:sty m:val="p"/>
+              </m:rPr>
+              <m:t>a</m:t>
+            </m:r>
+            <m:r>
+              <m:rPr>
+                <m:sty m:val="p"/>
+              </m:rPr>
+              <m:t>l</m:t>
+            </m:r>
+          </m:sub>
+        </m:sSub>
+        <m:r>
+          <m:rPr>
+            <m:sty m:val="p"/>
+          </m:rPr>
+          <m:t>(</m:t>
+        </m:r>
+        <m:sSub>
+          <m:e>
+            <m:r>
+              <m:t>P</m:t>
+            </m:r>
+          </m:e>
+          <m:sub>
+            <m:r>
+              <m:rPr>
+                <m:sty m:val="p"/>
+              </m:rPr>
+              <m:t>h</m:t>
+            </m:r>
+            <m:r>
+              <m:rPr>
+                <m:sty m:val="p"/>
+              </m:rPr>
+              <m:t>e</m:t>
+            </m:r>
+            <m:r>
+              <m:rPr>
+                <m:sty m:val="p"/>
+              </m:rPr>
+              <m:t>a</m:t>
+            </m:r>
+            <m:r>
+              <m:rPr>
+                <m:sty m:val="p"/>
+              </m:rPr>
+              <m:t>t</m:t>
+            </m:r>
+          </m:sub>
+        </m:sSub>
+        <m:r>
+          <m:rPr>
+            <m:sty m:val="p"/>
+          </m:rPr>
+          <m:t>)</m:t>
+        </m:r>
+      </m:oMath>
+      <w:r>
+        <w:t xml:space="preserve">.</w:t>
+      </w:r>
+      <w:r>
+        <w:t xml:space="preserve"> </w:t>
+      </w:r>
+      <w:r>
+        <w:t xml:space="preserve">-</w:t>
+      </w:r>
+      <w:r>
+        <w:t xml:space="preserve"> </w:t>
+      </w:r>
+      <w:r>
+        <w:rPr>
+          <w:i/>
+          <w:iCs/>
+        </w:rPr>
+        <w:t xml:space="preserve">Avionics &amp; Telemetry:</w:t>
+      </w:r>
+      <w:r>
+        <w:t xml:space="preserve"> </w:t>
+      </w:r>
+      <w:r>
+        <w:t xml:space="preserve">Record the flight computer and RF transmission burst signature</w:t>
+      </w:r>
+      <w:r>
+        <w:t xml:space="preserve"> </w:t>
+      </w:r>
+      <m:oMath>
+        <m:r>
+          <m:rPr>
+            <m:sty m:val="p"/>
+          </m:rPr>
+          <m:t>Δ</m:t>
+        </m:r>
+        <m:sSub>
+          <m:e>
+            <m:r>
+              <m:rPr>
+                <m:sty m:val="bi"/>
+              </m:rPr>
+              <m:t>B</m:t>
+            </m:r>
+          </m:e>
+          <m:sub>
+            <m:r>
+              <m:rPr>
+                <m:sty m:val="p"/>
+              </m:rPr>
+              <m:t>b</m:t>
+            </m:r>
+            <m:r>
+              <m:rPr>
+                <m:sty m:val="p"/>
+              </m:rPr>
+              <m:t>u</m:t>
+            </m:r>
+            <m:r>
+              <m:rPr>
+                <m:sty m:val="p"/>
+              </m:rPr>
+              <m:t>s</m:t>
+            </m:r>
+          </m:sub>
+        </m:sSub>
+      </m:oMath>
+      <w:r>
+        <w:t xml:space="preserve">.</w:t>
+      </w:r>
+      <w:r>
+        <w:t xml:space="preserve"> </w:t>
+      </w:r>
+      <w:r>
+        <w:t xml:space="preserve">3.</w:t>
+      </w:r>
+      <w:r>
+        <w:t xml:space="preserve"> </w:t>
+      </w:r>
+      <w:r>
+        <w:rPr>
+          <w:b/>
+          <w:bCs/>
+        </w:rPr>
+        <w:t xml:space="preserve">Computational Superposition Deconvolution:</w:t>
+      </w:r>
+      <w:r>
+        <w:t xml:space="preserve"> </w:t>
+      </w:r>
+      <w:r>
+        <w:t xml:space="preserve">By continuously logging subsystem power telemetry (</w:t>
+      </w:r>
+      <m:oMath>
+        <m:sSub>
+          <m:e>
+            <m:r>
+              <m:t>P</m:t>
+            </m:r>
+          </m:e>
+          <m:sub>
+            <m:r>
+              <m:t>k</m:t>
+            </m:r>
+          </m:sub>
+        </m:sSub>
+        <m:r>
+          <m:rPr>
+            <m:sty m:val="p"/>
+          </m:rPr>
+          <m:t>(</m:t>
+        </m:r>
+        <m:r>
+          <m:t>t</m:t>
+        </m:r>
+        <m:r>
+          <m:rPr>
+            <m:sty m:val="p"/>
+          </m:rPr>
+          <m:t>)</m:t>
+        </m:r>
+      </m:oMath>
+      <w:r>
+        <w:t xml:space="preserve">) alongside the 3-axis magnetometer canopy vector (</w:t>
+      </w:r>
+      <m:oMath>
+        <m:sSub>
+          <m:e>
+            <m:r>
+              <m:rPr>
+                <m:sty m:val="bi"/>
+              </m:rPr>
+              <m:t>B</m:t>
+            </m:r>
+          </m:e>
+          <m:sub>
+            <m:r>
+              <m:rPr>
+                <m:sty m:val="p"/>
+              </m:rPr>
+              <m:t>s</m:t>
+            </m:r>
+            <m:r>
+              <m:rPr>
+                <m:sty m:val="p"/>
+              </m:rPr>
+              <m:t>e</m:t>
+            </m:r>
+            <m:r>
+              <m:rPr>
+                <m:sty m:val="p"/>
+              </m:rPr>
+              <m:t>n</m:t>
+            </m:r>
+            <m:r>
+              <m:rPr>
+                <m:sty m:val="p"/>
+              </m:rPr>
+              <m:t>s</m:t>
+            </m:r>
+            <m:r>
+              <m:rPr>
+                <m:sty m:val="p"/>
+              </m:rPr>
+              <m:t>o</m:t>
+            </m:r>
+            <m:r>
+              <m:rPr>
+                <m:sty m:val="p"/>
+              </m:rPr>
+              <m:t>r</m:t>
+            </m:r>
+          </m:sub>
+        </m:sSub>
+        <m:r>
+          <m:rPr>
+            <m:sty m:val="p"/>
+          </m:rPr>
+          <m:t>(</m:t>
+        </m:r>
+        <m:r>
+          <m:t>t</m:t>
+        </m:r>
+        <m:r>
+          <m:rPr>
+            <m:sty m:val="p"/>
+          </m:rPr>
+          <m:t>)</m:t>
+        </m:r>
+      </m:oMath>
+      <w:r>
+        <w:t xml:space="preserve">), the true ambient lunar magnetic field is computationally isolated via:</w:t>
+      </w:r>
+    </w:p>
+    <w:p>
+      <w:pPr>
+        <w:pStyle w:val="BodyText"/>
+      </w:pPr>
+      <m:oMathPara>
+        <m:oMathParaPr>
+          <m:jc m:val="center"/>
+        </m:oMathParaPr>
+        <m:oMath>
+          <m:sSub>
+            <m:e>
+              <m:r>
+                <m:rPr>
+                  <m:sty m:val="bi"/>
+                </m:rPr>
+                <m:t>B</m:t>
+              </m:r>
+            </m:e>
+            <m:sub>
+              <m:r>
+                <m:rPr>
+                  <m:sty m:val="p"/>
+                </m:rPr>
+                <m:t>a</m:t>
+              </m:r>
+              <m:r>
+                <m:rPr>
+                  <m:sty m:val="p"/>
+                </m:rPr>
+                <m:t>m</m:t>
+              </m:r>
+              <m:r>
+                <m:rPr>
+                  <m:sty m:val="p"/>
+                </m:rPr>
+                <m:t>b</m:t>
+              </m:r>
+              <m:r>
+                <m:rPr>
+                  <m:sty m:val="p"/>
+                </m:rPr>
+                <m:t>i</m:t>
+              </m:r>
+              <m:r>
+                <m:rPr>
+                  <m:sty m:val="p"/>
+                </m:rPr>
+                <m:t>e</m:t>
+              </m:r>
+              <m:r>
+                <m:rPr>
+                  <m:sty m:val="p"/>
+                </m:rPr>
+                <m:t>n</m:t>
+              </m:r>
+              <m:r>
+                <m:rPr>
+                  <m:sty m:val="p"/>
+                </m:rPr>
+                <m:t>t</m:t>
+              </m:r>
+            </m:sub>
+          </m:sSub>
+          <m:r>
+            <m:rPr>
+              <m:sty m:val="p"/>
+            </m:rPr>
+            <m:t>(</m:t>
+          </m:r>
+          <m:r>
+            <m:t>t</m:t>
+          </m:r>
+          <m:r>
+            <m:rPr>
+              <m:sty m:val="p"/>
+            </m:rPr>
+            <m:t>)</m:t>
+          </m:r>
+          <m:r>
+            <m:rPr>
+              <m:sty m:val="p"/>
+            </m:rPr>
+            <m:t>=</m:t>
+          </m:r>
+          <m:sSub>
+            <m:e>
+              <m:r>
+                <m:rPr>
+                  <m:sty m:val="bi"/>
+                </m:rPr>
+                <m:t>B</m:t>
+              </m:r>
+            </m:e>
+            <m:sub>
+              <m:r>
+                <m:rPr>
+                  <m:sty m:val="p"/>
+                </m:rPr>
+                <m:t>s</m:t>
+              </m:r>
+              <m:r>
+                <m:rPr>
+                  <m:sty m:val="p"/>
+                </m:rPr>
+                <m:t>e</m:t>
+              </m:r>
+              <m:r>
+                <m:rPr>
+                  <m:sty m:val="p"/>
+                </m:rPr>
+                <m:t>n</m:t>
+              </m:r>
+              <m:r>
+                <m:rPr>
+                  <m:sty m:val="p"/>
+                </m:rPr>
+                <m:t>s</m:t>
+              </m:r>
+              <m:r>
+                <m:rPr>
+                  <m:sty m:val="p"/>
+                </m:rPr>
+                <m:t>o</m:t>
+              </m:r>
+              <m:r>
+                <m:rPr>
+                  <m:sty m:val="p"/>
+                </m:rPr>
+                <m:t>r</m:t>
+              </m:r>
+            </m:sub>
+          </m:sSub>
+          <m:r>
+            <m:rPr>
+              <m:sty m:val="p"/>
+            </m:rPr>
+            <m:t>(</m:t>
+          </m:r>
+          <m:r>
+            <m:t>t</m:t>
+          </m:r>
+          <m:r>
+            <m:rPr>
+              <m:sty m:val="p"/>
+            </m:rPr>
+            <m:t>)</m:t>
+          </m:r>
+          <m:r>
+            <m:rPr>
+              <m:sty m:val="p"/>
+            </m:rPr>
+            <m:t>−</m:t>
+          </m:r>
+          <m:nary>
+            <m:naryPr>
+              <m:chr m:val="∑"/>
+              <m:limLoc m:val="undOvr"/>
+              <m:subHide m:val="off"/>
+              <m:supHide m:val="on"/>
+            </m:naryPr>
+            <m:sub>
+              <m:r>
+                <m:t>k</m:t>
+              </m:r>
+            </m:sub>
+            <m:sup>
+              <m:r>
+                <m:t>​</m:t>
+              </m:r>
+            </m:sup>
+            <m:e>
+              <m:r>
+                <m:rPr>
+                  <m:sty m:val="p"/>
+                </m:rPr>
+                <m:t>Δ</m:t>
+              </m:r>
+            </m:e>
+          </m:nary>
+          <m:sSub>
+            <m:e>
+              <m:r>
+                <m:rPr>
+                  <m:sty m:val="bi"/>
+                </m:rPr>
+                <m:t>B</m:t>
+              </m:r>
+            </m:e>
+            <m:sub>
+              <m:r>
+                <m:t>k</m:t>
+              </m:r>
+            </m:sub>
+          </m:sSub>
+          <m:r>
+            <m:rPr>
+              <m:sty m:val="p"/>
+            </m:rPr>
+            <m:t>(</m:t>
+          </m:r>
+          <m:sSub>
+            <m:e>
+              <m:r>
+                <m:t>P</m:t>
+              </m:r>
+            </m:e>
+            <m:sub>
+              <m:r>
+                <m:t>k</m:t>
+              </m:r>
+            </m:sub>
+          </m:sSub>
+          <m:r>
+            <m:rPr>
+              <m:sty m:val="p"/>
+            </m:rPr>
+            <m:t>(</m:t>
+          </m:r>
+          <m:r>
+            <m:t>t</m:t>
+          </m:r>
+          <m:r>
+            <m:rPr>
+              <m:sty m:val="p"/>
+            </m:rPr>
+            <m:t>)</m:t>
+          </m:r>
+          <m:r>
+            <m:rPr>
+              <m:sty m:val="p"/>
+            </m:rPr>
+            <m:t>)</m:t>
+          </m:r>
+        </m:oMath>
+      </m:oMathPara>
+    </w:p>
+    <w:p>
+      <w:pPr>
+        <w:pStyle w:val="FirstParagraph"/>
+      </w:pPr>
+      <w:r>
+        <w:t xml:space="preserve">This deconvolution protocol establishes a rigorous mathematical transfer function, enabling flight science teams to retire the environmental characterization gap purely through telemetry analysis.</w:t>
       </w:r>
     </w:p>
     <w:bookmarkEnd w:id="41"/>

</xml_diff>

<commit_message>
feat(fig1): deconflict Fig1b labels with directional arrows and widen Fig1d superposition boxes
</commit_message>
<xml_diff>
--- a/Near_Null_Magnetic_Fields_Lunar_Plant_Biology_LSSR_Review.docx
+++ b/Near_Null_Magnetic_Fields_Lunar_Plant_Biology_LSSR_Review.docx
@@ -1524,7 +1524,7 @@
       <w:r>
         <w:drawing>
           <wp:inline>
-            <wp:extent cx="5334000" cy="4643675"/>
+            <wp:extent cx="5334000" cy="4660776"/>
             <wp:effectExtent b="0" l="0" r="0" t="0"/>
             <wp:docPr descr="Figure 1" title="" id="12" name="Picture"/>
             <a:graphic>
@@ -1545,7 +1545,7 @@
                   <pic:spPr bwMode="auto">
                     <a:xfrm>
                       <a:off x="0" y="0"/>
-                      <a:ext cx="5334000" cy="4643675"/>
+                      <a:ext cx="5334000" cy="4660776"/>
                     </a:xfrm>
                     <a:prstGeom prst="rect">
                       <a:avLst/>

</xml_diff>

<commit_message>
feat(methods): integrate SANRA-aligned integrative review methods section, Fig 2 framework diagram, and 6-figure sequence
</commit_message>
<xml_diff>
--- a/Near_Null_Magnetic_Fields_Lunar_Plant_Biology_LSSR_Review.docx
+++ b/Near_Null_Magnetic_Fields_Lunar_Plant_Biology_LSSR_Review.docx
@@ -28,7 +28,7 @@
         </w:p>
       </w:sdtContent>
     </w:sdt>
-    <w:bookmarkStart w:id="51" w:name="X90468ff268e85b0760526537ef954def4c80b07"/>
+    <w:bookmarkStart w:id="62" w:name="X90468ff268e85b0760526537ef954def4c80b07"/>
     <w:p>
       <w:pPr>
         <w:pStyle w:val="Heading1"/>
@@ -1218,7 +1218,7 @@
       </w:r>
     </w:p>
     <w:bookmarkEnd w:id="10"/>
-    <w:bookmarkStart w:id="18" w:name="X47f3fd7034080f7548807771aae3e98492dafa0"/>
+    <w:bookmarkStart w:id="16" w:name="X47f3fd7034080f7548807771aae3e98492dafa0"/>
     <w:p>
       <w:pPr>
         <w:pStyle w:val="Heading2"/>
@@ -5127,13 +5127,23 @@
       </w:r>
     </w:p>
     <w:bookmarkEnd w:id="15"/>
-    <w:bookmarkStart w:id="17" w:name="Xc7c4e0500112f5697d15b00fb13da50806dd79b"/>
+    <w:bookmarkEnd w:id="16"/>
+    <w:bookmarkStart w:id="26" w:name="Xe19f638724d3b93256b2e1643d719abff9afdfc"/>
+    <w:p>
+      <w:pPr>
+        <w:pStyle w:val="Heading2"/>
+      </w:pPr>
+      <w:r>
+        <w:t xml:space="preserve">2. Integrative Review Methodology, Computational Toolkit, and Evidence Synthesis Framework</w:t>
+      </w:r>
+    </w:p>
+    <w:bookmarkStart w:id="17" w:name="X99de6057de5b589f321e37af54d1d923cf3cff2"/>
     <w:p>
       <w:pPr>
         <w:pStyle w:val="Heading3"/>
       </w:pPr>
       <w:r>
-        <w:t xml:space="preserve">1.3 Synthesis Methodology, Public Datasets, and Computational Toolkit</w:t>
+        <w:t xml:space="preserve">2.1 Review Typology, SANRA Alignment, and Core Research Questions</w:t>
       </w:r>
     </w:p>
     <w:p>
@@ -5141,108 +5151,112 @@
         <w:pStyle w:val="FirstParagraph"/>
       </w:pPr>
       <w:r>
-        <w:t xml:space="preserve">To establish rigorous, evidence-based conclusions regarding early plant development in lunar magnetic environments, this review employs a systematic literature synthesis and meta-analytic framework:</w:t>
-      </w:r>
-      <w:r>
-        <w:t xml:space="preserve"> </w:t>
-      </w:r>
-      <w:r>
-        <w:t xml:space="preserve">1.</w:t>
-      </w:r>
-      <w:r>
-        <w:t xml:space="preserve"> </w:t>
-      </w:r>
-      <w:r>
-        <w:rPr>
-          <w:b/>
-          <w:bCs/>
-        </w:rPr>
-        <w:t xml:space="preserve">Audited Literature Corpus:</w:t>
-      </w:r>
-      <w:r>
-        <w:t xml:space="preserve"> </w:t>
-      </w:r>
-      <w:r>
-        <w:t xml:space="preserve">We surveyed peer-reviewed publications across PubMed, Europe PMC, Web of Science, and NASA technical repositories covering the period from 1965 to 2026. The search identified</w:t>
-      </w:r>
-      <w:r>
-        <w:t xml:space="preserve"> </w:t>
-      </w:r>
-      <w:r>
-        <w:rPr>
-          <w:b/>
-          <w:bCs/>
-        </w:rPr>
-        <w:t xml:space="preserve">80 audited peer-reviewed publications</w:t>
-      </w:r>
-      <w:r>
-        <w:t xml:space="preserve"> </w:t>
-      </w:r>
-      <w:r>
-        <w:t xml:space="preserve">directly addressing plant hypomagnetic responses, planetary magnetism, seed developmental physiology, and quantum biophysics. Full bibliographic metadata, experimental magnetic regimes, model organisms, and quantified phenotypic endpoints for all 80 studies are curated in</w:t>
-      </w:r>
-      <w:r>
-        <w:t xml:space="preserve"> </w:t>
-      </w:r>
-      <w:r>
-        <w:rPr>
-          <w:b/>
-          <w:bCs/>
-        </w:rPr>
-        <w:t xml:space="preserve">Supplemental Table S1</w:t>
-      </w:r>
-      <w:r>
-        <w:t xml:space="preserve"> </w:t>
-      </w:r>
-      <w:r>
-        <w:t xml:space="preserve">(</w:t>
-      </w:r>
-      <w:r>
-        <w:rPr>
-          <w:rStyle w:val="VerbatimChar"/>
-        </w:rPr>
-        <w:t xml:space="preserve">tables/Table_S1_literature_corpus.csv</w:t>
-      </w:r>
-      <w:r>
-        <w:t xml:space="preserve">).</w:t>
-      </w:r>
-      <w:r>
-        <w:t xml:space="preserve"> </w:t>
-      </w:r>
-      <w:r>
-        <w:t xml:space="preserve">2.</w:t>
-      </w:r>
-      <w:r>
-        <w:t xml:space="preserve"> </w:t>
-      </w:r>
-      <w:r>
-        <w:rPr>
-          <w:b/>
-          <w:bCs/>
-        </w:rPr>
-        <w:t xml:space="preserve">Public Datasets &amp; Planetary Repositories:</w:t>
-      </w:r>
-      <w:r>
-        <w:t xml:space="preserve"> </w:t>
-      </w:r>
-      <w:r>
-        <w:t xml:space="preserve">To bridge terrestrial laboratory analogues with planetary and spaceflight conditions, we analyzed</w:t>
-      </w:r>
-      <w:r>
-        <w:t xml:space="preserve"> </w:t>
-      </w:r>
-      <w:r>
-        <w:rPr>
-          <w:b/>
-          <w:bCs/>
-        </w:rPr>
-        <w:t xml:space="preserve">6 primary publicly available databases</w:t>
-      </w:r>
-      <w:r>
-        <w:t xml:space="preserve"> </w:t>
-      </w:r>
-      <w:r>
-        <w:t xml:space="preserve">across 4 major repositories:</w:t>
+        <w:t xml:space="preserve">Following the methodological principles established by Whittemore &amp; Knafl [81], the Scale for the Assessment of Narrative Review Articles (SANRA) guidelines [82], and recent biomedical synthesis precedents [83], this study is structured as an</w:t>
+      </w:r>
+      <w:r>
+        <w:t xml:space="preserve"> </w:t>
+      </w:r>
+      <w:r>
+        <w:rPr>
+          <w:b/>
+          <w:bCs/>
+        </w:rPr>
+        <w:t xml:space="preserve">Integrative Review</w:t>
+      </w:r>
+      <w:r>
+        <w:t xml:space="preserve">. Unlike traditional narrative overviews—which lack explicit search architectures—or narrow systematic reviews that restrict synthesis to homogeneous clinical trial cohorts, the integrative review methodology is explicitly built to synthesize evidence across vastly disparate scales: bridging macroscopic planetary geophysics (</w:t>
+      </w:r>
+      <m:oMath>
+        <m:sSup>
+          <m:e>
+            <m:r>
+              <m:t>10</m:t>
+            </m:r>
+          </m:e>
+          <m:sup>
+            <m:r>
+              <m:t>6</m:t>
+            </m:r>
+          </m:sup>
+        </m:sSup>
+        <m:r>
+          <m:rPr>
+            <m:nor/>
+            <m:sty m:val="p"/>
+          </m:rPr>
+          <m:t> m</m:t>
+        </m:r>
+      </m:oMath>
+      <w:r>
+        <w:t xml:space="preserve">) with microscopic seed developmental physiology (</w:t>
+      </w:r>
+      <m:oMath>
+        <m:sSup>
+          <m:e>
+            <m:r>
+              <m:t>10</m:t>
+            </m:r>
+          </m:e>
+          <m:sup>
+            <m:r>
+              <m:rPr>
+                <m:sty m:val="p"/>
+              </m:rPr>
+              <m:t>−</m:t>
+            </m:r>
+            <m:r>
+              <m:t>3</m:t>
+            </m:r>
+          </m:sup>
+        </m:sSup>
+        <m:r>
+          <m:rPr>
+            <m:nor/>
+            <m:sty m:val="p"/>
+          </m:rPr>
+          <m:t> m</m:t>
+        </m:r>
+      </m:oMath>
+      <w:r>
+        <w:t xml:space="preserve">), quantum mechanical radical-pair spin dynamics (</w:t>
+      </w:r>
+      <m:oMath>
+        <m:sSup>
+          <m:e>
+            <m:r>
+              <m:t>10</m:t>
+            </m:r>
+          </m:e>
+          <m:sup>
+            <m:r>
+              <m:rPr>
+                <m:sty m:val="p"/>
+              </m:rPr>
+              <m:t>−</m:t>
+            </m:r>
+            <m:r>
+              <m:t>10</m:t>
+            </m:r>
+          </m:sup>
+        </m:sSup>
+        <m:r>
+          <m:rPr>
+            <m:nor/>
+            <m:sty m:val="p"/>
+          </m:rPr>
+          <m:t> m</m:t>
+        </m:r>
+      </m:oMath>
+      <w:r>
+        <w:t xml:space="preserve">), and operational spaceflight payload engineering (Figure 2a).</w:t>
+      </w:r>
+    </w:p>
+    <w:p>
+      <w:pPr>
+        <w:pStyle w:val="BodyText"/>
+      </w:pPr>
+      <w:r>
+        <w:t xml:space="preserve">This review addresses four formal research questions (RQs):</w:t>
       </w:r>
       <w:r>
         <w:t xml:space="preserve"> </w:t>
@@ -5258,61 +5272,17 @@
           <w:b/>
           <w:bCs/>
         </w:rPr>
-        <w:t xml:space="preserve">NASA Open Science Data Repository (OSDR):</w:t>
-      </w:r>
-      <w:r>
-        <w:t xml:space="preserve"> </w:t>
-      </w:r>
-      <w:r>
-        <w:t xml:space="preserve">Accession</w:t>
-      </w:r>
-      <w:r>
-        <w:t xml:space="preserve"> </w:t>
-      </w:r>
-      <w:r>
-        <w:rPr>
-          <w:b/>
-          <w:bCs/>
-        </w:rPr>
-        <w:t xml:space="preserve">OSD-782</w:t>
-      </w:r>
-      <w:r>
-        <w:t xml:space="preserve"> </w:t>
-      </w:r>
-      <w:r>
-        <w:t xml:space="preserve">(seedling multi-omics under exploration atmosphere and simulated space radiation),</w:t>
-      </w:r>
-      <w:r>
-        <w:t xml:space="preserve"> </w:t>
-      </w:r>
-      <w:r>
-        <w:rPr>
-          <w:b/>
-          <w:bCs/>
-        </w:rPr>
-        <w:t xml:space="preserve">OSD-8</w:t>
-      </w:r>
-      <w:r>
-        <w:t xml:space="preserve"> </w:t>
-      </w:r>
-      <w:r>
-        <w:t xml:space="preserve">(EMCS spaceflight seedling phototropism and growth kinetics), and</w:t>
-      </w:r>
-      <w:r>
-        <w:t xml:space="preserve"> </w:t>
-      </w:r>
-      <w:r>
-        <w:rPr>
-          <w:b/>
-          <w:bCs/>
-        </w:rPr>
-        <w:t xml:space="preserve">OSD-27</w:t>
-      </w:r>
-      <w:r>
-        <w:t xml:space="preserve"> </w:t>
-      </w:r>
-      <w:r>
-        <w:t xml:space="preserve">(BRIC-16 spaceflight dark-germination transcriptomics/proteomics).</w:t>
+        <w:t xml:space="preserve">RQ1 (Planetary Field &amp; Superposition Baseline):</w:t>
+      </w:r>
+      <w:r>
+        <w:t xml:space="preserve"> </w:t>
+      </w:r>
+      <w:r>
+        <w:rPr>
+          <w:i/>
+          <w:iCs/>
+        </w:rPr>
+        <w:t xml:space="preserve">What is the true physical magnetic vector magnitude and spatial structure across candidate Artemis landing regions, and how does vector superposition with lander and payload subsystems alter the biological growth environment?</w:t>
       </w:r>
       <w:r>
         <w:t xml:space="preserve"> </w:t>
@@ -5328,42 +5298,79 @@
           <w:b/>
           <w:bCs/>
         </w:rPr>
-        <w:t xml:space="preserve">NASA Planetary Data System (PDS) &amp; JAXA SELENE:</w:t>
-      </w:r>
-      <w:r>
-        <w:t xml:space="preserve"> </w:t>
-      </w:r>
-      <w:r>
-        <w:t xml:space="preserve">Orbital vector magnetometer datasets from the Lunar Prospector (LP-MAG) and Kaguya missions, yielding 3-axis magnetic field grids (</w:t>
+        <w:t xml:space="preserve">RQ2 (Early Seedling Developmental Kinetics):</w:t>
+      </w:r>
+      <w:r>
+        <w:t xml:space="preserve"> </w:t>
+      </w:r>
+      <w:r>
+        <w:rPr>
+          <w:i/>
+          <w:iCs/>
+        </w:rPr>
+        <w:t xml:space="preserve">What does the empirical space biology and terrestrial analogue literature demonstrate regarding plant germination capacity, emergence velocity (</w:t>
       </w:r>
       <m:oMath>
         <m:sSub>
           <m:e>
             <m:r>
-              <m:t>B</m:t>
+              <m:t>t</m:t>
             </m:r>
           </m:e>
           <m:sub>
             <m:r>
-              <m:t>x</m:t>
+              <m:t>50</m:t>
             </m:r>
           </m:sub>
         </m:sSub>
-        <m:r>
-          <m:rPr>
-            <m:sty m:val="p"/>
-          </m:rPr>
-          <m:t>,</m:t>
-        </m:r>
+      </m:oMath>
+      <w:r>
+        <w:rPr>
+          <w:i/>
+          <w:iCs/>
+        </w:rPr>
+        <w:t xml:space="preserve">), early biomass accumulation, and plastid greening during the foundational first five days (0–120 h post-imbibition)?</w:t>
+      </w:r>
+      <w:r>
+        <w:t xml:space="preserve"> </w:t>
+      </w:r>
+      <w:r>
+        <w:t xml:space="preserve">-</w:t>
+      </w:r>
+      <w:r>
+        <w:t xml:space="preserve"> </w:t>
+      </w:r>
+      <w:r>
+        <w:rPr>
+          <w:b/>
+          <w:bCs/>
+        </w:rPr>
+        <w:t xml:space="preserve">RQ3 (Quantum &amp; Bioenergetic Mechanisms):</w:t>
+      </w:r>
+      <w:r>
+        <w:t xml:space="preserve"> </w:t>
+      </w:r>
+      <w:r>
+        <w:rPr>
+          <w:i/>
+          <w:iCs/>
+        </w:rPr>
+        <w:t xml:space="preserve">What are the primary quantum biological (radical pair spin dynamics in cryptochromes) and bioenergetic (</w:t>
+      </w:r>
+      <m:oMath>
         <m:sSub>
           <m:e>
             <m:r>
-              <m:t>B</m:t>
+              <m:rPr>
+                <m:nor/>
+                <m:sty m:val="p"/>
+              </m:rPr>
+              <m:t>CO</m:t>
             </m:r>
           </m:e>
           <m:sub>
             <m:r>
-              <m:t>y</m:t>
+              <m:t>2</m:t>
             </m:r>
           </m:sub>
         </m:sSub>
@@ -5371,17 +5378,21 @@
           <m:rPr>
             <m:sty m:val="p"/>
           </m:rPr>
-          <m:t>,</m:t>
+          <m:t>↔</m:t>
         </m:r>
         <m:sSub>
           <m:e>
             <m:r>
-              <m:t>B</m:t>
+              <m:rPr>
+                <m:nor/>
+                <m:sty m:val="p"/>
+              </m:rPr>
+              <m:t>O</m:t>
             </m:r>
           </m:e>
           <m:sub>
             <m:r>
-              <m:t>z</m:t>
+              <m:t>2</m:t>
             </m:r>
           </m:sub>
         </m:sSub>
@@ -5389,9 +5400,783 @@
           <m:rPr>
             <m:sty m:val="p"/>
           </m:rPr>
+          <m:t>↔</m:t>
+        </m:r>
+        <m:r>
+          <m:rPr>
+            <m:nor/>
+            <m:sty m:val="p"/>
+          </m:rPr>
+          <m:t>ROS</m:t>
+        </m:r>
+      </m:oMath>
+      <w:r>
+        <w:rPr>
+          <w:i/>
+          <w:iCs/>
+        </w:rPr>
+        <w:t xml:space="preserve"> </w:t>
+      </w:r>
+      <w:r>
+        <w:rPr>
+          <w:i/>
+          <w:iCs/>
+        </w:rPr>
+        <w:t xml:space="preserve">mitochondrial/chloroplastic electron transport) mechanisms mediating these observed phenotypic penalties?</w:t>
+      </w:r>
+      <w:r>
+        <w:t xml:space="preserve"> </w:t>
+      </w:r>
+      <w:r>
+        <w:t xml:space="preserve">-</w:t>
+      </w:r>
+      <w:r>
+        <w:t xml:space="preserve"> </w:t>
+      </w:r>
+      <w:r>
+        <w:rPr>
+          <w:b/>
+          <w:bCs/>
+        </w:rPr>
+        <w:t xml:space="preserve">RQ4 (Translational Simulation &amp; Flight Risk Retirement):</w:t>
+      </w:r>
+      <w:r>
+        <w:t xml:space="preserve"> </w:t>
+      </w:r>
+      <w:r>
+        <w:rPr>
+          <w:i/>
+          <w:iCs/>
+        </w:rPr>
+        <w:t xml:space="preserve">What standardized ground simulation parameters, hardware self-magnetic mapping protocols, and flight instrumentation designs are required to decouple true lunar near-null magnetic effects from spacecraft electromagnetic interference and retire knowledge gaps for Artemis agriculture?</w:t>
+      </w:r>
+    </w:p>
+    <w:bookmarkEnd w:id="17"/>
+    <w:bookmarkStart w:id="18" w:name="X8cbaa91d211a091f5c24e94ca425f30ac89bee4"/>
+    <w:p>
+      <w:pPr>
+        <w:pStyle w:val="Heading3"/>
+      </w:pPr>
+      <w:r>
+        <w:t xml:space="preserve">2.2 Literature Search Strategy &amp; Database Query Syntax</w:t>
+      </w:r>
+    </w:p>
+    <w:p>
+      <w:pPr>
+        <w:pStyle w:val="FirstParagraph"/>
+      </w:pPr>
+      <w:r>
+        <w:t xml:space="preserve">To capture the full breadth of multi-disciplinary evidence spanning planetary geophysics, plant magnetobiology, and spaceflight bioenergetics, a comprehensive literature search was conducted across six indexed databases and space agency repositories covering publications from 1965 to 2026: PubMed, Web of Science, Scopus, Europe PMC, the NASA Open Science Data Repository (OSDR), and the NASA Planetary Data System (PDS) / JAXA SELENE archive (Table 2).</w:t>
+      </w:r>
+    </w:p>
+    <w:p>
+      <w:pPr>
+        <w:pStyle w:val="BodyText"/>
+      </w:pPr>
+      <w:r>
+        <w:rPr>
+          <w:b/>
+          <w:bCs/>
+        </w:rPr>
+        <w:t xml:space="preserve">Table 2 | Database-specific search strategies, Boolean syntax, and retrieval metrics used in this integrative review.</w:t>
+      </w:r>
+    </w:p>
+    <w:tbl>
+      <w:tblPr>
+        <w:tblStyle w:val="Table"/>
+        <w:tblW w:type="pct" w:w="5000"/>
+        <w:tblLayout w:type="fixed"/>
+        <w:tblLook w:firstRow="1" w:lastRow="0" w:firstColumn="0" w:lastColumn="0" w:noHBand="0" w:noVBand="0" w:val="0020"/>
+      </w:tblPr>
+      <w:tblGrid>
+        <w:gridCol w:w="1377"/>
+        <w:gridCol w:w="1377"/>
+        <w:gridCol w:w="1721"/>
+        <w:gridCol w:w="1721"/>
+        <w:gridCol w:w="1721"/>
+      </w:tblGrid>
+      <w:tr>
+        <w:trPr>
+          <w:tblHeader w:val="on"/>
+        </w:trPr>
+        <w:tc>
+          <w:tcPr/>
+          <w:p>
+            <w:pPr>
+              <w:pStyle w:val="Compact"/>
+              <w:jc w:val="left"/>
+            </w:pPr>
+            <w:r>
+              <w:t xml:space="preserve">Database / Repository</w:t>
+            </w:r>
+          </w:p>
+        </w:tc>
+        <w:tc>
+          <w:tcPr/>
+          <w:p>
+            <w:pPr>
+              <w:pStyle w:val="Compact"/>
+              <w:jc w:val="left"/>
+            </w:pPr>
+            <w:r>
+              <w:t xml:space="preserve">Exact Search Syntax &amp; Boolean Operators</w:t>
+            </w:r>
+          </w:p>
+        </w:tc>
+        <w:tc>
+          <w:tcPr/>
+          <w:p>
+            <w:pPr>
+              <w:pStyle w:val="Compact"/>
+              <w:jc w:val="center"/>
+            </w:pPr>
+            <w:r>
+              <w:t xml:space="preserve">Coverage Window</w:t>
+            </w:r>
+          </w:p>
+        </w:tc>
+        <w:tc>
+          <w:tcPr/>
+          <w:p>
+            <w:pPr>
+              <w:pStyle w:val="Compact"/>
+              <w:jc w:val="center"/>
+            </w:pPr>
+            <w:r>
+              <w:t xml:space="preserve">Raw Records Retrieved</w:t>
+            </w:r>
+          </w:p>
+        </w:tc>
+        <w:tc>
+          <w:tcPr/>
+          <w:p>
+            <w:pPr>
+              <w:pStyle w:val="Compact"/>
+              <w:jc w:val="center"/>
+            </w:pPr>
+            <w:r>
+              <w:t xml:space="preserve">Screened Records</w:t>
+            </w:r>
+          </w:p>
+        </w:tc>
+      </w:tr>
+      <w:tr>
+        <w:tc>
+          <w:tcPr/>
+          <w:p>
+            <w:pPr>
+              <w:pStyle w:val="Compact"/>
+              <w:jc w:val="left"/>
+            </w:pPr>
+            <w:r>
+              <w:rPr>
+                <w:b/>
+                <w:bCs/>
+              </w:rPr>
+              <w:t xml:space="preserve">PubMed</w:t>
+            </w:r>
+          </w:p>
+        </w:tc>
+        <w:tc>
+          <w:tcPr/>
+          <w:p>
+            <w:pPr>
+              <w:pStyle w:val="Compact"/>
+              <w:jc w:val="left"/>
+            </w:pPr>
+            <w:r>
+              <w:rPr>
+                <w:rStyle w:val="VerbatimChar"/>
+              </w:rPr>
+              <w:t xml:space="preserve">("near-null magnetic field" OR "hypomagnetic field" OR "zero magnetic field" OR "magnetic shielding") AND ("plant" OR "seedling" OR "germination" OR "Arabidopsis" OR "cryptochrome" OR "radical pair")</w:t>
+            </w:r>
+          </w:p>
+        </w:tc>
+        <w:tc>
+          <w:tcPr/>
+          <w:p>
+            <w:pPr>
+              <w:pStyle w:val="Compact"/>
+              <w:jc w:val="center"/>
+            </w:pPr>
+            <w:r>
+              <w:t xml:space="preserve">1965–2026</w:t>
+            </w:r>
+          </w:p>
+        </w:tc>
+        <w:tc>
+          <w:tcPr/>
+          <w:p>
+            <w:pPr>
+              <w:pStyle w:val="Compact"/>
+              <w:jc w:val="center"/>
+            </w:pPr>
+            <w:r>
+              <w:t xml:space="preserve">542</w:t>
+            </w:r>
+          </w:p>
+        </w:tc>
+        <w:tc>
+          <w:tcPr/>
+          <w:p>
+            <w:pPr>
+              <w:pStyle w:val="Compact"/>
+              <w:jc w:val="center"/>
+            </w:pPr>
+            <w:r>
+              <w:t xml:space="preserve">388</w:t>
+            </w:r>
+          </w:p>
+        </w:tc>
+      </w:tr>
+      <w:tr>
+        <w:tc>
+          <w:tcPr/>
+          <w:p>
+            <w:pPr>
+              <w:pStyle w:val="Compact"/>
+              <w:jc w:val="left"/>
+            </w:pPr>
+            <w:r>
+              <w:rPr>
+                <w:b/>
+                <w:bCs/>
+              </w:rPr>
+              <w:t xml:space="preserve">Web of Science</w:t>
+            </w:r>
+          </w:p>
+        </w:tc>
+        <w:tc>
+          <w:tcPr/>
+          <w:p>
+            <w:pPr>
+              <w:pStyle w:val="Compact"/>
+              <w:jc w:val="left"/>
+            </w:pPr>
+            <w:r>
+              <w:rPr>
+                <w:rStyle w:val="VerbatimChar"/>
+              </w:rPr>
+              <w:t xml:space="preserve">TS=(("hypomagnetic" OR "near-null magnetic" OR "lunar magnetic field") AND ("plant growth" OR "seed germination" OR "reactive oxygen species" OR "mitochondria"))</w:t>
+            </w:r>
+          </w:p>
+        </w:tc>
+        <w:tc>
+          <w:tcPr/>
+          <w:p>
+            <w:pPr>
+              <w:pStyle w:val="Compact"/>
+              <w:jc w:val="center"/>
+            </w:pPr>
+            <w:r>
+              <w:t xml:space="preserve">1970–2026</w:t>
+            </w:r>
+          </w:p>
+        </w:tc>
+        <w:tc>
+          <w:tcPr/>
+          <w:p>
+            <w:pPr>
+              <w:pStyle w:val="Compact"/>
+              <w:jc w:val="center"/>
+            </w:pPr>
+            <w:r>
+              <w:t xml:space="preserve">418</w:t>
+            </w:r>
+          </w:p>
+        </w:tc>
+        <w:tc>
+          <w:tcPr/>
+          <w:p>
+            <w:pPr>
+              <w:pStyle w:val="Compact"/>
+              <w:jc w:val="center"/>
+            </w:pPr>
+            <w:r>
+              <w:t xml:space="preserve">276</w:t>
+            </w:r>
+          </w:p>
+        </w:tc>
+      </w:tr>
+      <w:tr>
+        <w:tc>
+          <w:tcPr/>
+          <w:p>
+            <w:pPr>
+              <w:pStyle w:val="Compact"/>
+              <w:jc w:val="left"/>
+            </w:pPr>
+            <w:r>
+              <w:rPr>
+                <w:b/>
+                <w:bCs/>
+              </w:rPr>
+              <w:t xml:space="preserve">Scopus &amp; Europe PMC</w:t>
+            </w:r>
+          </w:p>
+        </w:tc>
+        <w:tc>
+          <w:tcPr/>
+          <w:p>
+            <w:pPr>
+              <w:pStyle w:val="Compact"/>
+              <w:jc w:val="left"/>
+            </w:pPr>
+            <w:r>
+              <w:rPr>
+                <w:rStyle w:val="VerbatimChar"/>
+              </w:rPr>
+              <w:t xml:space="preserve">TITLE-ABS-KEY(("lunar surface" OR "crustal magnetic") AND ("biological payload" OR "space agriculture" OR "Artemis"))</w:t>
+            </w:r>
+          </w:p>
+        </w:tc>
+        <w:tc>
+          <w:tcPr/>
+          <w:p>
+            <w:pPr>
+              <w:pStyle w:val="Compact"/>
+              <w:jc w:val="center"/>
+            </w:pPr>
+            <w:r>
+              <w:t xml:space="preserve">1969–2026</w:t>
+            </w:r>
+          </w:p>
+        </w:tc>
+        <w:tc>
+          <w:tcPr/>
+          <w:p>
+            <w:pPr>
+              <w:pStyle w:val="Compact"/>
+              <w:jc w:val="center"/>
+            </w:pPr>
+            <w:r>
+              <w:t xml:space="preserve">286</w:t>
+            </w:r>
+          </w:p>
+        </w:tc>
+        <w:tc>
+          <w:tcPr/>
+          <w:p>
+            <w:pPr>
+              <w:pStyle w:val="Compact"/>
+              <w:jc w:val="center"/>
+            </w:pPr>
+            <w:r>
+              <w:t xml:space="preserve">148</w:t>
+            </w:r>
+          </w:p>
+        </w:tc>
+      </w:tr>
+      <w:tr>
+        <w:tc>
+          <w:tcPr/>
+          <w:p>
+            <w:pPr>
+              <w:pStyle w:val="Compact"/>
+              <w:jc w:val="left"/>
+            </w:pPr>
+            <w:r>
+              <w:rPr>
+                <w:b/>
+                <w:bCs/>
+              </w:rPr>
+              <w:t xml:space="preserve">NASA OSDR</w:t>
+            </w:r>
+          </w:p>
+        </w:tc>
+        <w:tc>
+          <w:tcPr/>
+          <w:p>
+            <w:pPr>
+              <w:pStyle w:val="Compact"/>
+              <w:jc w:val="left"/>
+            </w:pPr>
+            <w:r>
+              <w:t xml:space="preserve">Target queries:</w:t>
+            </w:r>
+            <w:r>
+              <w:t xml:space="preserve"> </w:t>
+            </w:r>
+            <w:r>
+              <w:rPr>
+                <w:rStyle w:val="VerbatimChar"/>
+              </w:rPr>
+              <w:t xml:space="preserve">Arabidopsis</w:t>
+            </w:r>
+            <w:r>
+              <w:t xml:space="preserve">,</w:t>
+            </w:r>
+            <w:r>
+              <w:t xml:space="preserve"> </w:t>
+            </w:r>
+            <w:r>
+              <w:rPr>
+                <w:rStyle w:val="VerbatimChar"/>
+              </w:rPr>
+              <w:t xml:space="preserve">seedling</w:t>
+            </w:r>
+            <w:r>
+              <w:t xml:space="preserve">,</w:t>
+            </w:r>
+            <w:r>
+              <w:t xml:space="preserve"> </w:t>
+            </w:r>
+            <w:r>
+              <w:rPr>
+                <w:rStyle w:val="VerbatimChar"/>
+              </w:rPr>
+              <w:t xml:space="preserve">germination</w:t>
+            </w:r>
+            <w:r>
+              <w:t xml:space="preserve">,</w:t>
+            </w:r>
+            <w:r>
+              <w:t xml:space="preserve"> </w:t>
+            </w:r>
+            <w:r>
+              <w:rPr>
+                <w:rStyle w:val="VerbatimChar"/>
+              </w:rPr>
+              <w:t xml:space="preserve">exploration atmosphere</w:t>
+            </w:r>
+            <w:r>
+              <w:t xml:space="preserve">,</w:t>
+            </w:r>
+            <w:r>
+              <w:t xml:space="preserve"> </w:t>
+            </w:r>
+            <w:r>
+              <w:rPr>
+                <w:rStyle w:val="VerbatimChar"/>
+              </w:rPr>
+              <w:t xml:space="preserve">radiation</w:t>
+            </w:r>
+            <w:r>
+              <w:t xml:space="preserve">,</w:t>
+            </w:r>
+            <w:r>
+              <w:t xml:space="preserve"> </w:t>
+            </w:r>
+            <w:r>
+              <w:rPr>
+                <w:rStyle w:val="VerbatimChar"/>
+              </w:rPr>
+              <w:t xml:space="preserve">microgravity</w:t>
+            </w:r>
+          </w:p>
+        </w:tc>
+        <w:tc>
+          <w:tcPr/>
+          <w:p>
+            <w:pPr>
+              <w:pStyle w:val="Compact"/>
+              <w:jc w:val="center"/>
+            </w:pPr>
+            <w:r>
+              <w:t xml:space="preserve">2000–2026</w:t>
+            </w:r>
+          </w:p>
+        </w:tc>
+        <w:tc>
+          <w:tcPr/>
+          <w:p>
+            <w:pPr>
+              <w:pStyle w:val="Compact"/>
+              <w:jc w:val="center"/>
+            </w:pPr>
+            <w:r>
+              <w:t xml:space="preserve">182</w:t>
+            </w:r>
+          </w:p>
+        </w:tc>
+        <w:tc>
+          <w:tcPr/>
+          <w:p>
+            <w:pPr>
+              <w:pStyle w:val="Compact"/>
+              <w:jc w:val="center"/>
+            </w:pPr>
+            <w:r>
+              <w:t xml:space="preserve">104</w:t>
+            </w:r>
+          </w:p>
+        </w:tc>
+      </w:tr>
+      <w:tr>
+        <w:tc>
+          <w:tcPr/>
+          <w:p>
+            <w:pPr>
+              <w:pStyle w:val="Compact"/>
+              <w:jc w:val="left"/>
+            </w:pPr>
+            <w:r>
+              <w:rPr>
+                <w:b/>
+                <w:bCs/>
+              </w:rPr>
+              <w:t xml:space="preserve">NASA PDS / SELENE</w:t>
+            </w:r>
+          </w:p>
+        </w:tc>
+        <w:tc>
+          <w:tcPr/>
+          <w:p>
+            <w:pPr>
+              <w:pStyle w:val="Compact"/>
+              <w:jc w:val="left"/>
+            </w:pPr>
+            <w:r>
+              <w:t xml:space="preserve">Orbital vector magnetometer records (</w:t>
+            </w:r>
+            <w:r>
+              <w:rPr>
+                <w:rStyle w:val="VerbatimChar"/>
+              </w:rPr>
+              <w:t xml:space="preserve">LP-MAG</w:t>
+            </w:r>
+            <w:r>
+              <w:t xml:space="preserve">,</w:t>
+            </w:r>
+            <w:r>
+              <w:t xml:space="preserve"> </w:t>
+            </w:r>
+            <w:r>
+              <w:rPr>
+                <w:rStyle w:val="VerbatimChar"/>
+              </w:rPr>
+              <w:t xml:space="preserve">Kaguya LMAG</w:t>
+            </w:r>
+            <w:r>
+              <w:t xml:space="preserve">,</w:t>
+            </w:r>
+            <w:r>
+              <w:t xml:space="preserve"> </w:t>
+            </w:r>
+            <w:r>
+              <w:rPr>
+                <w:rStyle w:val="VerbatimChar"/>
+              </w:rPr>
+              <w:t xml:space="preserve">Apollo 12/14/15/16 surface magnetometers</w:t>
+            </w:r>
+            <w:r>
+              <w:t xml:space="preserve">)</w:t>
+            </w:r>
+          </w:p>
+        </w:tc>
+        <w:tc>
+          <w:tcPr/>
+          <w:p>
+            <w:pPr>
+              <w:pStyle w:val="Compact"/>
+              <w:jc w:val="center"/>
+            </w:pPr>
+            <w:r>
+              <w:t xml:space="preserve">1969–2026</w:t>
+            </w:r>
+          </w:p>
+        </w:tc>
+        <w:tc>
+          <w:tcPr/>
+          <w:p>
+            <w:pPr>
+              <w:pStyle w:val="Compact"/>
+              <w:jc w:val="center"/>
+            </w:pPr>
+            <w:r>
+              <w:t xml:space="preserve">N/A (Orbital Grids)</w:t>
+            </w:r>
+          </w:p>
+        </w:tc>
+        <w:tc>
+          <w:tcPr/>
+          <w:p>
+            <w:pPr>
+              <w:pStyle w:val="Compact"/>
+              <w:jc w:val="center"/>
+            </w:pPr>
+            <w:r>
+              <w:t xml:space="preserve">23 Candidate Sites</w:t>
+            </w:r>
+          </w:p>
+        </w:tc>
+      </w:tr>
+      <w:tr>
+        <w:tc>
+          <w:tcPr/>
+          <w:p>
+            <w:pPr>
+              <w:pStyle w:val="Compact"/>
+              <w:jc w:val="left"/>
+            </w:pPr>
+            <w:r>
+              <w:rPr>
+                <w:b/>
+                <w:bCs/>
+              </w:rPr>
+              <w:t xml:space="preserve">Total Corpus</w:t>
+            </w:r>
+          </w:p>
+        </w:tc>
+        <w:tc>
+          <w:tcPr/>
+          <w:p>
+            <w:pPr>
+              <w:pStyle w:val="Compact"/>
+              <w:jc w:val="left"/>
+            </w:pPr>
+            <w:r>
+              <w:rPr>
+                <w:b/>
+                <w:bCs/>
+              </w:rPr>
+              <w:t xml:space="preserve">Cross-database search across 6 major indexed platforms</w:t>
+            </w:r>
+          </w:p>
+        </w:tc>
+        <w:tc>
+          <w:tcPr/>
+          <w:p>
+            <w:pPr>
+              <w:pStyle w:val="Compact"/>
+              <w:jc w:val="center"/>
+            </w:pPr>
+            <w:r>
+              <w:rPr>
+                <w:b/>
+                <w:bCs/>
+              </w:rPr>
+              <w:t xml:space="preserve">1965–2026</w:t>
+            </w:r>
+          </w:p>
+        </w:tc>
+        <w:tc>
+          <w:tcPr/>
+          <w:p>
+            <w:pPr>
+              <w:pStyle w:val="Compact"/>
+              <w:jc w:val="center"/>
+            </w:pPr>
+            <w:r>
+              <w:rPr>
+                <w:b/>
+                <w:bCs/>
+              </w:rPr>
+              <w:t xml:space="preserve">1,428 records</w:t>
+            </w:r>
+          </w:p>
+        </w:tc>
+        <w:tc>
+          <w:tcPr/>
+          <w:p>
+            <w:pPr>
+              <w:pStyle w:val="Compact"/>
+              <w:jc w:val="center"/>
+            </w:pPr>
+            <w:r>
+              <w:rPr>
+                <w:b/>
+                <w:bCs/>
+              </w:rPr>
+              <w:t xml:space="preserve">916 records</w:t>
+            </w:r>
+          </w:p>
+        </w:tc>
+      </w:tr>
+    </w:tbl>
+    <w:bookmarkEnd w:id="18"/>
+    <w:bookmarkStart w:id="19" w:name="X47ddae7bac213161b3750e62be7a7131276b6dc"/>
+    <w:p>
+      <w:pPr>
+        <w:pStyle w:val="Heading3"/>
+      </w:pPr>
+      <w:r>
+        <w:t xml:space="preserve">2.3 Study Selection, Eligibility, and Deduplication Flow</w:t>
+      </w:r>
+    </w:p>
+    <w:p>
+      <w:pPr>
+        <w:pStyle w:val="FirstParagraph"/>
+      </w:pPr>
+      <w:r>
+        <w:t xml:space="preserve">Records identified through database and repository searches (</w:t>
+      </w:r>
+      <m:oMath>
+        <m:r>
+          <m:t>n</m:t>
+        </m:r>
+        <m:r>
+          <m:rPr>
+            <m:sty m:val="p"/>
+          </m:rPr>
+          <m:t>=</m:t>
+        </m:r>
+        <m:r>
+          <m:t>1</m:t>
+        </m:r>
+        <m:r>
+          <m:rPr>
+            <m:sty m:val="p"/>
+          </m:rPr>
           <m:t>,</m:t>
         </m:r>
         <m:r>
+          <m:t>428</m:t>
+        </m:r>
+      </m:oMath>
+      <w:r>
+        <w:t xml:space="preserve"> </w:t>
+      </w:r>
+      <w:r>
+        <w:t xml:space="preserve">database records plus</w:t>
+      </w:r>
+      <w:r>
+        <w:t xml:space="preserve"> </w:t>
+      </w:r>
+      <m:oMath>
+        <m:r>
+          <m:t>n</m:t>
+        </m:r>
+        <m:r>
+          <m:rPr>
+            <m:sty m:val="p"/>
+          </m:rPr>
+          <m:t>=</m:t>
+        </m:r>
+        <m:r>
+          <m:t>6</m:t>
+        </m:r>
+      </m:oMath>
+      <w:r>
+        <w:t xml:space="preserve"> </w:t>
+      </w:r>
+      <w:r>
+        <w:t xml:space="preserve">primary multi-omics/orbital datasets) were compiled and deduplicated, yielding 916 unique records for title and abstract screening (Figure 2b).</w:t>
+      </w:r>
+    </w:p>
+    <w:p>
+      <w:pPr>
+        <w:pStyle w:val="Compact"/>
+        <w:numPr>
+          <w:ilvl w:val="0"/>
+          <w:numId w:val="1002"/>
+        </w:numPr>
+      </w:pPr>
+      <w:r>
+        <w:rPr>
+          <w:b/>
+          <w:bCs/>
+        </w:rPr>
+        <w:t xml:space="preserve">Inclusion Criteria:</w:t>
+      </w:r>
+      <w:r>
+        <w:t xml:space="preserve"> </w:t>
+      </w:r>
+      <w:r>
+        <w:t xml:space="preserve">Studies were included if they: (a) reported biological responses to measured near-null or hypomagnetic field conditions (</w:t>
+      </w:r>
+      <m:oMath>
+        <m:r>
           <m:rPr>
             <m:sty m:val="p"/>
           </m:rPr>
@@ -5409,116 +6194,509 @@
           </m:rPr>
           <m:t>|</m:t>
         </m:r>
-      </m:oMath>
-      <w:r>
-        <w:t xml:space="preserve">) across candidate Artemis exploration zones.</w:t>
-      </w:r>
-      <w:r>
-        <w:t xml:space="preserve"> </w:t>
-      </w:r>
-      <w:r>
-        <w:t xml:space="preserve">-</w:t>
-      </w:r>
-      <w:r>
-        <w:t xml:space="preserve"> </w:t>
-      </w:r>
-      <w:r>
-        <w:rPr>
-          <w:b/>
-          <w:bCs/>
-        </w:rPr>
-        <w:t xml:space="preserve">Quantum Biology Atlas (QBM-06):</w:t>
-      </w:r>
-      <w:r>
-        <w:t xml:space="preserve"> </w:t>
-      </w:r>
-      <w:r>
-        <w:t xml:space="preserve">Systems Biology Graphical Notation (SBGN) pathway model detailing the enzymatic and radical-pair steps of heterotrophic seed germination before photosynthesis.</w:t>
-      </w:r>
-      <w:r>
-        <w:t xml:space="preserve"> </w:t>
-      </w:r>
-      <w:r>
-        <w:t xml:space="preserve">-</w:t>
-      </w:r>
-      <w:r>
-        <w:t xml:space="preserve"> </w:t>
-      </w:r>
-      <w:r>
-        <w:rPr>
-          <w:b/>
-          <w:bCs/>
-        </w:rPr>
-        <w:t xml:space="preserve">Consortium Astronaut Multi-Omics Data:</w:t>
-      </w:r>
-      <w:r>
-        <w:t xml:space="preserve"> </w:t>
-      </w:r>
-      <w:r>
-        <w:t xml:space="preserve">Transcriptomic, metabolomic, and cell-free DNA spaceflight profiles from Afshinnekoo et al. [67]. Full database accession numbers, assay types, and repository URLs are detailed in</w:t>
-      </w:r>
-      <w:r>
-        <w:t xml:space="preserve"> </w:t>
-      </w:r>
-      <w:r>
-        <w:rPr>
-          <w:b/>
-          <w:bCs/>
-        </w:rPr>
-        <w:t xml:space="preserve">Supplemental Table S2</w:t>
-      </w:r>
-      <w:r>
-        <w:t xml:space="preserve"> </w:t>
-      </w:r>
-      <w:r>
-        <w:t xml:space="preserve">(</w:t>
-      </w:r>
-      <w:r>
-        <w:rPr>
-          <w:rStyle w:val="VerbatimChar"/>
-        </w:rPr>
-        <w:t xml:space="preserve">tables/Table_S2_public_datasets.csv</w:t>
-      </w:r>
-      <w:r>
-        <w:t xml:space="preserve">).</w:t>
-      </w:r>
-      <w:r>
-        <w:t xml:space="preserve"> </w:t>
-      </w:r>
-      <w:r>
-        <w:t xml:space="preserve">3.</w:t>
-      </w:r>
-      <w:r>
-        <w:t xml:space="preserve"> </w:t>
-      </w:r>
-      <w:r>
-        <w:rPr>
-          <w:b/>
-          <w:bCs/>
-        </w:rPr>
-        <w:t xml:space="preserve">Open-Source Computational Toolkit:</w:t>
-      </w:r>
-      <w:r>
-        <w:t xml:space="preserve"> </w:t>
-      </w:r>
-      <w:r>
-        <w:t xml:space="preserve">To ensure complete transparency and algorithmic reproducibility, all superposition calculations, non-linear germination kinetics parameterizations (</w:t>
+        <m:r>
+          <m:rPr>
+            <m:sty m:val="p"/>
+          </m:rPr>
+          <m:t>&lt;</m:t>
+        </m:r>
+        <m:r>
+          <m:t>5</m:t>
+        </m:r>
+        <m:r>
+          <m:t> </m:t>
+        </m:r>
+        <m:r>
+          <m:t>μ</m:t>
+        </m:r>
+        <m:r>
+          <m:rPr>
+            <m:nor/>
+            <m:sty m:val="p"/>
+          </m:rPr>
+          <m:t>T</m:t>
+        </m:r>
+      </m:oMath>
+      <w:r>
+        <w:t xml:space="preserve">); (b) focused on early vegetative seedling establishment, germination kinetics, cellular division, pigment accumulation, or organellar bioenergetics (Days 0–5 post-imbibition); (c) provided empirical multi-omics, biophysical, or calibrated orbital vector magnetic datasets; and (d) were published in peer-reviewed scientific journals or authoritative space agency technical repositories.</w:t>
+      </w:r>
+    </w:p>
+    <w:p>
+      <w:pPr>
+        <w:pStyle w:val="Compact"/>
+        <w:numPr>
+          <w:ilvl w:val="0"/>
+          <w:numId w:val="1002"/>
+        </w:numPr>
+      </w:pPr>
+      <w:r>
+        <w:rPr>
+          <w:b/>
+          <w:bCs/>
+        </w:rPr>
+        <w:t xml:space="preserve">Exclusion Criteria:</w:t>
+      </w:r>
+      <w:r>
+        <w:t xml:space="preserve"> </w:t>
+      </w:r>
+      <w:r>
+        <w:t xml:space="preserve">Studies were excluded if they: (a) evaluated static high-intensity magnetic fields (</w:t>
+      </w:r>
+      <m:oMath>
+        <m:r>
+          <m:rPr>
+            <m:sty m:val="p"/>
+          </m:rPr>
+          <m:t>|</m:t>
+        </m:r>
+        <m:r>
+          <m:rPr>
+            <m:sty m:val="bi"/>
+          </m:rPr>
+          <m:t>B</m:t>
+        </m:r>
+        <m:r>
+          <m:rPr>
+            <m:sty m:val="p"/>
+          </m:rPr>
+          <m:t>|</m:t>
+        </m:r>
+        <m:r>
+          <m:rPr>
+            <m:sty m:val="p"/>
+          </m:rPr>
+          <m:t>&gt;</m:t>
+        </m:r>
+        <m:r>
+          <m:t>1</m:t>
+        </m:r>
+        <m:r>
+          <m:rPr>
+            <m:nor/>
+            <m:sty m:val="p"/>
+          </m:rPr>
+          <m:t> mT</m:t>
+        </m:r>
+      </m:oMath>
+      <w:r>
+        <w:t xml:space="preserve">, e.g., MRI exposures or magnetic resonance therapy) unrepresentative of space environments; (b) focused exclusively on post-Day 14 whole-life-cycle agronomic endpoints (flowering, silique filling) lacking early developmental kinetics; (c) utilized animal or clinical models lacking shared eukaryotic bioenergetic or radical-pair homology; or (d) lacked magnetic shielding quantification or ambient geomagnetic field controls.</w:t>
+      </w:r>
+    </w:p>
+    <w:p>
+      <w:pPr>
+        <w:pStyle w:val="FirstParagraph"/>
+      </w:pPr>
+      <w:r>
+        <w:t xml:space="preserve">Following full-text eligibility assessment (</w:t>
+      </w:r>
+      <m:oMath>
+        <m:r>
+          <m:t>n</m:t>
+        </m:r>
+        <m:r>
+          <m:rPr>
+            <m:sty m:val="p"/>
+          </m:rPr>
+          <m:t>=</m:t>
+        </m:r>
+        <m:r>
+          <m:t>215</m:t>
+        </m:r>
+      </m:oMath>
+      <w:r>
+        <w:t xml:space="preserve"> </w:t>
+      </w:r>
+      <w:r>
+        <w:t xml:space="preserve">articles evaluated), 135 articles were excluded due to missing magnetic field logs, uncontrolled DC current artifacts, or unshielded controls. The final synthesized corpus comprises</w:t>
+      </w:r>
+      <w:r>
+        <w:t xml:space="preserve"> </w:t>
+      </w:r>
+      <w:r>
+        <w:rPr>
+          <w:b/>
+          <w:bCs/>
+        </w:rPr>
+        <w:t xml:space="preserve">80 audited peer-reviewed publications</w:t>
+      </w:r>
+      <w:r>
+        <w:t xml:space="preserve"> </w:t>
+      </w:r>
+      <w:r>
+        <w:t xml:space="preserve">(Supplemental Table S1) and</w:t>
+      </w:r>
+      <w:r>
+        <w:t xml:space="preserve"> </w:t>
+      </w:r>
+      <w:r>
+        <w:rPr>
+          <w:b/>
+          <w:bCs/>
+        </w:rPr>
+        <w:t xml:space="preserve">6 primary multi-omics and planetary datasets</w:t>
+      </w:r>
+      <w:r>
+        <w:t xml:space="preserve"> </w:t>
+      </w:r>
+      <w:r>
+        <w:t xml:space="preserve">(Supplemental Table S2) integrated across scales (Figure 2b).</w:t>
+      </w:r>
+    </w:p>
+    <w:bookmarkEnd w:id="19"/>
+    <w:bookmarkStart w:id="20" w:name="Xf4d9d2a5e1e1b76c4b1ce76bd97f56b3820a4d0"/>
+    <w:p>
+      <w:pPr>
+        <w:pStyle w:val="Heading3"/>
+      </w:pPr>
+      <w:r>
+        <w:t xml:space="preserve">2.4 Multi-Scale Thematic Synthesis Across 5 Core Domains</w:t>
+      </w:r>
+    </w:p>
+    <w:p>
+      <w:pPr>
+        <w:pStyle w:val="FirstParagraph"/>
+      </w:pPr>
+      <w:r>
+        <w:t xml:space="preserve">Evidence was synthesized thematically across five predefined, interconnected scientific domains:</w:t>
+      </w:r>
+      <w:r>
+        <w:t xml:space="preserve"> </w:t>
+      </w:r>
+      <w:r>
+        <w:t xml:space="preserve">1.</w:t>
+      </w:r>
+      <w:r>
+        <w:t xml:space="preserve"> </w:t>
+      </w:r>
+      <w:r>
+        <w:rPr>
+          <w:b/>
+          <w:bCs/>
+        </w:rPr>
+        <w:t xml:space="preserve">Domain 1 (Planetary Environment):</w:t>
+      </w:r>
+      <w:r>
+        <w:t xml:space="preserve"> </w:t>
+      </w:r>
+      <w:r>
+        <w:t xml:space="preserve">Ambient lunar South Pole near-null void (</w:t>
+      </w:r>
+      <m:oMath>
+        <m:r>
+          <m:rPr>
+            <m:sty m:val="p"/>
+          </m:rPr>
+          <m:t>&lt;</m:t>
+        </m:r>
+        <m:r>
+          <m:t>0.82</m:t>
+        </m:r>
+        <m:r>
+          <m:rPr>
+            <m:nor/>
+            <m:sty m:val="p"/>
+          </m:rPr>
+          <m:t> nT</m:t>
+        </m:r>
+      </m:oMath>
+      <w:r>
+        <w:t xml:space="preserve">) and surface vector superposition (</w:t>
       </w:r>
       <m:oMath>
         <m:sSub>
           <m:e>
             <m:r>
-              <m:t>t</m:t>
+              <m:rPr>
+                <m:sty m:val="bi"/>
+              </m:rPr>
+              <m:t>B</m:t>
             </m:r>
           </m:e>
           <m:sub>
             <m:r>
-              <m:t>50</m:t>
+              <m:rPr>
+                <m:nor/>
+                <m:sty m:val="p"/>
+              </m:rPr>
+              <m:t>total</m:t>
             </m:r>
           </m:sub>
         </m:sSub>
       </m:oMath>
       <w:r>
+        <w:t xml:space="preserve">).</w:t>
+      </w:r>
+      <w:r>
+        <w:t xml:space="preserve"> </w:t>
+      </w:r>
+      <w:r>
+        <w:t xml:space="preserve">2.</w:t>
+      </w:r>
+      <w:r>
+        <w:t xml:space="preserve"> </w:t>
+      </w:r>
+      <w:r>
+        <w:rPr>
+          <w:b/>
+          <w:bCs/>
+        </w:rPr>
+        <w:t xml:space="preserve">Domain 2 (Early Seedling Kinetics):</w:t>
+      </w:r>
+      <w:r>
+        <w:t xml:space="preserve"> </w:t>
+      </w:r>
+      <w:r>
+        <w:t xml:space="preserve">First 5 days of growth: germination capacity, emergence velocity lag (</w:t>
+      </w:r>
+      <m:oMath>
+        <m:r>
+          <m:rPr>
+            <m:sty m:val="p"/>
+          </m:rPr>
+          <m:t>Δ</m:t>
+        </m:r>
+        <m:sSub>
+          <m:e>
+            <m:r>
+              <m:t>t</m:t>
+            </m:r>
+          </m:e>
+          <m:sub>
+            <m:r>
+              <m:t>50</m:t>
+            </m:r>
+          </m:sub>
+        </m:sSub>
+        <m:r>
+          <m:rPr>
+            <m:sty m:val="p"/>
+          </m:rPr>
+          <m:t>=</m:t>
+        </m:r>
+        <m:r>
+          <m:rPr>
+            <m:sty m:val="p"/>
+          </m:rPr>
+          <m:t>+</m:t>
+        </m:r>
+        <m:r>
+          <m:t>12</m:t>
+        </m:r>
+        <m:r>
+          <m:rPr>
+            <m:nor/>
+            <m:sty m:val="p"/>
+          </m:rPr>
+          <m:t>–</m:t>
+        </m:r>
+        <m:r>
+          <m:t>36</m:t>
+        </m:r>
+        <m:r>
+          <m:rPr>
+            <m:nor/>
+            <m:sty m:val="p"/>
+          </m:rPr>
+          <m:t> h</m:t>
+        </m:r>
+      </m:oMath>
+      <w:r>
+        <w:t xml:space="preserve">), and Day 5 biomass penalty (</w:t>
+      </w:r>
+      <m:oMath>
+        <m:r>
+          <m:rPr>
+            <m:sty m:val="p"/>
+          </m:rPr>
+          <m:t>−</m:t>
+        </m:r>
+        <m:r>
+          <m:t>28.5</m:t>
+        </m:r>
+        <m:r>
+          <m:rPr>
+            <m:sty m:val="p"/>
+          </m:rPr>
+          <m:t>%</m:t>
+        </m:r>
+      </m:oMath>
+      <w:r>
+        <w:t xml:space="preserve">).</w:t>
+      </w:r>
+      <w:r>
+        <w:t xml:space="preserve"> </w:t>
+      </w:r>
+      <w:r>
+        <w:t xml:space="preserve">3.</w:t>
+      </w:r>
+      <w:r>
+        <w:t xml:space="preserve"> </w:t>
+      </w:r>
+      <w:r>
+        <w:rPr>
+          <w:b/>
+          <w:bCs/>
+        </w:rPr>
+        <w:t xml:space="preserve">Domain 3 (Quantum Molecular Biology):</w:t>
+      </w:r>
+      <w:r>
+        <w:t xml:space="preserve"> </w:t>
+      </w:r>
+      <w:r>
+        <w:t xml:space="preserve">Flavin-tryptophan radical pairs in cryptochromes, spin-chemical kinetics, and mitochondrial electron transport leakage.</w:t>
+      </w:r>
+      <w:r>
+        <w:t xml:space="preserve"> </w:t>
+      </w:r>
+      <w:r>
+        <w:t xml:space="preserve">4.</w:t>
+      </w:r>
+      <w:r>
+        <w:t xml:space="preserve"> </w:t>
+      </w:r>
+      <w:r>
+        <w:rPr>
+          <w:b/>
+          <w:bCs/>
+        </w:rPr>
+        <w:t xml:space="preserve">Domain 4 (Spaceflight Multi-Stressor Nexus):</w:t>
+      </w:r>
+      <w:r>
+        <w:t xml:space="preserve"> </w:t>
+      </w:r>
+      <w:r>
+        <w:t xml:space="preserve">Convergence of exploration atmosphere (hypobaric</w:t>
+      </w:r>
+      <w:r>
+        <w:t xml:space="preserve"> </w:t>
+      </w:r>
+      <m:oMath>
+        <m:sSub>
+          <m:e>
+            <m:r>
+              <m:rPr>
+                <m:nor/>
+                <m:sty m:val="p"/>
+              </m:rPr>
+              <m:t>CO</m:t>
+            </m:r>
+          </m:e>
+          <m:sub>
+            <m:r>
+              <m:t>2</m:t>
+            </m:r>
+          </m:sub>
+        </m:sSub>
+        <m:r>
+          <m:rPr>
+            <m:sty m:val="p"/>
+          </m:rPr>
+          <m:t>/</m:t>
+        </m:r>
+        <m:sSub>
+          <m:e>
+            <m:r>
+              <m:rPr>
+                <m:nor/>
+                <m:sty m:val="p"/>
+              </m:rPr>
+              <m:t>O</m:t>
+            </m:r>
+          </m:e>
+          <m:sub>
+            <m:r>
+              <m:t>2</m:t>
+            </m:r>
+          </m:sub>
+        </m:sSub>
+      </m:oMath>
+      <w:r>
+        <w:t xml:space="preserve">), ionizing radiation, and near-null fields on</w:t>
+      </w:r>
+      <w:r>
+        <w:t xml:space="preserve"> </w:t>
+      </w:r>
+      <w:r>
+        <w:rPr>
+          <w:i/>
+          <w:iCs/>
+        </w:rPr>
+        <w:t xml:space="preserve">AOX1D</w:t>
+      </w:r>
+      <w:r>
+        <w:t xml:space="preserve"> </w:t>
+      </w:r>
+      <w:r>
+        <w:t xml:space="preserve">and</w:t>
+      </w:r>
+      <w:r>
+        <w:t xml:space="preserve"> </w:t>
+      </w:r>
+      <w:r>
+        <w:rPr>
+          <w:i/>
+          <w:iCs/>
+        </w:rPr>
+        <w:t xml:space="preserve">CAT3</w:t>
+      </w:r>
+      <w:r>
+        <w:t xml:space="preserve">.</w:t>
+      </w:r>
+      <w:r>
+        <w:t xml:space="preserve"> </w:t>
+      </w:r>
+      <w:r>
+        <w:t xml:space="preserve">5.</w:t>
+      </w:r>
+      <w:r>
+        <w:t xml:space="preserve"> </w:t>
+      </w:r>
+      <w:r>
+        <w:rPr>
+          <w:b/>
+          <w:bCs/>
+        </w:rPr>
+        <w:t xml:space="preserve">Domain 5 (Flight Hardware Assessment &amp; Gap Retirement):</w:t>
+      </w:r>
+      <w:r>
+        <w:t xml:space="preserve"> </w:t>
+      </w:r>
+      <w:r>
+        <w:t xml:space="preserve">Three-chamber ground simulation standards, hardware power-state self-magnetic mapping, and post-flight phenotypic disambiguation.</w:t>
+      </w:r>
+    </w:p>
+    <w:bookmarkEnd w:id="20"/>
+    <w:bookmarkStart w:id="25" w:name="X37027a43b29429596b7df2cce8738a608baab48"/>
+    <w:p>
+      <w:pPr>
+        <w:pStyle w:val="Heading3"/>
+      </w:pPr>
+      <w:r>
+        <w:t xml:space="preserve">2.5 Open-Source Computational Toolkit &amp; FAIR Data Protocol</w:t>
+      </w:r>
+    </w:p>
+    <w:p>
+      <w:pPr>
+        <w:pStyle w:val="FirstParagraph"/>
+      </w:pPr>
+      <w:r>
+        <w:t xml:space="preserve">All vector superposition calculations, non-linear germination kinetics parameterizations (</w:t>
+      </w:r>
+      <m:oMath>
+        <m:sSub>
+          <m:e>
+            <m:r>
+              <m:t>t</m:t>
+            </m:r>
+          </m:e>
+          <m:sub>
+            <m:r>
+              <m:t>50</m:t>
+            </m:r>
+          </m:sub>
+        </m:sSub>
+      </m:oMath>
+      <w:r>
         <w:t xml:space="preserve"> </w:t>
       </w:r>
       <w:r>
@@ -5527,7 +6705,7 @@
       <w:r>
         <w:t xml:space="preserve"> </w:t>
       </w:r>
-      <w:hyperlink r:id="rId16">
+      <w:hyperlink r:id="rId21">
         <w:r>
           <w:rPr>
             <w:rStyle w:val="VerbatimChar"/>
@@ -5536,7 +6714,96 @@
         </w:r>
       </w:hyperlink>
       <w:r>
-        <w:t xml:space="preserve">. All underlying scripts, empirical CSV datasets, and figures are archived under FAIR (Findable, Accessible, Interoperable, and Reusable) data standards on GitHub and Zenodo.</w:t>
+        <w:t xml:space="preserve">. All underlying Python scripts, empirical CSV datasets, and figures are archived under FAIR (Findable, Accessible, Interoperable, and Reusable) data standards on GitHub and Zenodo.</w:t>
+      </w:r>
+    </w:p>
+    <w:p>
+      <w:pPr>
+        <w:pStyle w:val="BodyText"/>
+      </w:pPr>
+      <w:r>
+        <w:drawing>
+          <wp:inline>
+            <wp:extent cx="5334000" cy="4135134"/>
+            <wp:effectExtent b="0" l="0" r="0" t="0"/>
+            <wp:docPr descr="Figure 2" title="" id="23" name="Picture"/>
+            <a:graphic>
+              <a:graphicData uri="http://schemas.openxmlformats.org/drawingml/2006/picture">
+                <pic:pic>
+                  <pic:nvPicPr>
+                    <pic:cNvPr descr="/Users/drb_laptop/Documents/NMF_review/figures/Fig2_integrative_methods_framework.png" id="24" name="Picture"/>
+                    <pic:cNvPicPr>
+                      <a:picLocks noChangeArrowheads="1" noChangeAspect="1"/>
+                    </pic:cNvPicPr>
+                  </pic:nvPicPr>
+                  <pic:blipFill>
+                    <a:blip r:embed="rId22"/>
+                    <a:stretch>
+                      <a:fillRect/>
+                    </a:stretch>
+                  </pic:blipFill>
+                  <pic:spPr bwMode="auto">
+                    <a:xfrm>
+                      <a:off x="0" y="0"/>
+                      <a:ext cx="5334000" cy="4135134"/>
+                    </a:xfrm>
+                    <a:prstGeom prst="rect">
+                      <a:avLst/>
+                    </a:prstGeom>
+                    <a:noFill/>
+                    <a:ln w="9525">
+                      <a:noFill/>
+                      <a:headEnd/>
+                      <a:tailEnd/>
+                    </a:ln>
+                  </pic:spPr>
+                </pic:pic>
+              </a:graphicData>
+            </a:graphic>
+          </wp:inline>
+        </w:drawing>
+      </w:r>
+      <w:r>
+        <w:t xml:space="preserve"> </w:t>
+      </w:r>
+      <w:r>
+        <w:rPr>
+          <w:b/>
+          <w:bCs/>
+        </w:rPr>
+        <w:t xml:space="preserve">Figure 2 | Integrative review conceptual framework and evidence selection flow.</w:t>
+      </w:r>
+      <w:r>
+        <w:br/>
+      </w:r>
+      <w:r>
+        <w:rPr>
+          <w:b/>
+          <w:bCs/>
+        </w:rPr>
+        <w:t xml:space="preserve">(a) Conceptual Framework of the Integrative Review:</w:t>
+      </w:r>
+      <w:r>
+        <w:t xml:space="preserve"> </w:t>
+      </w:r>
+      <w:r>
+        <w:t xml:space="preserve">Progression from four formal research questions (RQ1–RQ4) through multi-disciplinary data sources (planetary geophysics, plant space biology, quantum biophysics, astronaut multi-omics), rigorous selection and scoping criteria, and multi-scale thematic synthesis across five core scientific domains (D1–D5).</w:t>
+      </w:r>
+      <w:r>
+        <w:br/>
+      </w:r>
+      <w:r>
+        <w:rPr>
+          <w:b/>
+          <w:bCs/>
+        </w:rPr>
+        <w:t xml:space="preserve">(b) Evidence Identification and Selection Flow Diagram (PRISMA/SANRA-compliant):</w:t>
+      </w:r>
+      <w:r>
+        <w:t xml:space="preserve"> </w:t>
+      </w:r>
+      <w:r>
+        <w:t xml:space="preserve">Systematic screening and deduplication from 1,428 database records (PubMed, Web of Science, Scopus/Europe PMC, NASA OSDR) and 6 primary spaceflight/planetary repositories down to the 80 audited peer-reviewed publications (Supplemental Table S1) and 6 public datasets (Supplemental Table S2) synthesized across scales. All calculations and non-linear kinetics fits were executed via the open-source package dr-richard-barker/NMF_review.</w:t>
       </w:r>
     </w:p>
     <w:p>
@@ -5546,15 +6813,15 @@
         </w:pict>
       </w:r>
     </w:p>
-    <w:bookmarkEnd w:id="17"/>
-    <w:bookmarkEnd w:id="18"/>
-    <w:bookmarkStart w:id="25" w:name="X91dcc69f4ee66fdadbfb89532eed46c4adf9c01"/>
+    <w:bookmarkEnd w:id="25"/>
+    <w:bookmarkEnd w:id="26"/>
+    <w:bookmarkStart w:id="33" w:name="X91dcc69f4ee66fdadbfb89532eed46c4adf9c01"/>
     <w:p>
       <w:pPr>
         <w:pStyle w:val="Heading2"/>
       </w:pPr>
       <w:r>
-        <w:t xml:space="preserve">2. The First Five Days of Growth: Early Seedling Establishment as the Critical Bottleneck for Lunar Agriculture</w:t>
+        <w:t xml:space="preserve">3. The First Five Days of Growth: Early Seedling Establishment as the Critical Bottleneck for Lunar Agriculture</w:t>
       </w:r>
     </w:p>
     <w:p>
@@ -5609,7 +6876,7 @@
         <w:t xml:space="preserve"> </w:t>
       </w:r>
       <w:r>
-        <w:t xml:space="preserve">(Figure 2a). During this tightly orchestrated window, the plant undergoes a profound physiological transition: progressing from an anoxic, metabolically quiescent seed relying entirely on heterotrophic reserve mobilization, through radicle protrusion and hypocotyl extension, to blue- and red-light-mediated photomorphogenesis, de-etiolation, and autotrophic photosynthetic competency [23,24].</w:t>
+        <w:t xml:space="preserve">(Figure 3a). During this tightly orchestrated window, the plant undergoes a profound physiological transition: progressing from an anoxic, metabolically quiescent seed relying entirely on heterotrophic reserve mobilization, through radicle protrusion and hypocotyl extension, to blue- and red-light-mediated photomorphogenesis, de-etiolation, and autotrophic photosynthetic competency [23,24].</w:t>
       </w:r>
     </w:p>
     <w:p>
@@ -5621,18 +6888,18 @@
           <wp:inline>
             <wp:extent cx="5334000" cy="4443106"/>
             <wp:effectExtent b="0" l="0" r="0" t="0"/>
-            <wp:docPr descr="Figure 2" title="" id="20" name="Picture"/>
+            <wp:docPr descr="Figure 3" title="" id="28" name="Picture"/>
             <a:graphic>
               <a:graphicData uri="http://schemas.openxmlformats.org/drawingml/2006/picture">
                 <pic:pic>
                   <pic:nvPicPr>
-                    <pic:cNvPr descr="/Users/drb_laptop/Documents/NMF_review/figures/Fig2_first_5_days_germination_pigments.png" id="21" name="Picture"/>
+                    <pic:cNvPr descr="/Users/drb_laptop/Documents/NMF_review/figures/Fig3_first_5_days_germination_pigments.png" id="29" name="Picture"/>
                     <pic:cNvPicPr>
                       <a:picLocks noChangeArrowheads="1" noChangeAspect="1"/>
                     </pic:cNvPicPr>
                   </pic:nvPicPr>
                   <pic:blipFill>
-                    <a:blip r:embed="rId19"/>
+                    <a:blip r:embed="rId27"/>
                     <a:stretch>
                       <a:fillRect/>
                     </a:stretch>
@@ -5666,7 +6933,7 @@
           <w:b/>
           <w:bCs/>
         </w:rPr>
-        <w:t xml:space="preserve">Figure 2 | The first five days of seedling growth under near-null magnetic fields.</w:t>
+        <w:t xml:space="preserve">Figure 3 | The first five days of seedling growth under near-null magnetic fields.</w:t>
       </w:r>
       <w:r>
         <w:br/>
@@ -5785,7 +7052,7 @@
         </m:r>
       </m:oMath>
       <w:r>
-        <w:t xml:space="preserve">, dashed red), synthesized from published empirical literature across crop and model species (Xu et al. [35,36], Tang et al. [31], Pooam et al. [50], Agliassa et al. [28]; Table 2). Hypomagnetic exposure causes a 20% decline in final germination capacity (total viable seedling count) and a 16-hour median emergence lag (</w:t>
+        <w:t xml:space="preserve">, dashed red), synthesized from published empirical literature across crop and model species (Xu et al. [35,36], Tang et al. [31], Pooam et al. [50], Agliassa et al. [28]; Table 3). Hypomagnetic exposure causes a 20% decline in final germination capacity (total viable seedling count) and a 16-hour median emergence lag (</w:t>
       </w:r>
       <m:oMath>
         <m:r>
@@ -5824,7 +7091,7 @@
         <w:t xml:space="preserve"> </w:t>
       </w:r>
       <w:r>
-        <w:t xml:space="preserve">Quantitative reductions in radicle length at Day 3 (-33.0%), hypocotyl height at Day 5 (-31.0%), fresh weight (-29.1%), and total dry biomass yield (-28.5%) under NNMF relative to GMF controls (meta-analysis of Refs [26–31]; Table 2). Slower growth directly compromises stand uniformity and harvest index in lunar life support.</w:t>
+        <w:t xml:space="preserve">Quantitative reductions in radicle length at Day 3 (-33.0%), hypocotyl height at Day 5 (-31.0%), fresh weight (-29.1%), and total dry biomass yield (-28.5%) under NNMF relative to GMF controls (meta-analysis of Refs [26–31]; Table 3). Slower growth directly compromises stand uniformity and harvest index in lunar life support.</w:t>
       </w:r>
       <w:r>
         <w:br/>
@@ -5989,13 +7256,13 @@
         <w:t xml:space="preserve">.</w:t>
       </w:r>
     </w:p>
-    <w:bookmarkStart w:id="22" w:name="X84ab46a2910601b3aa81b5275358d63c8185990"/>
+    <w:bookmarkStart w:id="30" w:name="X84ab46a2910601b3aa81b5275358d63c8185990"/>
     <w:p>
       <w:pPr>
         <w:pStyle w:val="Heading3"/>
       </w:pPr>
       <w:r>
-        <w:t xml:space="preserve">2.1 Germination Capacity and Seed Dormancy Breaking</w:t>
+        <w:t xml:space="preserve">3.1 Germination Capacity and Seed Dormancy Breaking</w:t>
       </w:r>
     </w:p>
     <w:p>
@@ -6003,7 +7270,7 @@
         <w:pStyle w:val="FirstParagraph"/>
       </w:pPr>
       <w:r>
-        <w:t xml:space="preserve">The initial developmental metric of any agricultural cycle is germination capacity: the total fraction of sown seeds that successfully break dormancy, complete imbibition, and emerge through the seed coat [25]. Removing the ambient geomagnetic field exerts a pronounced, documented inhibitory effect on germination capacity across diverse plant families (Figure 2b).</w:t>
+        <w:t xml:space="preserve">The initial developmental metric of any agricultural cycle is germination capacity: the total fraction of sown seeds that successfully break dormancy, complete imbibition, and emerge through the seed coat [25]. Removing the ambient geomagnetic field exerts a pronounced, documented inhibitory effect on germination capacity across diverse plant families (Figure 3b).</w:t>
       </w:r>
     </w:p>
     <w:p>
@@ -6213,14 +7480,14 @@
         <w:t xml:space="preserve">, shifting the hormonal balance toward dormancy retention. In the context of lunar agriculture, where payload volume severely limits seed reserves, a 10% to 30% reduction in germination capacity represents a substantial penalty on mission resource efficiency.</w:t>
       </w:r>
     </w:p>
-    <w:bookmarkEnd w:id="22"/>
-    <w:bookmarkStart w:id="23" w:name="Xaa74a4bab91ffde988354fc058a08a7e1d240f0"/>
+    <w:bookmarkEnd w:id="30"/>
+    <w:bookmarkStart w:id="31" w:name="Xaa74a4bab91ffde988354fc058a08a7e1d240f0"/>
     <w:p>
       <w:pPr>
         <w:pStyle w:val="Heading3"/>
       </w:pPr>
       <w:r>
-        <w:t xml:space="preserve">2.2 Emergence Velocity (</w:t>
+        <w:t xml:space="preserve">3.2 Emergence Velocity (</w:t>
       </w:r>
       <m:oMath>
         <m:sSub>
@@ -6282,7 +7549,7 @@
         <w:t xml:space="preserve"> </w:t>
       </w:r>
       <w:r>
-        <w:t xml:space="preserve">and the subsequent speed of seedling elongation are substantially depressed under near-null fields (Figure 2b,c).</w:t>
+        <w:t xml:space="preserve">and the subsequent speed of seedling elongation are substantially depressed under near-null fields (Figure 3b,c).</w:t>
       </w:r>
     </w:p>
     <w:p>
@@ -6544,7 +7811,7 @@
         <w:t xml:space="preserve"> </w:t>
       </w:r>
       <w:r>
-        <w:t xml:space="preserve">(synthesized from the multi-species trials of Xu et al. [26,35], Tang et al. [31], and Agliassa et al. [28]; Figure 2c; Table 2). For spaceflight life-support scheduling, such delays disrupt continuous nutritional cropping cycles and diminish daily crew dietary supplementation [41].</w:t>
+        <w:t xml:space="preserve">(synthesized from the multi-species trials of Xu et al. [26,35], Tang et al. [31], and Agliassa et al. [28]; Figure 3c; Table 3). For spaceflight life-support scheduling, such delays disrupt continuous nutritional cropping cycles and diminish daily crew dietary supplementation [41].</w:t>
       </w:r>
       <w:r>
         <w:t xml:space="preserve"> </w:t>
@@ -6569,14 +7836,14 @@
         <w:t xml:space="preserve">Slower, asynchronous germination creates irregular canopy heights, where lagging seedlings are shaded out by earlier-emerging neighbors, exacerbating yield losses in high-density planting matrices.</w:t>
       </w:r>
     </w:p>
-    <w:bookmarkEnd w:id="23"/>
-    <w:bookmarkStart w:id="24" w:name="Xe6c39742f366f8b4136845bd2138bb297a98052"/>
+    <w:bookmarkEnd w:id="31"/>
+    <w:bookmarkStart w:id="32" w:name="Xe6c39742f366f8b4136845bd2138bb297a98052"/>
     <w:p>
       <w:pPr>
         <w:pStyle w:val="Heading3"/>
       </w:pPr>
       <w:r>
-        <w:t xml:space="preserve">2.3 Pigment Biosynthetic Networks and Plastid Greening</w:t>
+        <w:t xml:space="preserve">3.3 Pigment Biosynthetic Networks and Plastid Greening</w:t>
       </w:r>
     </w:p>
     <w:p>
@@ -6627,7 +7894,7 @@
         <w:t xml:space="preserve"> </w:t>
       </w:r>
       <w:r>
-        <w:t xml:space="preserve">(Figure 2d):</w:t>
+        <w:t xml:space="preserve">(Figure 3d):</w:t>
       </w:r>
       <w:r>
         <w:t xml:space="preserve"> </w:t>
@@ -6992,7 +8259,7 @@
         <w:t xml:space="preserve">LHCB</w:t>
       </w:r>
       <w:r>
-        <w:t xml:space="preserve">) [47,48]. Because cryptochrome activation involves a magnetically sensitive flavin-tryptophan radical pair (detailed in Section 3), near-null magnetic field exposure alters cryptochrome conformational activation, attenuates COP1 dissociation, and suppresses HY5 nuclear accumulation, blunting the transcriptional activation of the entire pigment machinery [49–51].</w:t>
+        <w:t xml:space="preserve">) [47,48]. Because cryptochrome activation involves a magnetically sensitive flavin-tryptophan radical pair (detailed in Section 4), near-null magnetic field exposure alters cryptochrome conformational activation, attenuates COP1 dissociation, and suppresses HY5 nuclear accumulation, blunting the transcriptional activation of the entire pigment machinery [49–51].</w:t>
       </w:r>
       <w:r>
         <w:t xml:space="preserve"> </w:t>
@@ -7089,24 +8356,15 @@
         </w:pict>
       </w:r>
     </w:p>
-    <w:bookmarkEnd w:id="24"/>
-    <w:bookmarkEnd w:id="25"/>
-    <w:bookmarkStart w:id="29" w:name="X02a9b06c6b4373f75ab42fb7113307e65fb3bd2"/>
+    <w:bookmarkEnd w:id="32"/>
+    <w:bookmarkEnd w:id="33"/>
+    <w:bookmarkStart w:id="40" w:name="X02a9b06c6b4373f75ab42fb7113307e65fb3bd2"/>
     <w:p>
       <w:pPr>
         <w:pStyle w:val="Heading2"/>
       </w:pPr>
       <w:r>
-        <w:t xml:space="preserve">3. Quantum Molecular Biology of the 0–5 Day Window: The Quantum Biology Atlas Perspective</w:t>
-      </w:r>
-    </w:p>
-    <w:bookmarkStart w:id="26" w:name="Xe0679b0bbf85623df9adac5f6fafff9a4e5dd86"/>
-    <w:p>
-      <w:pPr>
-        <w:pStyle w:val="Heading3"/>
-      </w:pPr>
-      <w:r>
-        <w:t xml:space="preserve">3.1 Defining Quantum Biology &amp; The 0–72 h Energy Route</w:t>
+        <w:t xml:space="preserve">4. Quantum Molecular Biology of the 0–5 Day Window: The Quantum Biology Atlas Perspective</w:t>
       </w:r>
     </w:p>
     <w:p>
@@ -7114,6 +8372,666 @@
         <w:pStyle w:val="FirstParagraph"/>
       </w:pPr>
       <w:r>
+        <w:drawing>
+          <wp:inline>
+            <wp:extent cx="5334000" cy="4485820"/>
+            <wp:effectExtent b="0" l="0" r="0" t="0"/>
+            <wp:docPr descr="Figure 4" title="" id="35" name="Picture"/>
+            <a:graphic>
+              <a:graphicData uri="http://schemas.openxmlformats.org/drawingml/2006/picture">
+                <pic:pic>
+                  <pic:nvPicPr>
+                    <pic:cNvPr descr="/Users/drb_laptop/Documents/NMF_review/figures/Fig4_quantum_biology_0to5day_pathways.png" id="36" name="Picture"/>
+                    <pic:cNvPicPr>
+                      <a:picLocks noChangeArrowheads="1" noChangeAspect="1"/>
+                    </pic:cNvPicPr>
+                  </pic:nvPicPr>
+                  <pic:blipFill>
+                    <a:blip r:embed="rId34"/>
+                    <a:stretch>
+                      <a:fillRect/>
+                    </a:stretch>
+                  </pic:blipFill>
+                  <pic:spPr bwMode="auto">
+                    <a:xfrm>
+                      <a:off x="0" y="0"/>
+                      <a:ext cx="5334000" cy="4485820"/>
+                    </a:xfrm>
+                    <a:prstGeom prst="rect">
+                      <a:avLst/>
+                    </a:prstGeom>
+                    <a:noFill/>
+                    <a:ln w="9525">
+                      <a:noFill/>
+                      <a:headEnd/>
+                      <a:tailEnd/>
+                    </a:ln>
+                  </pic:spPr>
+                </pic:pic>
+              </a:graphicData>
+            </a:graphic>
+          </wp:inline>
+        </w:drawing>
+      </w:r>
+      <w:r>
+        <w:t xml:space="preserve"> </w:t>
+      </w:r>
+      <w:r>
+        <w:rPr>
+          <w:b/>
+          <w:bCs/>
+        </w:rPr>
+        <w:t xml:space="preserve">Figure 4 | Quantum molecular biology of early seedling establishment (Days 0–5).</w:t>
+      </w:r>
+      <w:r>
+        <w:br/>
+      </w:r>
+      <w:r>
+        <w:rPr>
+          <w:b/>
+          <w:bCs/>
+        </w:rPr>
+        <w:t xml:space="preserve">(a) QBM-06 Pathway Map: Seed Germination Before Photosynthesis:</w:t>
+      </w:r>
+      <w:r>
+        <w:t xml:space="preserve"> </w:t>
+      </w:r>
+      <w:r>
+        <w:t xml:space="preserve">Systems Biology Graphical Notation (SBGN) pathway map of the 0–72 h heterotrophic energy bottleneck from the Quantum Biology Atlas [55]. Four horizontal compartments delineate the reserve mobilization and bioenergetic route: Peroxisome (TAG lipase SDP1 [T4],</w:t>
+      </w:r>
+      <w:r>
+        <w:t xml:space="preserve"> </w:t>
+      </w:r>
+      <m:oMath>
+        <m:r>
+          <m:t>β</m:t>
+        </m:r>
+      </m:oMath>
+      <w:r>
+        <w:t xml:space="preserve">-oxidation generating</w:t>
+      </w:r>
+      <w:r>
+        <w:t xml:space="preserve"> </w:t>
+      </w:r>
+      <m:oMath>
+        <m:sSub>
+          <m:e>
+            <m:r>
+              <m:rPr>
+                <m:nor/>
+                <m:sty m:val="p"/>
+              </m:rPr>
+              <m:t>H</m:t>
+            </m:r>
+          </m:e>
+          <m:sub>
+            <m:r>
+              <m:t>2</m:t>
+            </m:r>
+          </m:sub>
+        </m:sSub>
+        <m:sSub>
+          <m:e>
+            <m:r>
+              <m:rPr>
+                <m:nor/>
+                <m:sty m:val="p"/>
+              </m:rPr>
+              <m:t>O</m:t>
+            </m:r>
+          </m:e>
+          <m:sub>
+            <m:r>
+              <m:t>2</m:t>
+            </m:r>
+          </m:sub>
+        </m:sSub>
+      </m:oMath>
+      <w:r>
+        <w:t xml:space="preserve"> </w:t>
+      </w:r>
+      <w:r>
+        <w:t xml:space="preserve">[T3], glyoxylate cycle [T4]); Mitochondrial Matrix (Acetyl-CoA [T4], Aconitase [4Fe-4S sentinel, T3], Complex I [FMN, 8 Fe-S, T2], Complex IV COX [T2]); Cellular Energy &amp; Redox (ATP/ADP ratio setting germination pace [T2], mitochondrial superoxide/</w:t>
+      </w:r>
+      <m:oMath>
+        <m:sSub>
+          <m:e>
+            <m:r>
+              <m:rPr>
+                <m:nor/>
+                <m:sty m:val="p"/>
+              </m:rPr>
+              <m:t>H</m:t>
+            </m:r>
+          </m:e>
+          <m:sub>
+            <m:r>
+              <m:t>2</m:t>
+            </m:r>
+          </m:sub>
+        </m:sSub>
+        <m:sSub>
+          <m:e>
+            <m:r>
+              <m:rPr>
+                <m:nor/>
+                <m:sty m:val="p"/>
+              </m:rPr>
+              <m:t>O</m:t>
+            </m:r>
+          </m:e>
+          <m:sub>
+            <m:r>
+              <m:t>2</m:t>
+            </m:r>
+          </m:sub>
+        </m:sSub>
+      </m:oMath>
+      <w:r>
+        <w:t xml:space="preserve"> </w:t>
+      </w:r>
+      <w:r>
+        <w:t xml:space="preserve">signaling [T2], Cytochrome</w:t>
+      </w:r>
+      <w:r>
+        <w:t xml:space="preserve"> </w:t>
+      </w:r>
+      <m:oMath>
+        <m:r>
+          <m:t>c</m:t>
+        </m:r>
+      </m:oMath>
+      <w:r>
+        <w:t xml:space="preserve"> </w:t>
+      </w:r>
+      <w:r>
+        <w:t xml:space="preserve">release modulating ABI4 retrograde signaling [T4]); and Organism Endpoint (Radicle Emergence at 0–72 h).</w:t>
+      </w:r>
+      <w:r>
+        <w:br/>
+      </w:r>
+      <w:r>
+        <w:rPr>
+          <w:b/>
+          <w:bCs/>
+        </w:rPr>
+        <w:t xml:space="preserve">(b) Evidentiary Tier Hierarchy &amp; Biophysical Timescale Constraints:</w:t>
+      </w:r>
+      <w:r>
+        <w:t xml:space="preserve"> </w:t>
+      </w:r>
+      <w:r>
+        <w:t xml:space="preserve">Stratification of candidate mechanisms into four rigorous tiers: T1 Demonstrated (heavy black border, applied field directly measured on biomolecule); T2 Inferred from Complex/Process (solid blue border); T3 Plausible Physical Route (dashed vermillion border); and T4 Contextual Scaffold (hairline grey border). Physical timescale matching: Zeeman precession at</w:t>
+      </w:r>
+      <w:r>
+        <w:t xml:space="preserve"> </w:t>
+      </w:r>
+      <m:oMath>
+        <m:r>
+          <m:t>50</m:t>
+        </m:r>
+        <m:r>
+          <m:t> </m:t>
+        </m:r>
+        <m:r>
+          <m:t>μ</m:t>
+        </m:r>
+        <m:r>
+          <m:rPr>
+            <m:nor/>
+            <m:sty m:val="p"/>
+          </m:rPr>
+          <m:t>T</m:t>
+        </m:r>
+      </m:oMath>
+      <w:r>
+        <w:t xml:space="preserve"> </w:t>
+      </w:r>
+      <w:r>
+        <w:t xml:space="preserve">GMF (</w:t>
+      </w:r>
+      <m:oMath>
+        <m:sSub>
+          <m:e>
+            <m:r>
+              <m:t>ν</m:t>
+            </m:r>
+          </m:e>
+          <m:sub>
+            <m:r>
+              <m:t>L</m:t>
+            </m:r>
+          </m:sub>
+        </m:sSub>
+        <m:r>
+          <m:rPr>
+            <m:sty m:val="p"/>
+          </m:rPr>
+          <m:t>≈</m:t>
+        </m:r>
+        <m:r>
+          <m:t>1.4</m:t>
+        </m:r>
+        <m:r>
+          <m:rPr>
+            <m:nor/>
+            <m:sty m:val="p"/>
+          </m:rPr>
+          <m:t> MHz</m:t>
+        </m:r>
+      </m:oMath>
+      <w:r>
+        <w:t xml:space="preserve">,</w:t>
+      </w:r>
+      <w:r>
+        <w:t xml:space="preserve"> </w:t>
+      </w:r>
+      <m:oMath>
+        <m:sSub>
+          <m:e>
+            <m:r>
+              <m:t>τ</m:t>
+            </m:r>
+          </m:e>
+          <m:sub>
+            <m:r>
+              <m:t>L</m:t>
+            </m:r>
+          </m:sub>
+        </m:sSub>
+        <m:r>
+          <m:rPr>
+            <m:sty m:val="p"/>
+          </m:rPr>
+          <m:t>≈</m:t>
+        </m:r>
+        <m:r>
+          <m:t>714</m:t>
+        </m:r>
+        <m:r>
+          <m:rPr>
+            <m:nor/>
+            <m:sty m:val="p"/>
+          </m:rPr>
+          <m:t> ns</m:t>
+        </m:r>
+      </m:oMath>
+      <w:r>
+        <w:t xml:space="preserve">) matches the microsecond spin coherence lifetime (</w:t>
+      </w:r>
+      <m:oMath>
+        <m:sSub>
+          <m:e>
+            <m:r>
+              <m:t>τ</m:t>
+            </m:r>
+          </m:e>
+          <m:sub>
+            <m:r>
+              <m:rPr>
+                <m:nor/>
+                <m:sty m:val="p"/>
+              </m:rPr>
+              <m:t>coh</m:t>
+            </m:r>
+          </m:sub>
+        </m:sSub>
+        <m:r>
+          <m:rPr>
+            <m:sty m:val="p"/>
+          </m:rPr>
+          <m:t>∼</m:t>
+        </m:r>
+        <m:r>
+          <m:t>1</m:t>
+        </m:r>
+        <m:r>
+          <m:t> </m:t>
+        </m:r>
+        <m:r>
+          <m:t>μ</m:t>
+        </m:r>
+        <m:r>
+          <m:rPr>
+            <m:nor/>
+            <m:sty m:val="p"/>
+          </m:rPr>
+          <m:t>s</m:t>
+        </m:r>
+      </m:oMath>
+      <w:r>
+        <w:t xml:space="preserve">) of cryptochrome radical pairs. In lunar NNMF (</w:t>
+      </w:r>
+      <m:oMath>
+        <m:r>
+          <m:rPr>
+            <m:sty m:val="p"/>
+          </m:rPr>
+          <m:t>&lt;</m:t>
+        </m:r>
+        <m:r>
+          <m:t>1</m:t>
+        </m:r>
+        <m:r>
+          <m:rPr>
+            <m:nor/>
+            <m:sty m:val="p"/>
+          </m:rPr>
+          <m:t> nT</m:t>
+        </m:r>
+      </m:oMath>
+      <w:r>
+        <w:t xml:space="preserve">),</w:t>
+      </w:r>
+      <w:r>
+        <w:t xml:space="preserve"> </w:t>
+      </w:r>
+      <m:oMath>
+        <m:sSub>
+          <m:e>
+            <m:r>
+              <m:t>ν</m:t>
+            </m:r>
+          </m:e>
+          <m:sub>
+            <m:r>
+              <m:t>L</m:t>
+            </m:r>
+          </m:sub>
+        </m:sSub>
+        <m:r>
+          <m:rPr>
+            <m:sty m:val="p"/>
+          </m:rPr>
+          <m:t>&lt;</m:t>
+        </m:r>
+        <m:r>
+          <m:t>8</m:t>
+        </m:r>
+        <m:r>
+          <m:rPr>
+            <m:nor/>
+            <m:sty m:val="p"/>
+          </m:rPr>
+          <m:t> kHz</m:t>
+        </m:r>
+      </m:oMath>
+      <w:r>
+        <w:t xml:space="preserve">, disabling magnetic modulation. Open PSII charge separation occurs in</w:t>
+      </w:r>
+      <w:r>
+        <w:t xml:space="preserve"> </w:t>
+      </w:r>
+      <m:oMath>
+        <m:r>
+          <m:rPr>
+            <m:sty m:val="p"/>
+          </m:rPr>
+          <m:t>∼</m:t>
+        </m:r>
+        <m:r>
+          <m:t>200</m:t>
+        </m:r>
+        <m:r>
+          <m:rPr>
+            <m:nor/>
+            <m:sty m:val="p"/>
+          </m:rPr>
+          <m:t> ps</m:t>
+        </m:r>
+      </m:oMath>
+      <w:r>
+        <w:t xml:space="preserve"> </w:t>
+      </w:r>
+      <w:r>
+        <w:t xml:space="preserve">(</w:t>
+      </w:r>
+      <m:oMath>
+        <m:sSup>
+          <m:e>
+            <m:r>
+              <m:t>10</m:t>
+            </m:r>
+          </m:e>
+          <m:sup>
+            <m:r>
+              <m:t>6</m:t>
+            </m:r>
+          </m:sup>
+        </m:sSup>
+        <m:r>
+          <m:rPr>
+            <m:sty m:val="p"/>
+          </m:rPr>
+          <m:t>×</m:t>
+        </m:r>
+      </m:oMath>
+      <w:r>
+        <w:t xml:space="preserve"> </w:t>
+      </w:r>
+      <w:r>
+        <w:t xml:space="preserve">too rapid for microtesla fields). Mitochondrial Complex III</w:t>
+      </w:r>
+      <w:r>
+        <w:t xml:space="preserve"> </w:t>
+      </w:r>
+      <m:oMath>
+        <m:sSub>
+          <m:e>
+            <m:r>
+              <m:t>Q</m:t>
+            </m:r>
+          </m:e>
+          <m:sub>
+            <m:r>
+              <m:t>o</m:t>
+            </m:r>
+          </m:sub>
+        </m:sSub>
+      </m:oMath>
+      <w:r>
+        <w:t xml:space="preserve"> </w:t>
+      </w:r>
+      <w:r>
+        <w:t xml:space="preserve">semiquinone-Rieske exchange coupling is in the gigahertz regime (</w:t>
+      </w:r>
+      <m:oMath>
+        <m:r>
+          <m:t>J</m:t>
+        </m:r>
+        <m:r>
+          <m:rPr>
+            <m:sty m:val="p"/>
+          </m:rPr>
+          <m:t>∼</m:t>
+        </m:r>
+        <m:r>
+          <m:rPr>
+            <m:nor/>
+            <m:sty m:val="p"/>
+          </m:rPr>
+          <m:t>GHz</m:t>
+        </m:r>
+        <m:r>
+          <m:rPr>
+            <m:sty m:val="p"/>
+          </m:rPr>
+          <m:t>≫</m:t>
+        </m:r>
+        <m:r>
+          <m:rPr>
+            <m:nor/>
+            <m:sty m:val="p"/>
+          </m:rPr>
+          <m:t>GMF</m:t>
+        </m:r>
+      </m:oMath>
+      <w:r>
+        <w:t xml:space="preserve">), refuting unphysical runaway ROS leak models.</w:t>
+      </w:r>
+      <w:r>
+        <w:br/>
+      </w:r>
+      <w:r>
+        <w:rPr>
+          <w:b/>
+          <w:bCs/>
+        </w:rPr>
+        <w:t xml:space="preserve">(c) Organellar Bioenergetics:</w:t>
+      </w:r>
+      <w:r>
+        <w:t xml:space="preserve"> </w:t>
+      </w:r>
+      <w:r>
+        <w:t xml:space="preserve">(Top) Chloroplast PETC (QBM-02) indicating PSII (P680, T2), Cytochrome</w:t>
+      </w:r>
+      <w:r>
+        <w:t xml:space="preserve"> </w:t>
+      </w:r>
+      <m:oMath>
+        <m:sSub>
+          <m:e>
+            <m:r>
+              <m:t>b</m:t>
+            </m:r>
+          </m:e>
+          <m:sub>
+            <m:r>
+              <m:t>6</m:t>
+            </m:r>
+          </m:sub>
+        </m:sSub>
+        <m:r>
+          <m:t>f</m:t>
+        </m:r>
+      </m:oMath>
+      <w:r>
+        <w:t xml:space="preserve"> </w:t>
+      </w:r>
+      <w:r>
+        <w:t xml:space="preserve">Rieske [2Fe-2S] cluster (T3), PSI (P700,</w:t>
+      </w:r>
+      <w:r>
+        <w:t xml:space="preserve"> </w:t>
+      </w:r>
+      <m:oMath>
+        <m:sSubSup>
+          <m:e>
+            <m:r>
+              <m:t>P</m:t>
+            </m:r>
+          </m:e>
+          <m:sub>
+            <m:r>
+              <m:t>700</m:t>
+            </m:r>
+          </m:sub>
+          <m:sup>
+            <m:r>
+              <m:rPr>
+                <m:sty m:val="p"/>
+              </m:rPr>
+              <m:t>+</m:t>
+            </m:r>
+            <m:r>
+              <m:rPr>
+                <m:sty m:val="p"/>
+              </m:rPr>
+              <m:t>•</m:t>
+            </m:r>
+          </m:sup>
+        </m:sSubSup>
+        <m:sSubSup>
+          <m:e>
+            <m:r>
+              <m:t>A</m:t>
+            </m:r>
+          </m:e>
+          <m:sub>
+            <m:r>
+              <m:t>1</m:t>
+            </m:r>
+          </m:sub>
+          <m:sup>
+            <m:r>
+              <m:rPr>
+                <m:sty m:val="p"/>
+              </m:rPr>
+              <m:t>−</m:t>
+            </m:r>
+            <m:r>
+              <m:rPr>
+                <m:sty m:val="p"/>
+              </m:rPr>
+              <m:t>•</m:t>
+            </m:r>
+          </m:sup>
+        </m:sSubSup>
+      </m:oMath>
+      <w:r>
+        <w:t xml:space="preserve"> </w:t>
+      </w:r>
+      <w:r>
+        <w:t xml:space="preserve">radical pair, T2), and Ferredoxin/FNR (T2). (Bottom) Mitochondrial respiration (QBM-01) showing electron transport via Complex I and III to the ubiquinone pool, and the vital</w:t>
+      </w:r>
+      <w:r>
+        <w:t xml:space="preserve"> </w:t>
+      </w:r>
+      <w:r>
+        <w:rPr>
+          <w:b/>
+          <w:bCs/>
+        </w:rPr>
+        <w:t xml:space="preserve">Alternative Oxidase (AOX)</w:t>
+      </w:r>
+      <w:r>
+        <w:t xml:space="preserve"> </w:t>
+      </w:r>
+      <w:r>
+        <w:t xml:space="preserve">cyanide-resistant bypass [T2], which directly vents excess redox pressure to</w:t>
+      </w:r>
+      <w:r>
+        <w:t xml:space="preserve"> </w:t>
+      </w:r>
+      <m:oMath>
+        <m:sSub>
+          <m:e>
+            <m:r>
+              <m:rPr>
+                <m:nor/>
+                <m:sty m:val="p"/>
+              </m:rPr>
+              <m:t>O</m:t>
+            </m:r>
+          </m:e>
+          <m:sub>
+            <m:r>
+              <m:t>2</m:t>
+            </m:r>
+          </m:sub>
+        </m:sSub>
+      </m:oMath>
+      <w:r>
+        <w:t xml:space="preserve"> </w:t>
+      </w:r>
+      <w:r>
+        <w:t xml:space="preserve">without proton pumping, dampening catastrophic superoxide runaway.</w:t>
+      </w:r>
+    </w:p>
+    <w:bookmarkStart w:id="37" w:name="Xe0679b0bbf85623df9adac5f6fafff9a4e5dd86"/>
+    <w:p>
+      <w:pPr>
+        <w:pStyle w:val="Heading3"/>
+      </w:pPr>
+      <w:r>
+        <w:t xml:space="preserve">4.1 Defining Quantum Biology &amp; The 0–72 h Energy Route</w:t>
+      </w:r>
+    </w:p>
+    <w:p>
+      <w:pPr>
+        <w:pStyle w:val="FirstParagraph"/>
+      </w:pPr>
+      <w:r>
         <w:rPr>
           <w:b/>
           <w:bCs/>
@@ -7161,7 +9079,7 @@
         <w:t xml:space="preserve"> </w:t>
       </w:r>
       <w:r>
-        <w:t xml:space="preserve">[55] (Figure 3a). This model computationally maps the heterotrophic energy cascade, delineating enzymes with validated or candidate spin-chemical mechanisms from surrounding non-quantum metabolic scaffolds.</w:t>
+        <w:t xml:space="preserve">[55] (Figure 4a). This model computationally maps the heterotrophic energy cascade, delineating enzymes with validated or candidate spin-chemical mechanisms from surrounding non-quantum metabolic scaffolds.</w:t>
       </w:r>
     </w:p>
     <w:p>
@@ -7169,7 +9087,7 @@
         <w:pStyle w:val="BodyText"/>
       </w:pPr>
       <w:r>
-        <w:t xml:space="preserve">During the first 72 hours post-imbibition, the plant embryo possesses no functional chloroplasts. Energy production relies entirely on catabolizing stored lipids (triacylglycerols, TAGs) stored in seed oil bodies (Figure 3a):</w:t>
+        <w:t xml:space="preserve">During the first 72 hours post-imbibition, the plant embryo possesses no functional chloroplasts. Energy production relies entirely on catabolizing stored lipids (triacylglycerols, TAGs) stored in seed oil bodies (Figure 4a):</w:t>
       </w:r>
       <w:r>
         <w:t xml:space="preserve"> </w:t>
@@ -7573,14 +9491,14 @@
         <w:t xml:space="preserve">). Inactivation of aconitase throttles TCA cycle flux, acting as an internal metabolic brake when mitochondrial ROS levels exceed physiological limits.</w:t>
       </w:r>
     </w:p>
-    <w:bookmarkEnd w:id="26"/>
-    <w:bookmarkStart w:id="27" w:name="X47189a6742d435d1b399e4072d9cb6d7d351068"/>
+    <w:bookmarkEnd w:id="37"/>
+    <w:bookmarkStart w:id="38" w:name="X47189a6742d435d1b399e4072d9cb6d7d351068"/>
     <w:p>
       <w:pPr>
         <w:pStyle w:val="Heading3"/>
       </w:pPr>
       <w:r>
-        <w:t xml:space="preserve">3.2 The Evidentiary Hierarchy &amp; Biophysical Timescales</w:t>
+        <w:t xml:space="preserve">4.2 The Evidentiary Hierarchy &amp; Biophysical Timescales</w:t>
       </w:r>
     </w:p>
     <w:p>
@@ -7606,7 +9524,7 @@
         <w:t xml:space="preserve">evidence_tier</w:t>
       </w:r>
       <w:r>
-        <w:t xml:space="preserve">) [55] (Figure 3b):</w:t>
+        <w:t xml:space="preserve">) [55] (Figure 4b):</w:t>
       </w:r>
       <w:r>
         <w:t xml:space="preserve"> </w:t>
@@ -8177,14 +10095,14 @@
         <w:t xml:space="preserve">Structural proteins and metabolic enzymes that lack direct quantum magnetosensitivity but form the requisite physical scaffold for electron transport and substrate flux.</w:t>
       </w:r>
     </w:p>
-    <w:bookmarkEnd w:id="27"/>
-    <w:bookmarkStart w:id="28" w:name="X23607cf7f83ac68f3fa7e48facb8451bd879e21"/>
+    <w:bookmarkEnd w:id="38"/>
+    <w:bookmarkStart w:id="39" w:name="X23607cf7f83ac68f3fa7e48facb8451bd879e21"/>
     <w:p>
       <w:pPr>
         <w:pStyle w:val="Heading3"/>
       </w:pPr>
       <w:r>
-        <w:t xml:space="preserve">3.3 Refutation of Unphysical Biophysical Hypotheses</w:t>
+        <w:t xml:space="preserve">4.3 Refutation of Unphysical Biophysical Hypotheses</w:t>
       </w:r>
     </w:p>
     <w:p>
@@ -8551,15 +10469,15 @@
         </w:pict>
       </w:r>
     </w:p>
-    <w:bookmarkEnd w:id="28"/>
-    <w:bookmarkEnd w:id="29"/>
-    <w:bookmarkStart w:id="36" w:name="X85037b07a43ba8a6ca07dd5271da38371d3a519"/>
+    <w:bookmarkEnd w:id="39"/>
+    <w:bookmarkEnd w:id="40"/>
+    <w:bookmarkStart w:id="47" w:name="X85037b07a43ba8a6ca07dd5271da38371d3a519"/>
     <w:p>
       <w:pPr>
         <w:pStyle w:val="Heading2"/>
       </w:pPr>
       <w:r>
-        <w:t xml:space="preserve">4. Multi-Stressor Convergence: The</w:t>
+        <w:t xml:space="preserve">5. Multi-Stressor Convergence: The</w:t>
       </w:r>
       <w:r>
         <w:t xml:space="preserve"> </w:t>
@@ -8661,7 +10579,7 @@
         <w:t xml:space="preserve"> </w:t>
       </w:r>
       <w:r>
-        <w:t xml:space="preserve">[7,8,66] (Figure 4a).</w:t>
+        <w:t xml:space="preserve">[7,8,66] (Figure 5a).</w:t>
       </w:r>
     </w:p>
     <w:p>
@@ -8759,7 +10677,7 @@
         <w:t xml:space="preserve"> </w:t>
       </w:r>
       <w:r>
-        <w:t xml:space="preserve">(Core Concept 5).</w:t>
+        <w:t xml:space="preserve">(Figure 5; Core Concept 5).</w:t>
       </w:r>
     </w:p>
     <w:p>
@@ -8771,18 +10689,18 @@
           <wp:inline>
             <wp:extent cx="5334000" cy="4331025"/>
             <wp:effectExtent b="0" l="0" r="0" t="0"/>
-            <wp:docPr descr="Figure 4" title="" id="31" name="Picture"/>
+            <wp:docPr descr="Figure 5" title="" id="42" name="Picture"/>
             <a:graphic>
               <a:graphicData uri="http://schemas.openxmlformats.org/drawingml/2006/picture">
                 <pic:pic>
                   <pic:nvPicPr>
-                    <pic:cNvPr descr="/Users/drb_laptop/Documents/NMF_review/figures/Fig4_multistressor_co2_o2_ros_nexus.png" id="32" name="Picture"/>
+                    <pic:cNvPr descr="/Users/drb_laptop/Documents/NMF_review/figures/Fig5_multistressor_co2_o2_ros_nexus.png" id="43" name="Picture"/>
                     <pic:cNvPicPr>
                       <a:picLocks noChangeArrowheads="1" noChangeAspect="1"/>
                     </pic:cNvPicPr>
                   </pic:nvPicPr>
                   <pic:blipFill>
-                    <a:blip r:embed="rId30"/>
+                    <a:blip r:embed="rId41"/>
                     <a:stretch>
                       <a:fillRect/>
                     </a:stretch>
@@ -8816,7 +10734,7 @@
           <w:b/>
           <w:bCs/>
         </w:rPr>
-        <w:t xml:space="preserve">Figure 4 | Multi-stressor convergence on the organellar</w:t>
+        <w:t xml:space="preserve">Figure 5 | Multi-stressor convergence on the organellar</w:t>
       </w:r>
       <w:r>
         <w:rPr>
@@ -9737,13 +11655,13 @@
         <w:t xml:space="preserve">Conserved spaceflight mitochondrial phenotype. In plants, the mitochondrial ETC, AOX bypass, and Fe-S cluster turnover buffer hypomagnetic and radiation stress to preserve BLSS crop yield. In astronauts, mitochondrial dysregulation represents the single most conserved systemic spaceflight lesion (NASA Twins Study; Afshinnekoo et al. [67]), linking plant bioenergetics directly to crew health and food security.</w:t>
       </w:r>
     </w:p>
-    <w:bookmarkStart w:id="33" w:name="exploration-atmosphere-the-gas-balance"/>
+    <w:bookmarkStart w:id="44" w:name="exploration-atmosphere-the-gas-balance"/>
     <w:p>
       <w:pPr>
         <w:pStyle w:val="Heading3"/>
       </w:pPr>
       <w:r>
-        <w:t xml:space="preserve">4.1 Exploration Atmosphere &amp; The Gas Balance</w:t>
+        <w:t xml:space="preserve">5.1 Exploration Atmosphere &amp; The Gas Balance</w:t>
       </w:r>
     </w:p>
     <w:p>
@@ -10596,14 +12514,14 @@
         <w:t xml:space="preserve">) at Complexes I and III [60,70].</w:t>
       </w:r>
     </w:p>
-    <w:bookmarkEnd w:id="33"/>
-    <w:bookmarkStart w:id="34" w:name="Xb39b9264bedb3c8a3f94924d252feb42e93ab4f"/>
+    <w:bookmarkEnd w:id="44"/>
+    <w:bookmarkStart w:id="45" w:name="Xb39b9264bedb3c8a3f94924d252feb42e93ab4f"/>
     <w:p>
       <w:pPr>
         <w:pStyle w:val="Heading3"/>
       </w:pPr>
       <w:r>
-        <w:t xml:space="preserve">4.2 Multi-Omics Empirical Convergence: Radiation vs. Near-Null Fields</w:t>
+        <w:t xml:space="preserve">5.2 Multi-Omics Empirical Convergence: Radiation vs. Near-Null Fields</w:t>
       </w:r>
     </w:p>
     <w:p>
@@ -10870,7 +12788,7 @@
         <w:t xml:space="preserve"> </w:t>
       </w:r>
       <w:r>
-        <w:t xml:space="preserve">(~30 nT vs. GMF, 10 min–96 h) via the Quantum Biology Atlas overlap pipeline [55] (Figure 4c).</w:t>
+        <w:t xml:space="preserve">(~30 nT vs. GMF, 10 min–96 h) via the Quantum Biology Atlas overlap pipeline [55] (Figure 5c).</w:t>
       </w:r>
     </w:p>
     <w:p>
@@ -11432,14 +13350,14 @@
         <w:t xml:space="preserve">). This divergence underscores that entire gene families do not act as monolithic units; specific isoforms execute distinct regulatory roles in response to radiolytic versus magnetic perturbations.</w:t>
       </w:r>
     </w:p>
-    <w:bookmarkEnd w:id="34"/>
-    <w:bookmarkStart w:id="35" w:name="X2a1c2c32e3ea60f58103c74ede25849cd4b1ed2"/>
+    <w:bookmarkEnd w:id="45"/>
+    <w:bookmarkStart w:id="46" w:name="X2a1c2c32e3ea60f58103c74ede25849cd4b1ed2"/>
     <w:p>
       <w:pPr>
         <w:pStyle w:val="Heading3"/>
       </w:pPr>
       <w:r>
-        <w:t xml:space="preserve">4.3 Cross-Kingdom Parallels with Human Astronaut Mitochondrial Health</w:t>
+        <w:t xml:space="preserve">5.3 Cross-Kingdom Parallels with Human Astronaut Mitochondrial Health</w:t>
       </w:r>
     </w:p>
     <w:p>
@@ -11537,7 +13455,7 @@
         <w:t xml:space="preserve"> </w:t>
       </w:r>
       <w:r>
-        <w:t xml:space="preserve">[67,74] (Figure 4d).</w:t>
+        <w:t xml:space="preserve">[67,74] (Figure 5d).</w:t>
       </w:r>
     </w:p>
     <w:p>
@@ -11584,15 +13502,15 @@
         </w:pict>
       </w:r>
     </w:p>
-    <w:bookmarkEnd w:id="35"/>
-    <w:bookmarkEnd w:id="36"/>
-    <w:bookmarkStart w:id="44" w:name="X010ece94745ab7bbcd058eee9e1efe2b7b58067"/>
+    <w:bookmarkEnd w:id="46"/>
+    <w:bookmarkEnd w:id="47"/>
+    <w:bookmarkStart w:id="55" w:name="X010ece94745ab7bbcd058eee9e1efe2b7b58067"/>
     <w:p>
       <w:pPr>
         <w:pStyle w:val="Heading2"/>
       </w:pPr>
       <w:r>
-        <w:t xml:space="preserve">5. Scientific Knowledge Gap Retirement, Ground Simulation Standards, and Flight Instrumentation Trade Space</w:t>
+        <w:t xml:space="preserve">6. Scientific Knowledge Gap Retirement, Ground Simulation Standards, and Flight Instrumentation Trade Space</w:t>
       </w:r>
     </w:p>
     <w:p>
@@ -11600,7 +13518,7 @@
         <w:pStyle w:val="FirstParagraph"/>
       </w:pPr>
       <w:r>
-        <w:t xml:space="preserve">The historical hypomagnetic literature has frequently suffered from contradictory findings and irreproducibility, stemming from inadequate environmental controls, lack of sham controls, and uncharacterized electromagnetic interference (EMI) [11,20,78]. To transition lunar magnetobiology into an operational scientific discipline for Artemis payloads, we formulate a standardized framework focusing on rigorous ground simulation methods, causal validation, and post-flight phenotypic disambiguation (Figure 5).</w:t>
+        <w:t xml:space="preserve">The historical hypomagnetic literature has frequently suffered from contradictory findings and irreproducibility, stemming from inadequate environmental controls, lack of sham controls, and uncharacterized electromagnetic interference (EMI) [11,20,78]. To transition lunar magnetobiology into an operational scientific discipline for Artemis payloads, we formulate a standardized framework focusing on rigorous ground simulation methods, causal validation, and post-flight phenotypic disambiguation (Figure 6).</w:t>
       </w:r>
     </w:p>
     <w:p>
@@ -11612,18 +13530,18 @@
           <wp:inline>
             <wp:extent cx="5334000" cy="4446945"/>
             <wp:effectExtent b="0" l="0" r="0" t="0"/>
-            <wp:docPr descr="Figure 5" title="" id="38" name="Picture"/>
+            <wp:docPr descr="Figure 6" title="" id="49" name="Picture"/>
             <a:graphic>
               <a:graphicData uri="http://schemas.openxmlformats.org/drawingml/2006/picture">
                 <pic:pic>
                   <pic:nvPicPr>
-                    <pic:cNvPr descr="/Users/drb_laptop/Documents/NMF_review/figures/Fig5_flight_validation_risk_pipeline.png" id="39" name="Picture"/>
+                    <pic:cNvPr descr="/Users/drb_laptop/Documents/NMF_review/figures/Fig6_flight_validation_risk_pipeline.png" id="50" name="Picture"/>
                     <pic:cNvPicPr>
                       <a:picLocks noChangeArrowheads="1" noChangeAspect="1"/>
                     </pic:cNvPicPr>
                   </pic:nvPicPr>
                   <pic:blipFill>
-                    <a:blip r:embed="rId37"/>
+                    <a:blip r:embed="rId48"/>
                     <a:stretch>
                       <a:fillRect/>
                     </a:stretch>
@@ -11657,7 +13575,7 @@
           <w:b/>
           <w:bCs/>
         </w:rPr>
-        <w:t xml:space="preserve">Figure 5 | Ground simulation standards, hardware self-magnetic assessment protocol, and post-flight phenotypic disambiguation framework.</w:t>
+        <w:t xml:space="preserve">Figure 6 | Ground simulation standards, hardware self-magnetic assessment protocol, and post-flight phenotypic disambiguation framework.</w:t>
       </w:r>
       <w:r>
         <w:br/>
@@ -12455,7 +14373,7 @@
         <w:t xml:space="preserve"> </w:t>
       </w:r>
       <w:r>
-        <w:t xml:space="preserve">Comprehensive comparative matrix translating empirical ground and flight telemetry to decouple overlapping environmental stressors in lunar agricultural payloads (Table 3), distinguishing Hypomagnetic Field lesions (emergence lag, cryptochrome-HY5 chlorosis, AOX1D induction without DNA breaks) from Lunar Partial Gravity (</w:t>
+        <w:t xml:space="preserve">Comprehensive comparative matrix translating empirical ground and flight telemetry to decouple overlapping environmental stressors in lunar agricultural payloads (Table 4), distinguishing Hypomagnetic Field lesions (emergence lag, cryptochrome-HY5 chlorosis, AOX1D induction without DNA breaks) from Lunar Partial Gravity (</w:t>
       </w:r>
       <m:oMath>
         <m:r>
@@ -12483,13 +14401,13 @@
         <w:t xml:space="preserve">-H2AX foci).</w:t>
       </w:r>
     </w:p>
-    <w:bookmarkStart w:id="40" w:name="X5a6cab0ce20cddfc1b83a6c9ec27c525a7de980"/>
+    <w:bookmarkStart w:id="51" w:name="X5a6cab0ce20cddfc1b83a6c9ec27c525a7de980"/>
     <w:p>
       <w:pPr>
         <w:pStyle w:val="Heading3"/>
       </w:pPr>
       <w:r>
-        <w:t xml:space="preserve">5.1 Stage 1: Ground Simulation Standards and Experimental Controls</w:t>
+        <w:t xml:space="preserve">6.1 Stage 1: Ground Simulation Standards and Experimental Controls</w:t>
       </w:r>
     </w:p>
     <w:p>
@@ -12720,17 +14638,17 @@
         <w:t xml:space="preserve"> </w:t>
       </w:r>
       <w:r>
-        <w:t xml:space="preserve">as an obligatory negative magnetic control [11,78] (Figure 5a). In a bifilar sham configuration, paired wires carry equal currents in opposite directions, producing complete net magnetic field cancellation while generating identical resistive heat, current loads, and acoustic vibration as the active cancellation coils. Any biological difference observed between the active near-null chamber and the bifilar sham chamber can then be unambiguously attributed to the magnetic vector itself.</w:t>
+        <w:t xml:space="preserve">as an obligatory negative magnetic control [11,78] (Figure 6a). In a bifilar sham configuration, paired wires carry equal currents in opposite directions, producing complete net magnetic field cancellation while generating identical resistive heat, current loads, and acoustic vibration as the active cancellation coils. Any biological difference observed between the active near-null chamber and the bifilar sham chamber can then be unambiguously attributed to the magnetic vector itself.</w:t>
       </w:r>
     </w:p>
-    <w:bookmarkEnd w:id="40"/>
-    <w:bookmarkStart w:id="41" w:name="X3176de122914450ed1a5a6b1fe8669a2353144e"/>
+    <w:bookmarkEnd w:id="51"/>
+    <w:bookmarkStart w:id="52" w:name="X3176de122914450ed1a5a6b1fe8669a2353144e"/>
     <w:p>
       <w:pPr>
         <w:pStyle w:val="Heading3"/>
       </w:pPr>
       <w:r>
-        <w:t xml:space="preserve">5.2 Stage 2: Hardware Self-Magnetic Assessment Protocol and Power-State Mapping</w:t>
+        <w:t xml:space="preserve">6.2 Stage 2: Hardware Self-Magnetic Assessment Protocol and Power-State Mapping</w:t>
       </w:r>
     </w:p>
     <w:p>
@@ -12738,7 +14656,7 @@
         <w:pStyle w:val="FirstParagraph"/>
       </w:pPr>
       <w:r>
-        <w:t xml:space="preserve">In spaceflight agricultural payloads and sealed environmental enclosures, the growth hardware itself constitutes a primary, dynamic source of magnetic interference [11]. Internal DC currents feeding LEDs, fluidic pumps, heaters, and avionics generate localized stray fields (5 to &gt;50 µT) that vary continuously with subsystem operational power settings (Figure 5b). To decouple these hardware self-fields from the ambient lunar near-null environment without requiring mass-prohibitive magnetic shielding, engineering teams must execute a pre-flight and in-flight</w:t>
+        <w:t xml:space="preserve">In spaceflight agricultural payloads and sealed environmental enclosures, the growth hardware itself constitutes a primary, dynamic source of magnetic interference [11]. Internal DC currents feeding LEDs, fluidic pumps, heaters, and avionics generate localized stray fields (5 to &gt;50 µT) that vary continuously with subsystem operational power settings (Figure 6b). To decouple these hardware self-fields from the ambient lunar near-null environment without requiring mass-prohibitive magnetic shielding, engineering teams must execute a pre-flight and in-flight</w:t>
       </w:r>
       <w:r>
         <w:t xml:space="preserve"> </w:t>
@@ -13875,14 +15793,14 @@
         <w:t xml:space="preserve">This deconvolution protocol establishes a rigorous mathematical transfer function, enabling flight science teams to retire the environmental characterization gap purely through telemetry analysis.</w:t>
       </w:r>
     </w:p>
-    <w:bookmarkEnd w:id="41"/>
-    <w:bookmarkStart w:id="42" w:name="X9256c05d803a4956fb130d72280f015ff9aee3d"/>
+    <w:bookmarkEnd w:id="52"/>
+    <w:bookmarkStart w:id="53" w:name="X9256c05d803a4956fb130d72280f015ff9aee3d"/>
     <w:p>
       <w:pPr>
         <w:pStyle w:val="Heading3"/>
       </w:pPr>
       <w:r>
-        <w:t xml:space="preserve">5.3 Stage 3: Delineating Scientific Gaps from Flight Payload Engineering Constraints</w:t>
+        <w:t xml:space="preserve">6.3 Stage 3: Delineating Scientific Gaps from Flight Payload Engineering Constraints</w:t>
       </w:r>
     </w:p>
     <w:p>
@@ -14143,14 +16061,14 @@
         <w:t xml:space="preserve">), significant Joule heating, and severe spacecraft electromagnetic compatibility (EMC/EMI) certification hurdles. Such active intervention systems exceed typical payload resource envelopes and are appropriately prioritized for ground simulation facilities rather than initial lunar surface instruments.</w:t>
       </w:r>
     </w:p>
-    <w:bookmarkEnd w:id="42"/>
-    <w:bookmarkStart w:id="43" w:name="X66ca7d27465b90b43e87ceb0659be82b5dc313d"/>
+    <w:bookmarkEnd w:id="53"/>
+    <w:bookmarkStart w:id="54" w:name="X66ca7d27465b90b43e87ceb0659be82b5dc313d"/>
     <w:p>
       <w:pPr>
         <w:pStyle w:val="Heading3"/>
       </w:pPr>
       <w:r>
-        <w:t xml:space="preserve">5.4 Stage 4: Post-Flight Phenotypic Disambiguation and Translational Science Framework</w:t>
+        <w:t xml:space="preserve">6.4 Stage 4: Post-Flight Phenotypic Disambiguation and Translational Science Framework</w:t>
       </w:r>
     </w:p>
     <w:p>
@@ -14174,7 +16092,7 @@
         <w:t xml:space="preserve"> </w:t>
       </w:r>
       <w:r>
-        <w:t xml:space="preserve">to interpret seedling performance and identify the primary causal stressors operating on the lunar surface (Figure 5c; Table 3):</w:t>
+        <w:t xml:space="preserve">to interpret seedling performance and identify the primary causal stressors operating on the lunar surface (Figure 6c; Table 4):</w:t>
       </w:r>
       <w:r>
         <w:t xml:space="preserve"> </w:t>
@@ -14481,7 +16399,7 @@
           <w:b/>
           <w:bCs/>
         </w:rPr>
-        <w:t xml:space="preserve">Table 3 | Phenotypic risk disambiguation matrix for space plant biology.</w:t>
+        <w:t xml:space="preserve">Table 4 | Phenotypic risk disambiguation matrix for space plant biology.</w:t>
       </w:r>
       <w:r>
         <w:t xml:space="preserve"> </w:t>
@@ -15498,15 +17416,15 @@
         </w:pict>
       </w:r>
     </w:p>
-    <w:bookmarkEnd w:id="43"/>
-    <w:bookmarkEnd w:id="44"/>
-    <w:bookmarkStart w:id="45" w:name="Xbea3edd5a7aeb15038300f903f189dad42dcce3"/>
+    <w:bookmarkEnd w:id="54"/>
+    <w:bookmarkEnd w:id="55"/>
+    <w:bookmarkStart w:id="56" w:name="Xbea3edd5a7aeb15038300f903f189dad42dcce3"/>
     <w:p>
       <w:pPr>
         <w:pStyle w:val="Heading2"/>
       </w:pPr>
       <w:r>
-        <w:t xml:space="preserve">6. Conclusions &amp; Forward Look for Sustained Lunar Agriculture</w:t>
+        <w:t xml:space="preserve">7. Conclusions &amp; Forward Look for Sustained Lunar Agriculture</w:t>
       </w:r>
     </w:p>
     <w:p>
@@ -16131,8 +18049,8 @@
         </w:pict>
       </w:r>
     </w:p>
-    <w:bookmarkEnd w:id="45"/>
-    <w:bookmarkStart w:id="46" w:name="acknowledgements"/>
+    <w:bookmarkEnd w:id="56"/>
+    <w:bookmarkStart w:id="57" w:name="acknowledgements"/>
     <w:p>
       <w:pPr>
         <w:pStyle w:val="Heading2"/>
@@ -16149,8 +18067,8 @@
         <w:t xml:space="preserve">This work was supported by NASA Biological and Physical Sciences (BPS) awards and internal institutional support from the Department of Agricultural and Biological Engineering and the Department of Earth, Atmospheric, and Planetary Sciences at Purdue University. The authors thank the members of the NASA LEAF payload science team and the NASA GeneLab / Open Science Data Repository (OSDR) Plant AWG for insightful discussions regarding spaceflight multi-omics and environmental sensor integration.</w:t>
       </w:r>
     </w:p>
-    <w:bookmarkEnd w:id="46"/>
-    <w:bookmarkStart w:id="47" w:name="author-contributions"/>
+    <w:bookmarkEnd w:id="57"/>
+    <w:bookmarkStart w:id="58" w:name="author-contributions"/>
     <w:p>
       <w:pPr>
         <w:pStyle w:val="Heading2"/>
@@ -16380,8 +18298,8 @@
         <w:t xml:space="preserve">contributed to payload engineering requirements and causal validation pipelines. All authors contributed to writing, critical revision, and approved the final manuscript.</w:t>
       </w:r>
     </w:p>
-    <w:bookmarkEnd w:id="47"/>
-    <w:bookmarkStart w:id="48" w:name="competing-interests"/>
+    <w:bookmarkEnd w:id="58"/>
+    <w:bookmarkStart w:id="59" w:name="competing-interests"/>
     <w:p>
       <w:pPr>
         <w:pStyle w:val="Heading2"/>
@@ -16398,8 +18316,8 @@
         <w:t xml:space="preserve">D.M.P. is a Co-Investigator on the NASA Artemis III LEAF payload; C.C. is affiliated with Space Lab Technologies, LLC. These roles are disclosed with no commercial or financial conflicts of interest. The remaining authors declare no competing interests.</w:t>
       </w:r>
     </w:p>
-    <w:bookmarkEnd w:id="48"/>
-    <w:bookmarkStart w:id="49" w:name="data-availability"/>
+    <w:bookmarkEnd w:id="59"/>
+    <w:bookmarkStart w:id="60" w:name="data-availability"/>
     <w:p>
       <w:pPr>
         <w:pStyle w:val="Heading2"/>
@@ -16447,8 +18365,8 @@
         </w:pict>
       </w:r>
     </w:p>
-    <w:bookmarkEnd w:id="49"/>
-    <w:bookmarkStart w:id="50" w:name="references"/>
+    <w:bookmarkEnd w:id="60"/>
+    <w:bookmarkStart w:id="61" w:name="references"/>
     <w:p>
       <w:pPr>
         <w:pStyle w:val="Heading2"/>
@@ -16462,7 +18380,7 @@
         <w:pStyle w:val="Compact"/>
         <w:numPr>
           <w:ilvl w:val="0"/>
-          <w:numId w:val="1002"/>
+          <w:numId w:val="1003"/>
         </w:numPr>
       </w:pPr>
       <w:r>
@@ -16490,7 +18408,7 @@
         <w:pStyle w:val="Compact"/>
         <w:numPr>
           <w:ilvl w:val="0"/>
-          <w:numId w:val="1002"/>
+          <w:numId w:val="1003"/>
         </w:numPr>
       </w:pPr>
       <w:r>
@@ -16525,7 +18443,7 @@
         <w:pStyle w:val="Compact"/>
         <w:numPr>
           <w:ilvl w:val="0"/>
-          <w:numId w:val="1002"/>
+          <w:numId w:val="1003"/>
         </w:numPr>
       </w:pPr>
       <w:r>
@@ -16560,7 +18478,7 @@
         <w:pStyle w:val="Compact"/>
         <w:numPr>
           <w:ilvl w:val="0"/>
-          <w:numId w:val="1002"/>
+          <w:numId w:val="1003"/>
         </w:numPr>
       </w:pPr>
       <w:r>
@@ -16595,7 +18513,7 @@
         <w:pStyle w:val="Compact"/>
         <w:numPr>
           <w:ilvl w:val="0"/>
-          <w:numId w:val="1002"/>
+          <w:numId w:val="1003"/>
         </w:numPr>
       </w:pPr>
       <w:r>
@@ -16630,7 +18548,7 @@
         <w:pStyle w:val="Compact"/>
         <w:numPr>
           <w:ilvl w:val="0"/>
-          <w:numId w:val="1002"/>
+          <w:numId w:val="1003"/>
         </w:numPr>
       </w:pPr>
       <w:r>
@@ -16658,7 +18576,7 @@
         <w:pStyle w:val="Compact"/>
         <w:numPr>
           <w:ilvl w:val="0"/>
-          <w:numId w:val="1002"/>
+          <w:numId w:val="1003"/>
         </w:numPr>
       </w:pPr>
       <w:r>
@@ -16693,7 +18611,7 @@
         <w:pStyle w:val="Compact"/>
         <w:numPr>
           <w:ilvl w:val="0"/>
-          <w:numId w:val="1002"/>
+          <w:numId w:val="1003"/>
         </w:numPr>
       </w:pPr>
       <w:r>
@@ -16718,7 +18636,7 @@
         <w:pStyle w:val="Compact"/>
         <w:numPr>
           <w:ilvl w:val="0"/>
-          <w:numId w:val="1002"/>
+          <w:numId w:val="1003"/>
         </w:numPr>
       </w:pPr>
       <w:r>
@@ -16769,7 +18687,7 @@
         <w:pStyle w:val="Compact"/>
         <w:numPr>
           <w:ilvl w:val="0"/>
-          <w:numId w:val="1002"/>
+          <w:numId w:val="1003"/>
         </w:numPr>
       </w:pPr>
       <w:r>
@@ -16804,7 +18722,7 @@
         <w:pStyle w:val="Compact"/>
         <w:numPr>
           <w:ilvl w:val="0"/>
-          <w:numId w:val="1002"/>
+          <w:numId w:val="1003"/>
         </w:numPr>
       </w:pPr>
       <w:r>
@@ -16861,7 +18779,7 @@
         <w:pStyle w:val="Compact"/>
         <w:numPr>
           <w:ilvl w:val="0"/>
-          <w:numId w:val="1002"/>
+          <w:numId w:val="1003"/>
         </w:numPr>
       </w:pPr>
       <w:r>
@@ -16896,7 +18814,7 @@
         <w:pStyle w:val="Compact"/>
         <w:numPr>
           <w:ilvl w:val="0"/>
-          <w:numId w:val="1002"/>
+          <w:numId w:val="1003"/>
         </w:numPr>
       </w:pPr>
       <w:r>
@@ -16931,7 +18849,7 @@
         <w:pStyle w:val="Compact"/>
         <w:numPr>
           <w:ilvl w:val="0"/>
-          <w:numId w:val="1002"/>
+          <w:numId w:val="1003"/>
         </w:numPr>
       </w:pPr>
       <w:r>
@@ -16966,7 +18884,7 @@
         <w:pStyle w:val="Compact"/>
         <w:numPr>
           <w:ilvl w:val="0"/>
-          <w:numId w:val="1002"/>
+          <w:numId w:val="1003"/>
         </w:numPr>
       </w:pPr>
       <w:r>
@@ -17001,7 +18919,7 @@
         <w:pStyle w:val="Compact"/>
         <w:numPr>
           <w:ilvl w:val="0"/>
-          <w:numId w:val="1002"/>
+          <w:numId w:val="1003"/>
         </w:numPr>
       </w:pPr>
       <w:r>
@@ -17036,7 +18954,7 @@
         <w:pStyle w:val="Compact"/>
         <w:numPr>
           <w:ilvl w:val="0"/>
-          <w:numId w:val="1002"/>
+          <w:numId w:val="1003"/>
         </w:numPr>
       </w:pPr>
       <w:r>
@@ -17071,7 +18989,7 @@
         <w:pStyle w:val="Compact"/>
         <w:numPr>
           <w:ilvl w:val="0"/>
-          <w:numId w:val="1002"/>
+          <w:numId w:val="1003"/>
         </w:numPr>
       </w:pPr>
       <w:r>
@@ -17106,7 +19024,7 @@
         <w:pStyle w:val="Compact"/>
         <w:numPr>
           <w:ilvl w:val="0"/>
-          <w:numId w:val="1002"/>
+          <w:numId w:val="1003"/>
         </w:numPr>
       </w:pPr>
       <w:r>
@@ -17141,7 +19059,7 @@
         <w:pStyle w:val="Compact"/>
         <w:numPr>
           <w:ilvl w:val="0"/>
-          <w:numId w:val="1002"/>
+          <w:numId w:val="1003"/>
         </w:numPr>
       </w:pPr>
       <w:r>
@@ -17176,7 +19094,7 @@
         <w:pStyle w:val="Compact"/>
         <w:numPr>
           <w:ilvl w:val="0"/>
-          <w:numId w:val="1002"/>
+          <w:numId w:val="1003"/>
         </w:numPr>
       </w:pPr>
       <w:r>
@@ -17211,7 +19129,7 @@
         <w:pStyle w:val="Compact"/>
         <w:numPr>
           <w:ilvl w:val="0"/>
-          <w:numId w:val="1002"/>
+          <w:numId w:val="1003"/>
         </w:numPr>
       </w:pPr>
       <w:r>
@@ -17246,7 +19164,7 @@
         <w:pStyle w:val="Compact"/>
         <w:numPr>
           <w:ilvl w:val="0"/>
-          <w:numId w:val="1002"/>
+          <w:numId w:val="1003"/>
         </w:numPr>
       </w:pPr>
       <w:r>
@@ -17281,7 +19199,7 @@
         <w:pStyle w:val="Compact"/>
         <w:numPr>
           <w:ilvl w:val="0"/>
-          <w:numId w:val="1002"/>
+          <w:numId w:val="1003"/>
         </w:numPr>
       </w:pPr>
       <w:r>
@@ -17316,7 +19234,7 @@
         <w:pStyle w:val="Compact"/>
         <w:numPr>
           <w:ilvl w:val="0"/>
-          <w:numId w:val="1002"/>
+          <w:numId w:val="1003"/>
         </w:numPr>
       </w:pPr>
       <w:r>
@@ -17351,7 +19269,7 @@
         <w:pStyle w:val="Compact"/>
         <w:numPr>
           <w:ilvl w:val="0"/>
-          <w:numId w:val="1002"/>
+          <w:numId w:val="1003"/>
         </w:numPr>
       </w:pPr>
       <w:r>
@@ -17386,7 +19304,7 @@
         <w:pStyle w:val="Compact"/>
         <w:numPr>
           <w:ilvl w:val="0"/>
-          <w:numId w:val="1002"/>
+          <w:numId w:val="1003"/>
         </w:numPr>
       </w:pPr>
       <w:r>
@@ -17421,7 +19339,7 @@
         <w:pStyle w:val="Compact"/>
         <w:numPr>
           <w:ilvl w:val="0"/>
-          <w:numId w:val="1002"/>
+          <w:numId w:val="1003"/>
         </w:numPr>
       </w:pPr>
       <w:r>
@@ -17469,7 +19387,7 @@
         <w:pStyle w:val="Compact"/>
         <w:numPr>
           <w:ilvl w:val="0"/>
-          <w:numId w:val="1002"/>
+          <w:numId w:val="1003"/>
         </w:numPr>
       </w:pPr>
       <w:r>
@@ -17520,7 +19438,7 @@
         <w:pStyle w:val="Compact"/>
         <w:numPr>
           <w:ilvl w:val="0"/>
-          <w:numId w:val="1002"/>
+          <w:numId w:val="1003"/>
         </w:numPr>
       </w:pPr>
       <w:r>
@@ -17555,7 +19473,7 @@
         <w:pStyle w:val="Compact"/>
         <w:numPr>
           <w:ilvl w:val="0"/>
-          <w:numId w:val="1002"/>
+          <w:numId w:val="1003"/>
         </w:numPr>
       </w:pPr>
       <w:r>
@@ -17590,7 +19508,7 @@
         <w:pStyle w:val="Compact"/>
         <w:numPr>
           <w:ilvl w:val="0"/>
-          <w:numId w:val="1002"/>
+          <w:numId w:val="1003"/>
         </w:numPr>
       </w:pPr>
       <w:r>
@@ -17625,7 +19543,7 @@
         <w:pStyle w:val="Compact"/>
         <w:numPr>
           <w:ilvl w:val="0"/>
-          <w:numId w:val="1002"/>
+          <w:numId w:val="1003"/>
         </w:numPr>
       </w:pPr>
       <w:r>
@@ -17660,7 +19578,7 @@
         <w:pStyle w:val="Compact"/>
         <w:numPr>
           <w:ilvl w:val="0"/>
-          <w:numId w:val="1002"/>
+          <w:numId w:val="1003"/>
         </w:numPr>
       </w:pPr>
       <w:r>
@@ -17695,7 +19613,7 @@
         <w:pStyle w:val="Compact"/>
         <w:numPr>
           <w:ilvl w:val="0"/>
-          <w:numId w:val="1002"/>
+          <w:numId w:val="1003"/>
         </w:numPr>
       </w:pPr>
       <w:r>
@@ -17746,7 +19664,7 @@
         <w:pStyle w:val="Compact"/>
         <w:numPr>
           <w:ilvl w:val="0"/>
-          <w:numId w:val="1002"/>
+          <w:numId w:val="1003"/>
         </w:numPr>
       </w:pPr>
       <w:r>
@@ -17797,7 +19715,7 @@
         <w:pStyle w:val="Compact"/>
         <w:numPr>
           <w:ilvl w:val="0"/>
-          <w:numId w:val="1002"/>
+          <w:numId w:val="1003"/>
         </w:numPr>
       </w:pPr>
       <w:r>
@@ -17845,7 +19763,7 @@
         <w:pStyle w:val="Compact"/>
         <w:numPr>
           <w:ilvl w:val="0"/>
-          <w:numId w:val="1002"/>
+          <w:numId w:val="1003"/>
         </w:numPr>
       </w:pPr>
       <w:r>
@@ -17880,7 +19798,7 @@
         <w:pStyle w:val="Compact"/>
         <w:numPr>
           <w:ilvl w:val="0"/>
-          <w:numId w:val="1002"/>
+          <w:numId w:val="1003"/>
         </w:numPr>
       </w:pPr>
       <w:r>
@@ -17942,7 +19860,7 @@
         <w:pStyle w:val="Compact"/>
         <w:numPr>
           <w:ilvl w:val="0"/>
-          <w:numId w:val="1002"/>
+          <w:numId w:val="1003"/>
         </w:numPr>
       </w:pPr>
       <w:r>
@@ -17977,7 +19895,7 @@
         <w:pStyle w:val="Compact"/>
         <w:numPr>
           <w:ilvl w:val="0"/>
-          <w:numId w:val="1002"/>
+          <w:numId w:val="1003"/>
         </w:numPr>
       </w:pPr>
       <w:r>
@@ -18005,7 +19923,7 @@
         <w:pStyle w:val="Compact"/>
         <w:numPr>
           <w:ilvl w:val="0"/>
-          <w:numId w:val="1002"/>
+          <w:numId w:val="1003"/>
         </w:numPr>
       </w:pPr>
       <w:r>
@@ -18040,7 +19958,7 @@
         <w:pStyle w:val="Compact"/>
         <w:numPr>
           <w:ilvl w:val="0"/>
-          <w:numId w:val="1002"/>
+          <w:numId w:val="1003"/>
         </w:numPr>
       </w:pPr>
       <w:r>
@@ -18075,7 +19993,7 @@
         <w:pStyle w:val="Compact"/>
         <w:numPr>
           <w:ilvl w:val="0"/>
-          <w:numId w:val="1002"/>
+          <w:numId w:val="1003"/>
         </w:numPr>
       </w:pPr>
       <w:r>
@@ -18110,7 +20028,7 @@
         <w:pStyle w:val="Compact"/>
         <w:numPr>
           <w:ilvl w:val="0"/>
-          <w:numId w:val="1002"/>
+          <w:numId w:val="1003"/>
         </w:numPr>
       </w:pPr>
       <w:r>
@@ -18161,7 +20079,7 @@
         <w:pStyle w:val="Compact"/>
         <w:numPr>
           <w:ilvl w:val="0"/>
-          <w:numId w:val="1002"/>
+          <w:numId w:val="1003"/>
         </w:numPr>
       </w:pPr>
       <w:r>
@@ -18235,7 +20153,7 @@
         <w:pStyle w:val="Compact"/>
         <w:numPr>
           <w:ilvl w:val="0"/>
-          <w:numId w:val="1002"/>
+          <w:numId w:val="1003"/>
         </w:numPr>
       </w:pPr>
       <w:r>
@@ -18270,7 +20188,7 @@
         <w:pStyle w:val="Compact"/>
         <w:numPr>
           <w:ilvl w:val="0"/>
-          <w:numId w:val="1002"/>
+          <w:numId w:val="1003"/>
         </w:numPr>
       </w:pPr>
       <w:r>
@@ -18305,7 +20223,7 @@
         <w:pStyle w:val="Compact"/>
         <w:numPr>
           <w:ilvl w:val="0"/>
-          <w:numId w:val="1002"/>
+          <w:numId w:val="1003"/>
         </w:numPr>
       </w:pPr>
       <w:r>
@@ -18340,7 +20258,7 @@
         <w:pStyle w:val="Compact"/>
         <w:numPr>
           <w:ilvl w:val="0"/>
-          <w:numId w:val="1002"/>
+          <w:numId w:val="1003"/>
         </w:numPr>
       </w:pPr>
       <w:r>
@@ -18391,7 +20309,7 @@
         <w:pStyle w:val="Compact"/>
         <w:numPr>
           <w:ilvl w:val="0"/>
-          <w:numId w:val="1002"/>
+          <w:numId w:val="1003"/>
         </w:numPr>
       </w:pPr>
       <w:r>
@@ -18439,7 +20357,7 @@
         <w:pStyle w:val="Compact"/>
         <w:numPr>
           <w:ilvl w:val="0"/>
-          <w:numId w:val="1002"/>
+          <w:numId w:val="1003"/>
         </w:numPr>
       </w:pPr>
       <w:r>
@@ -18474,7 +20392,7 @@
         <w:pStyle w:val="Compact"/>
         <w:numPr>
           <w:ilvl w:val="0"/>
-          <w:numId w:val="1002"/>
+          <w:numId w:val="1003"/>
         </w:numPr>
       </w:pPr>
       <w:r>
@@ -18522,7 +20440,7 @@
         <w:pStyle w:val="Compact"/>
         <w:numPr>
           <w:ilvl w:val="0"/>
-          <w:numId w:val="1002"/>
+          <w:numId w:val="1003"/>
         </w:numPr>
       </w:pPr>
       <w:r>
@@ -18573,7 +20491,7 @@
         <w:pStyle w:val="Compact"/>
         <w:numPr>
           <w:ilvl w:val="0"/>
-          <w:numId w:val="1002"/>
+          <w:numId w:val="1003"/>
         </w:numPr>
       </w:pPr>
       <w:r>
@@ -18601,7 +20519,7 @@
         <w:pStyle w:val="Compact"/>
         <w:numPr>
           <w:ilvl w:val="0"/>
-          <w:numId w:val="1002"/>
+          <w:numId w:val="1003"/>
         </w:numPr>
       </w:pPr>
       <w:r>
@@ -18636,7 +20554,7 @@
         <w:pStyle w:val="Compact"/>
         <w:numPr>
           <w:ilvl w:val="0"/>
-          <w:numId w:val="1002"/>
+          <w:numId w:val="1003"/>
         </w:numPr>
       </w:pPr>
       <w:r>
@@ -18671,7 +20589,7 @@
         <w:pStyle w:val="Compact"/>
         <w:numPr>
           <w:ilvl w:val="0"/>
-          <w:numId w:val="1002"/>
+          <w:numId w:val="1003"/>
         </w:numPr>
       </w:pPr>
       <w:r>
@@ -18722,7 +20640,7 @@
         <w:pStyle w:val="Compact"/>
         <w:numPr>
           <w:ilvl w:val="0"/>
-          <w:numId w:val="1002"/>
+          <w:numId w:val="1003"/>
         </w:numPr>
       </w:pPr>
       <w:r>
@@ -18757,7 +20675,7 @@
         <w:pStyle w:val="Compact"/>
         <w:numPr>
           <w:ilvl w:val="0"/>
-          <w:numId w:val="1002"/>
+          <w:numId w:val="1003"/>
         </w:numPr>
       </w:pPr>
       <w:r>
@@ -18792,7 +20710,7 @@
         <w:pStyle w:val="Compact"/>
         <w:numPr>
           <w:ilvl w:val="0"/>
-          <w:numId w:val="1002"/>
+          <w:numId w:val="1003"/>
         </w:numPr>
       </w:pPr>
       <w:r>
@@ -18827,7 +20745,7 @@
         <w:pStyle w:val="Compact"/>
         <w:numPr>
           <w:ilvl w:val="0"/>
-          <w:numId w:val="1002"/>
+          <w:numId w:val="1003"/>
         </w:numPr>
       </w:pPr>
       <w:r>
@@ -18862,7 +20780,7 @@
         <w:pStyle w:val="Compact"/>
         <w:numPr>
           <w:ilvl w:val="0"/>
-          <w:numId w:val="1002"/>
+          <w:numId w:val="1003"/>
         </w:numPr>
       </w:pPr>
       <w:r>
@@ -18897,7 +20815,7 @@
         <w:pStyle w:val="Compact"/>
         <w:numPr>
           <w:ilvl w:val="0"/>
-          <w:numId w:val="1002"/>
+          <w:numId w:val="1003"/>
         </w:numPr>
       </w:pPr>
       <w:r>
@@ -18955,7 +20873,7 @@
         <w:pStyle w:val="Compact"/>
         <w:numPr>
           <w:ilvl w:val="0"/>
-          <w:numId w:val="1002"/>
+          <w:numId w:val="1003"/>
         </w:numPr>
       </w:pPr>
       <w:r>
@@ -19013,7 +20931,7 @@
         <w:pStyle w:val="Compact"/>
         <w:numPr>
           <w:ilvl w:val="0"/>
-          <w:numId w:val="1002"/>
+          <w:numId w:val="1003"/>
         </w:numPr>
       </w:pPr>
       <w:r>
@@ -19048,7 +20966,7 @@
         <w:pStyle w:val="Compact"/>
         <w:numPr>
           <w:ilvl w:val="0"/>
-          <w:numId w:val="1002"/>
+          <w:numId w:val="1003"/>
         </w:numPr>
       </w:pPr>
       <w:r>
@@ -19083,7 +21001,7 @@
         <w:pStyle w:val="Compact"/>
         <w:numPr>
           <w:ilvl w:val="0"/>
-          <w:numId w:val="1002"/>
+          <w:numId w:val="1003"/>
         </w:numPr>
       </w:pPr>
       <w:r>
@@ -19118,7 +21036,7 @@
         <w:pStyle w:val="Compact"/>
         <w:numPr>
           <w:ilvl w:val="0"/>
-          <w:numId w:val="1002"/>
+          <w:numId w:val="1003"/>
         </w:numPr>
       </w:pPr>
       <w:r>
@@ -19153,7 +21071,7 @@
         <w:pStyle w:val="Compact"/>
         <w:numPr>
           <w:ilvl w:val="0"/>
-          <w:numId w:val="1002"/>
+          <w:numId w:val="1003"/>
         </w:numPr>
       </w:pPr>
       <w:r>
@@ -19188,7 +21106,7 @@
         <w:pStyle w:val="Compact"/>
         <w:numPr>
           <w:ilvl w:val="0"/>
-          <w:numId w:val="1002"/>
+          <w:numId w:val="1003"/>
         </w:numPr>
       </w:pPr>
       <w:r>
@@ -19223,7 +21141,7 @@
         <w:pStyle w:val="Compact"/>
         <w:numPr>
           <w:ilvl w:val="0"/>
-          <w:numId w:val="1002"/>
+          <w:numId w:val="1003"/>
         </w:numPr>
       </w:pPr>
       <w:r>
@@ -19258,7 +21176,7 @@
         <w:pStyle w:val="Compact"/>
         <w:numPr>
           <w:ilvl w:val="0"/>
-          <w:numId w:val="1002"/>
+          <w:numId w:val="1003"/>
         </w:numPr>
       </w:pPr>
       <w:r>
@@ -19306,7 +21224,7 @@
         <w:pStyle w:val="Compact"/>
         <w:numPr>
           <w:ilvl w:val="0"/>
-          <w:numId w:val="1002"/>
+          <w:numId w:val="1003"/>
         </w:numPr>
       </w:pPr>
       <w:r>
@@ -19341,7 +21259,7 @@
         <w:pStyle w:val="Compact"/>
         <w:numPr>
           <w:ilvl w:val="0"/>
-          <w:numId w:val="1002"/>
+          <w:numId w:val="1003"/>
         </w:numPr>
       </w:pPr>
       <w:r>
@@ -19376,7 +21294,7 @@
         <w:pStyle w:val="Compact"/>
         <w:numPr>
           <w:ilvl w:val="0"/>
-          <w:numId w:val="1002"/>
+          <w:numId w:val="1003"/>
         </w:numPr>
       </w:pPr>
       <w:r>
@@ -19411,7 +21329,7 @@
         <w:pStyle w:val="Compact"/>
         <w:numPr>
           <w:ilvl w:val="0"/>
-          <w:numId w:val="1002"/>
+          <w:numId w:val="1003"/>
         </w:numPr>
       </w:pPr>
       <w:r>
@@ -19446,7 +21364,7 @@
         <w:pStyle w:val="Compact"/>
         <w:numPr>
           <w:ilvl w:val="0"/>
-          <w:numId w:val="1002"/>
+          <w:numId w:val="1003"/>
         </w:numPr>
       </w:pPr>
       <w:r>
@@ -19494,7 +21412,7 @@
         <w:pStyle w:val="Compact"/>
         <w:numPr>
           <w:ilvl w:val="0"/>
-          <w:numId w:val="1002"/>
+          <w:numId w:val="1003"/>
         </w:numPr>
       </w:pPr>
       <w:r>
@@ -19542,7 +21460,7 @@
         <w:pStyle w:val="Compact"/>
         <w:numPr>
           <w:ilvl w:val="0"/>
-          <w:numId w:val="1002"/>
+          <w:numId w:val="1003"/>
         </w:numPr>
       </w:pPr>
       <w:r>
@@ -19581,8 +21499,113 @@
         <w:t xml:space="preserve">(ed. C. A. Goldman), Proceedings of the 10th Workshop/Conference of the Association for Biology Laboratory Education (ABLE), Vol. 10, pp. 1–16 (1989). https://www.ableweb.org/biologylabs/wp-content/uploads/volumes/vol-10/1-williams.pdf</w:t>
       </w:r>
     </w:p>
-    <w:bookmarkEnd w:id="50"/>
-    <w:bookmarkEnd w:id="51"/>
+    <w:p>
+      <w:pPr>
+        <w:pStyle w:val="Compact"/>
+        <w:numPr>
+          <w:ilvl w:val="0"/>
+          <w:numId w:val="1003"/>
+        </w:numPr>
+      </w:pPr>
+      <w:r>
+        <w:t xml:space="preserve">Whittemore, R. &amp; Knafl, K. The integrative review: updated methodology.</w:t>
+      </w:r>
+      <w:r>
+        <w:t xml:space="preserve"> </w:t>
+      </w:r>
+      <w:r>
+        <w:rPr>
+          <w:i/>
+          <w:iCs/>
+        </w:rPr>
+        <w:t xml:space="preserve">J. Adv. Nurs.</w:t>
+      </w:r>
+      <w:r>
+        <w:t xml:space="preserve"> </w:t>
+      </w:r>
+      <w:r>
+        <w:rPr>
+          <w:b/>
+          <w:bCs/>
+        </w:rPr>
+        <w:t xml:space="preserve">52</w:t>
+      </w:r>
+      <w:r>
+        <w:t xml:space="preserve">, 546–553 (2005). https://doi.org/10.1111/j.1365-2648.2005.03621.x</w:t>
+      </w:r>
+    </w:p>
+    <w:p>
+      <w:pPr>
+        <w:pStyle w:val="Compact"/>
+        <w:numPr>
+          <w:ilvl w:val="0"/>
+          <w:numId w:val="1003"/>
+        </w:numPr>
+      </w:pPr>
+      <w:r>
+        <w:t xml:space="preserve">Baethge, C., Goldbeck-Wood, S. &amp; Mertens, S. SANRA—a scale for the quality assessment of narrative review articles.</w:t>
+      </w:r>
+      <w:r>
+        <w:t xml:space="preserve"> </w:t>
+      </w:r>
+      <w:r>
+        <w:rPr>
+          <w:i/>
+          <w:iCs/>
+        </w:rPr>
+        <w:t xml:space="preserve">Res. Integr. Peer Rev.</w:t>
+      </w:r>
+      <w:r>
+        <w:t xml:space="preserve"> </w:t>
+      </w:r>
+      <w:r>
+        <w:rPr>
+          <w:b/>
+          <w:bCs/>
+        </w:rPr>
+        <w:t xml:space="preserve">4</w:t>
+      </w:r>
+      <w:r>
+        <w:t xml:space="preserve">, 5 (2019). https://doi.org/10.1186/s41073-019-0064-8</w:t>
+      </w:r>
+    </w:p>
+    <w:p>
+      <w:pPr>
+        <w:pStyle w:val="Compact"/>
+        <w:numPr>
+          <w:ilvl w:val="0"/>
+          <w:numId w:val="1003"/>
+        </w:numPr>
+      </w:pPr>
+      <w:r>
+        <w:t xml:space="preserve">Blank, M. L. et al. From pantry to physiology: A narrative review linking food insecurity to biological dysfunction.</w:t>
+      </w:r>
+      <w:r>
+        <w:t xml:space="preserve"> </w:t>
+      </w:r>
+      <w:r>
+        <w:rPr>
+          <w:i/>
+          <w:iCs/>
+        </w:rPr>
+        <w:t xml:space="preserve">Dialogues Health</w:t>
+      </w:r>
+      <w:r>
+        <w:t xml:space="preserve"> </w:t>
+      </w:r>
+      <w:r>
+        <w:rPr>
+          <w:b/>
+          <w:bCs/>
+        </w:rPr>
+        <w:t xml:space="preserve">8</w:t>
+      </w:r>
+      <w:r>
+        <w:t xml:space="preserve">, 100308 (2026). https://doi.org/10.1016/j.dialog.2026.100308</w:t>
+      </w:r>
+    </w:p>
+    <w:bookmarkEnd w:id="61"/>
+    <w:bookmarkEnd w:id="62"/>
     <w:sectPr>
       <w:footnotePr>
         <w:numRestart w:val="eachSect"/>
@@ -19888,6 +21911,9 @@
     <w:abstractNumId w:val="991"/>
   </w:num>
   <w:num w:numId="1002">
+    <w:abstractNumId w:val="991"/>
+  </w:num>
+  <w:num w:numId="1003">
     <w:abstractNumId w:val="99411"/>
     <w:lvlOverride w:ilvl="0">
       <w:startOverride w:val="1"/>

</xml_diff>

<commit_message>
fix(authors): remove Sofia Leiva Aldana from author list, citations, deck, and metadata
</commit_message>
<xml_diff>
--- a/Near_Null_Magnetic_Fields_Lunar_Plant_Biology_LSSR_Review.docx
+++ b/Near_Null_Magnetic_Fields_Lunar_Plant_Biology_LSSR_Review.docx
@@ -176,27 +176,6 @@
           <w:bCs/>
         </w:rPr>
         <w:t xml:space="preserve">, Manisha Dagar</w:t>
-      </w:r>
-      <m:oMath>
-        <m:sSup>
-          <m:e>
-            <m:r>
-              <m:t>​</m:t>
-            </m:r>
-          </m:e>
-          <m:sup>
-            <m:r>
-              <m:t>1</m:t>
-            </m:r>
-          </m:sup>
-        </m:sSup>
-      </m:oMath>
-      <w:r>
-        <w:rPr>
-          <w:b/>
-          <w:bCs/>
-        </w:rPr>
-        <w:t xml:space="preserve">, Sofia Leiva Aldana</w:t>
       </w:r>
       <m:oMath>
         <m:sSup>
@@ -18169,7 +18148,10 @@
         <w:t xml:space="preserve">A.S.</w:t>
       </w:r>
       <w:r>
-        <w:t xml:space="preserve">,</w:t>
+        <w:t xml:space="preserve"> </w:t>
+      </w:r>
+      <w:r>
+        <w:t xml:space="preserve">and</w:t>
       </w:r>
       <w:r>
         <w:t xml:space="preserve"> </w:t>
@@ -18180,19 +18162,6 @@
           <w:bCs/>
         </w:rPr>
         <w:t xml:space="preserve">M.D.</w:t>
-      </w:r>
-      <w:r>
-        <w:t xml:space="preserve">, and</w:t>
-      </w:r>
-      <w:r>
-        <w:t xml:space="preserve"> </w:t>
-      </w:r>
-      <w:r>
-        <w:rPr>
-          <w:b/>
-          <w:bCs/>
-        </w:rPr>
-        <w:t xml:space="preserve">S.L.A.</w:t>
       </w:r>
       <w:r>
         <w:t xml:space="preserve"> </w:t>

</xml_diff>

<commit_message>
fix(fig2): widen container boxes and deconflict text typography in Figure 2 framework and PRISMA flow
</commit_message>
<xml_diff>
--- a/Near_Null_Magnetic_Fields_Lunar_Plant_Biology_LSSR_Review.docx
+++ b/Near_Null_Magnetic_Fields_Lunar_Plant_Biology_LSSR_Review.docx
@@ -6703,7 +6703,7 @@
       <w:r>
         <w:drawing>
           <wp:inline>
-            <wp:extent cx="5334000" cy="4135134"/>
+            <wp:extent cx="5334000" cy="3959901"/>
             <wp:effectExtent b="0" l="0" r="0" t="0"/>
             <wp:docPr descr="Figure 2" title="" id="23" name="Picture"/>
             <a:graphic>
@@ -6724,7 +6724,7 @@
                   <pic:spPr bwMode="auto">
                     <a:xfrm>
                       <a:off x="0" y="0"/>
-                      <a:ext cx="5334000" cy="4135134"/>
+                      <a:ext cx="5334000" cy="3959901"/>
                     </a:xfrm>
                     <a:prstGeom prst="rect">
                       <a:avLst/>

</xml_diff>

<commit_message>
refactor(abai): replace all Artemis III mentions with Artemis missions across repository and enforce in QC blocklist
</commit_message>
<xml_diff>
--- a/Near_Null_Magnetic_Fields_Lunar_Plant_Biology_LSSR_Review.docx
+++ b/Near_Null_Magnetic_Fields_Lunar_Plant_Biology_LSSR_Review.docx
@@ -1503,7 +1503,7 @@
       <w:r>
         <w:drawing>
           <wp:inline>
-            <wp:extent cx="5334000" cy="4660776"/>
+            <wp:extent cx="5334000" cy="4648276"/>
             <wp:effectExtent b="0" l="0" r="0" t="0"/>
             <wp:docPr descr="Figure 1" title="" id="12" name="Picture"/>
             <a:graphic>
@@ -1524,7 +1524,7 @@
                   <pic:spPr bwMode="auto">
                     <a:xfrm>
                       <a:off x="0" y="0"/>
-                      <a:ext cx="5334000" cy="4660776"/>
+                      <a:ext cx="5334000" cy="4648276"/>
                     </a:xfrm>
                     <a:prstGeom prst="rect">
                       <a:avLst/>
@@ -2257,7 +2257,7 @@
         <w:t xml:space="preserve"> </w:t>
       </w:r>
       <w:r>
-        <w:t xml:space="preserve">at 30 km altitude derived from South Polar and equatorial orbital mapping models [16–18]. Candidate regions reflect published selections from NASA Artemis planning announcements (2022, 2024) and the Artemis III Science Definition Team Report (NASA SP-20205009602).</w:t>
+        <w:t xml:space="preserve">at 30 km altitude derived from South Polar and equatorial orbital mapping models [16–18]. Candidate regions reflect published selections from NASA Artemis planning announcements (2022, 2024) and the Artemis Science Definition Team Report (NASA SP-20205009602).</w:t>
       </w:r>
     </w:p>
     <w:tbl>
@@ -6703,7 +6703,7 @@
       <w:r>
         <w:drawing>
           <wp:inline>
-            <wp:extent cx="5334000" cy="3959901"/>
+            <wp:extent cx="5334000" cy="4009868"/>
             <wp:effectExtent b="0" l="0" r="0" t="0"/>
             <wp:docPr descr="Figure 2" title="" id="23" name="Picture"/>
             <a:graphic>
@@ -6724,7 +6724,7 @@
                   <pic:spPr bwMode="auto">
                     <a:xfrm>
                       <a:off x="0" y="0"/>
-                      <a:ext cx="5334000" cy="3959901"/>
+                      <a:ext cx="5334000" cy="4009868"/>
                     </a:xfrm>
                     <a:prstGeom prst="rect">
                       <a:avLst/>
@@ -6865,7 +6865,7 @@
       <w:r>
         <w:drawing>
           <wp:inline>
-            <wp:extent cx="5334000" cy="4443106"/>
+            <wp:extent cx="5334000" cy="4434993"/>
             <wp:effectExtent b="0" l="0" r="0" t="0"/>
             <wp:docPr descr="Figure 3" title="" id="28" name="Picture"/>
             <a:graphic>
@@ -6886,7 +6886,7 @@
                   <pic:spPr bwMode="auto">
                     <a:xfrm>
                       <a:off x="0" y="0"/>
-                      <a:ext cx="5334000" cy="4443106"/>
+                      <a:ext cx="5334000" cy="4434993"/>
                     </a:xfrm>
                     <a:prstGeom prst="rect">
                       <a:avLst/>
@@ -8353,7 +8353,7 @@
       <w:r>
         <w:drawing>
           <wp:inline>
-            <wp:extent cx="5334000" cy="4485820"/>
+            <wp:extent cx="5334000" cy="4530201"/>
             <wp:effectExtent b="0" l="0" r="0" t="0"/>
             <wp:docPr descr="Figure 4" title="" id="35" name="Picture"/>
             <a:graphic>
@@ -8374,7 +8374,7 @@
                   <pic:spPr bwMode="auto">
                     <a:xfrm>
                       <a:off x="0" y="0"/>
-                      <a:ext cx="5334000" cy="4485820"/>
+                      <a:ext cx="5334000" cy="4530201"/>
                     </a:xfrm>
                     <a:prstGeom prst="rect">
                       <a:avLst/>
@@ -10666,7 +10666,7 @@
       <w:r>
         <w:drawing>
           <wp:inline>
-            <wp:extent cx="5334000" cy="4331025"/>
+            <wp:extent cx="5334000" cy="4362466"/>
             <wp:effectExtent b="0" l="0" r="0" t="0"/>
             <wp:docPr descr="Figure 5" title="" id="42" name="Picture"/>
             <a:graphic>
@@ -10687,7 +10687,7 @@
                   <pic:spPr bwMode="auto">
                     <a:xfrm>
                       <a:off x="0" y="0"/>
-                      <a:ext cx="5334000" cy="4331025"/>
+                      <a:ext cx="5334000" cy="4362466"/>
                     </a:xfrm>
                     <a:prstGeom prst="rect">
                       <a:avLst/>
@@ -13507,7 +13507,7 @@
       <w:r>
         <w:drawing>
           <wp:inline>
-            <wp:extent cx="5334000" cy="4446945"/>
+            <wp:extent cx="5334000" cy="4450280"/>
             <wp:effectExtent b="0" l="0" r="0" t="0"/>
             <wp:docPr descr="Figure 6" title="" id="49" name="Picture"/>
             <a:graphic>
@@ -13528,7 +13528,7 @@
                   <pic:spPr bwMode="auto">
                     <a:xfrm>
                       <a:off x="0" y="0"/>
-                      <a:ext cx="5334000" cy="4446945"/>
+                      <a:ext cx="5334000" cy="4450280"/>
                     </a:xfrm>
                     <a:prstGeom prst="rect">
                       <a:avLst/>
@@ -18282,7 +18282,7 @@
         <w:pStyle w:val="FirstParagraph"/>
       </w:pPr>
       <w:r>
-        <w:t xml:space="preserve">D.M.P. is a Co-Investigator on the NASA Artemis III LEAF payload; C.C. is affiliated with Space Lab Technologies, LLC. These roles are disclosed with no commercial or financial conflicts of interest. The remaining authors declare no competing interests.</w:t>
+        <w:t xml:space="preserve">D.M.P. is a Co-Investigator on the NASA Artemis missions’ LEAF payload; C.C. is affiliated with Space Lab Technologies, LLC. These roles are disclosed with no commercial or financial conflicts of interest. The remaining authors declare no competing interests.</w:t>
       </w:r>
     </w:p>
     <w:bookmarkEnd w:id="59"/>
@@ -18521,7 +18521,7 @@
         </w:numPr>
       </w:pPr>
       <w:r>
-        <w:t xml:space="preserve">Space Lab Tech. Lunar Effects on Agricultural Flora (LEAF) selected for Artemis III surface deployment.</w:t>
+        <w:t xml:space="preserve">Space Lab Tech. Lunar Effects on Agricultural Flora (LEAF) selected for Artemis missions surface deployment.</w:t>
       </w:r>
       <w:r>
         <w:t xml:space="preserve"> </w:t>

</xml_diff>